<commit_message>
Actualizar formato normativo de informes
</commit_message>
<xml_diff>
--- a/juliano/reportes/Informe_Pasantia_IUTECP_BORRADOR1.docx
+++ b/juliano/reportes/Informe_Pasantia_IUTECP_BORRADOR1.docx
@@ -54,7 +54,7 @@
     </w:p>
     <w:p>
       <w:pPr>
-        <w:spacing w:before="978" w:after="1334"/>
+        <w:spacing w:before="947" w:after="1242"/>
         <w:jc w:val="center"/>
       </w:pPr>
       <w:r>
@@ -103,12 +103,12 @@
           <w:b/>
           <w:sz w:val="24"/>
         </w:rPr>
-        <w:t>DESARROLLO DE UN PROTOTIPO DE SISTEMA PARA EL CONTROL, TRAZABILIDAD Y REPORTE DOCUMENTAL EN LA PRESIDENCIA DE VENANGOCUPET, S.A.</w:t>
+        <w:t>DESARROLLO DE UN PROTOTIPO DE SISTEMA PARA EL CONTROL, TRAZABILIDAD Y REPORTE DOCUMENTAL EN LA PRESIDENCIA DE LA EMPRESA MIXTA PETROLERA VENANGOCUPET, S.A.</w:t>
       </w:r>
     </w:p>
     <w:p>
       <w:pPr>
-        <w:spacing w:line="276" w:lineRule="auto" w:before="3260" w:after="0"/>
+        <w:spacing w:line="276" w:lineRule="auto" w:before="3158" w:after="0"/>
         <w:jc w:val="right"/>
       </w:pPr>
       <w:r>
@@ -140,7 +140,7 @@
     </w:p>
     <w:p>
       <w:pPr>
-        <w:spacing w:line="276" w:lineRule="auto" w:before="1630" w:after="0"/>
+        <w:spacing w:line="276" w:lineRule="auto" w:before="1579" w:after="0"/>
         <w:jc w:val="center"/>
       </w:pPr>
       <w:r>
@@ -154,15 +154,17 @@
     <w:p>
       <w:pPr>
         <w:sectPr>
-          <w:footerReference w:type="default" r:id="rId14"/>
+          <w:footerReference w:type="default" r:id="rId23"/>
           <w:pgSz w:w="12240" w:h="15840"/>
           <w:pgMar w:top="1701" w:right="1701" w:bottom="1701" w:left="2268" w:header="720" w:footer="720" w:gutter="0"/>
           <w:cols w:space="720"/>
           <w:docGrid w:linePitch="360"/>
+          <w:pgNumType w:fmt="lowerRoman" w:start="1"/>
         </w:sectPr>
       </w:pPr>
     </w:p>
     <w:p>
+      <w:bookmarkStart w:id="0" w:name="bm_contraportada"/>
       <w:pPr>
         <w:spacing w:line="240" w:lineRule="auto" w:before="0" w:after="0"/>
         <w:jc w:val="center"/>
@@ -211,6 +213,7 @@
         </w:rPr>
         <w:t>EL TIGRE, ESTADO ANZOÁTEGUI</w:t>
       </w:r>
+      <w:bookmarkEnd w:id="0"/>
     </w:p>
     <w:p>
       <w:pPr>
@@ -223,7 +226,7 @@
           <w:b/>
           <w:sz w:val="24"/>
         </w:rPr>
-        <w:t>DESARROLLO DE UN PROTOTIPO DE SISTEMA PARA EL CONTROL, TRAZABILIDAD Y REPORTE DOCUMENTAL EN LA PRESIDENCIA DE VENANGOCUPET, S.A.</w:t>
+        <w:t>DESARROLLO DE UN PROTOTIPO DE SISTEMA PARA EL CONTROL, TRAZABILIDAD Y REPORTE DOCUMENTAL EN LA PRESIDENCIA DE LA EMPRESA MIXTA PETROLERA VENANGOCUPET, S.A.</w:t>
       </w:r>
     </w:p>
     <w:p>
@@ -393,12 +396,12 @@
     <w:p>
       <w:pPr>
         <w:sectPr>
-          <w:footerReference w:type="default" r:id="rId15"/>
+          <w:footerReference w:type="default" r:id="rId24"/>
           <w:pgSz w:w="12240" w:h="15840"/>
           <w:pgMar w:top="1701" w:right="1701" w:bottom="1701" w:left="2268" w:header="720" w:footer="720" w:gutter="0"/>
           <w:cols w:space="720"/>
-          <w:titlePg/>
           <w:docGrid w:linePitch="360"/>
+          <w:pgNumType w:fmt="lowerRoman"/>
         </w:sectPr>
       </w:pPr>
     </w:p>
@@ -474,7 +477,7 @@
     </w:p>
     <w:p/>
     <w:p>
-      <w:bookmarkStart w:id="bm_aprob_ind" w:name="bm_aprob_ind"/>
+      <w:bookmarkStart w:id="1" w:name="bm_aprob_ind"/>
       <w:pPr>
         <w:spacing w:before="480" w:after="480"/>
         <w:jc w:val="center"/>
@@ -487,7 +490,7 @@
         </w:rPr>
         <w:t>APROBACIÓN DEL TUTOR INDUSTRIAL</w:t>
       </w:r>
-      <w:bookmarkEnd w:id="bm_aprob_ind"/>
+      <w:bookmarkEnd w:id="1"/>
     </w:p>
     <w:p>
       <w:pPr>
@@ -500,7 +503,7 @@
           <w:rFonts w:ascii="Times New Roman" w:hAnsi="Times New Roman"/>
           <w:sz w:val="24"/>
         </w:rPr>
-        <w:t>En mi carácter de tutor industrial del informe de pasantías presentado por: Cardona, Juliano, de Cédula de Identidad V-32.281.199; para optar al grado de Técnico Superior Universitario en la especialidad de: Informática, cuyo título es; “DESARROLLO DE UN PROTOTIPO DE SISTEMA PARA EL CONTROL, TRAZABILIDAD Y REPORTE DOCUMENTAL EN LA PRESIDENCIA DE VENANGOCUPET, S.A.”, manifiesto que cumple con los requisitos exigidos por el Instituto Universitario de Tecnología “Elías Calixto Pompa” (IUTECP); y que, por lo tanto, considero que reúne los méritos suficientes para ser evaluado por el jurado que se decida designar a tal fin.</w:t>
+        <w:t>En mi carácter de tutor industrial del informe de pasantías presentado por: Cardona, Juliano, de Cédula de Identidad V-32.281.199; para optar al grado de Técnico Superior Universitario en la especialidad de: Informática, cuyo título es; “DESARROLLO DE UN PROTOTIPO DE SISTEMA PARA EL CONTROL, TRAZABILIDAD Y REPORTE DOCUMENTAL EN LA PRESIDENCIA DE LA EMPRESA MIXTA PETROLERA VENANGOCUPET, S.A.”, manifiesto que cumple con los requisitos exigidos por el Instituto Universitario de Tecnología “Elías Calixto Pompa” (IUTECP); y que, por lo tanto, considero que reúne los méritos suficientes para ser evaluado por el jurado que se decida designar a tal fin.</w:t>
       </w:r>
     </w:p>
     <w:p/>
@@ -562,12 +565,12 @@
     <w:p>
       <w:pPr>
         <w:sectPr>
-          <w:footerReference w:type="default" r:id="rId16"/>
+          <w:footerReference w:type="default" r:id="rId25"/>
           <w:pgSz w:w="12240" w:h="15840"/>
           <w:pgMar w:top="1701" w:right="1701" w:bottom="1701" w:left="2268" w:header="720" w:footer="720" w:gutter="0"/>
           <w:cols w:space="720"/>
-          <w:titlePg/>
           <w:docGrid w:linePitch="360"/>
+          <w:pgNumType w:fmt="lowerRoman"/>
         </w:sectPr>
       </w:pPr>
     </w:p>
@@ -643,7 +646,7 @@
     </w:p>
     <w:p/>
     <w:p>
-      <w:bookmarkStart w:id="bm_aprob_acad" w:name="bm_aprob_acad"/>
+      <w:bookmarkStart w:id="2" w:name="bm_aprob_acad"/>
       <w:pPr>
         <w:spacing w:before="480" w:after="480"/>
         <w:jc w:val="center"/>
@@ -656,7 +659,7 @@
         </w:rPr>
         <w:t>APROBACIÓN DEL TUTOR ACADÉMICO</w:t>
       </w:r>
-      <w:bookmarkEnd w:id="bm_aprob_acad"/>
+      <w:bookmarkEnd w:id="2"/>
     </w:p>
     <w:p>
       <w:pPr>
@@ -669,7 +672,7 @@
           <w:rFonts w:ascii="Times New Roman" w:hAnsi="Times New Roman"/>
           <w:sz w:val="24"/>
         </w:rPr>
-        <w:t>En mi carácter de tutor académico del informe de pasantías presentado por: Cardona, Juliano, de Cédula de Identidad V-32.281.199; para optar al grado de Técnico Superior Universitario en la especialidad de: Informática, cuyo título es; “DESARROLLO DE UN PROTOTIPO DE SISTEMA PARA EL CONTROL, TRAZABILIDAD Y REPORTE DOCUMENTAL EN LA PRESIDENCIA DE VENANGOCUPET, S.A.”, manifiesto que cumple con los requisitos exigidos por el Instituto Universitario de Tecnología “Elías Calixto Pompa” (IUTECP); y que, por lo tanto, considero que reúne los méritos suficientes para ser evaluado por el jurado que se decida designar a tal fin.</w:t>
+        <w:t>En mi carácter de tutor académico del informe de pasantías presentado por: Cardona, Juliano, de Cédula de Identidad V-32.281.199; para optar al grado de Técnico Superior Universitario en la especialidad de: Informática, cuyo título es; “DESARROLLO DE UN PROTOTIPO DE SISTEMA PARA EL CONTROL, TRAZABILIDAD Y REPORTE DOCUMENTAL EN LA PRESIDENCIA DE LA EMPRESA MIXTA PETROLERA VENANGOCUPET, S.A.”, manifiesto que cumple con los requisitos exigidos por el Instituto Universitario de Tecnología “Elías Calixto Pompa” (IUTECP); y que, por lo tanto, considero que reúne los méritos suficientes para ser evaluado por el jurado que se decida designar a tal fin.</w:t>
       </w:r>
     </w:p>
     <w:p/>
@@ -731,18 +734,21 @@
     <w:p>
       <w:pPr>
         <w:sectPr>
-          <w:footerReference w:type="default" r:id="rId17"/>
+          <w:footerReference w:type="default" r:id="rId26"/>
           <w:pgSz w:w="12240" w:h="15840"/>
           <w:pgMar w:top="1701" w:right="1701" w:bottom="1701" w:left="2268" w:header="720" w:footer="720" w:gutter="0"/>
           <w:cols w:space="720"/>
-          <w:titlePg/>
           <w:docGrid w:linePitch="360"/>
+          <w:pgNumType w:fmt="lowerRoman"/>
         </w:sectPr>
       </w:pPr>
     </w:p>
     <w:p>
-      <w:bookmarkStart w:id="bm_agradecimientos" w:name="bm_agradecimientos"/>
-      <w:pPr>
+      <w:bookmarkStart w:id="3" w:name="bm_agradecimientos"/>
+      <w:pPr>
+        <w:pStyle w:val="IUTECPPreliminar"/>
+        <w:keepNext/>
+        <w:keepLines/>
         <w:spacing w:before="1140" w:after="480"/>
         <w:jc w:val="center"/>
       </w:pPr>
@@ -754,19 +760,7 @@
         </w:rPr>
         <w:t>AGRADECIMIENTOS</w:t>
       </w:r>
-      <w:bookmarkEnd w:id="bm_agradecimientos"/>
-    </w:p>
-    <w:p>
-      <w:pPr>
-        <w:sectPr>
-          <w:footerReference w:type="default" r:id="rId18"/>
-          <w:pgSz w:w="12240" w:h="15840"/>
-          <w:pgMar w:top="1701" w:right="1701" w:bottom="1701" w:left="2268" w:header="720" w:footer="720" w:gutter="0"/>
-          <w:cols w:space="720"/>
-          <w:titlePg/>
-          <w:docGrid w:linePitch="360"/>
-        </w:sectPr>
-      </w:pPr>
+      <w:bookmarkEnd w:id="3"/>
     </w:p>
     <w:p>
       <w:pPr>
@@ -786,19 +780,21 @@
     <w:p>
       <w:pPr>
         <w:sectPr>
-          <w:footerReference w:type="default" r:id="rId19"/>
-          <w:type w:val="continuous"/>
+          <w:footerReference w:type="default" r:id="rId27"/>
           <w:pgSz w:w="12240" w:h="15840"/>
           <w:pgMar w:top="1701" w:right="1701" w:bottom="1701" w:left="2268" w:header="720" w:footer="720" w:gutter="0"/>
           <w:cols w:space="720"/>
-          <w:titlePg/>
           <w:docGrid w:linePitch="360"/>
+          <w:pgNumType w:fmt="lowerRoman"/>
         </w:sectPr>
       </w:pPr>
     </w:p>
     <w:p>
-      <w:bookmarkStart w:id="bm_dedicatoria" w:name="bm_dedicatoria"/>
-      <w:pPr>
+      <w:bookmarkStart w:id="4" w:name="bm_dedicatoria"/>
+      <w:pPr>
+        <w:pStyle w:val="IUTECPPreliminar"/>
+        <w:keepNext/>
+        <w:keepLines/>
         <w:spacing w:before="1140" w:after="480"/>
         <w:jc w:val="center"/>
       </w:pPr>
@@ -810,19 +806,7 @@
         </w:rPr>
         <w:t>DEDICATORIA</w:t>
       </w:r>
-      <w:bookmarkEnd w:id="bm_dedicatoria"/>
-    </w:p>
-    <w:p>
-      <w:pPr>
-        <w:sectPr>
-          <w:footerReference w:type="default" r:id="rId20"/>
-          <w:pgSz w:w="12240" w:h="15840"/>
-          <w:pgMar w:top="1701" w:right="1701" w:bottom="1701" w:left="2268" w:header="720" w:footer="720" w:gutter="0"/>
-          <w:cols w:space="720"/>
-          <w:titlePg/>
-          <w:docGrid w:linePitch="360"/>
-        </w:sectPr>
-      </w:pPr>
+      <w:bookmarkEnd w:id="4"/>
     </w:p>
     <w:p>
       <w:pPr>
@@ -842,18 +826,21 @@
     <w:p>
       <w:pPr>
         <w:sectPr>
-          <w:footerReference w:type="default" r:id="rId21"/>
-          <w:type w:val="continuous"/>
+          <w:footerReference w:type="default" r:id="rId28"/>
           <w:pgSz w:w="12240" w:h="15840"/>
           <w:pgMar w:top="1701" w:right="1701" w:bottom="1701" w:left="2268" w:header="720" w:footer="720" w:gutter="0"/>
           <w:cols w:space="720"/>
-          <w:titlePg/>
           <w:docGrid w:linePitch="360"/>
+          <w:pgNumType w:fmt="lowerRoman"/>
         </w:sectPr>
       </w:pPr>
     </w:p>
     <w:p>
-      <w:pPr>
+      <w:bookmarkStart w:id="5" w:name="bm_indice"/>
+      <w:pPr>
+        <w:pStyle w:val="IUTECPPreliminar"/>
+        <w:keepNext/>
+        <w:keepLines/>
         <w:spacing w:before="1140" w:after="480"/>
         <w:jc w:val="center"/>
       </w:pPr>
@@ -865,18 +852,7 @@
         </w:rPr>
         <w:t>ÍNDICE DE CONTENIDO</w:t>
       </w:r>
-    </w:p>
-    <w:p>
-      <w:pPr>
-        <w:sectPr>
-          <w:footerReference w:type="default" r:id="rId22"/>
-          <w:pgSz w:w="12240" w:h="15840"/>
-          <w:pgMar w:top="1701" w:right="1701" w:bottom="1701" w:left="2268" w:header="720" w:footer="720" w:gutter="0"/>
-          <w:cols w:space="720"/>
-          <w:titlePg/>
-          <w:docGrid w:linePitch="360"/>
-        </w:sectPr>
-      </w:pPr>
+      <w:bookmarkEnd w:id="5"/>
     </w:p>
     <w:p>
       <w:pPr>
@@ -894,6 +870,88 @@
     </w:p>
     <w:p>
       <w:pPr>
+        <w:keepLines/>
+        <w:tabs>
+          <w:tab w:pos="8271" w:val="right" w:leader="dot"/>
+        </w:tabs>
+        <w:spacing w:line="360" w:lineRule="auto" w:before="0" w:after="80"/>
+        <w:ind w:left="0"/>
+      </w:pPr>
+      <w:r>
+        <w:rPr>
+          <w:rFonts w:ascii="Times New Roman" w:hAnsi="Times New Roman"/>
+          <w:b w:val="0"/>
+          <w:sz w:val="24"/>
+        </w:rPr>
+        <w:t>CONTRAPORTADA</w:t>
+        <w:tab/>
+      </w:r>
+      <w:r>
+        <w:rPr>
+          <w:rFonts w:ascii="Times New Roman" w:hAnsi="Times New Roman"/>
+          <w:b w:val="0"/>
+          <w:sz w:val="24"/>
+        </w:rPr>
+        <w:t>ii</w:t>
+      </w:r>
+    </w:p>
+    <w:p>
+      <w:pPr>
+        <w:keepLines/>
+        <w:tabs>
+          <w:tab w:pos="8271" w:val="right" w:leader="dot"/>
+        </w:tabs>
+        <w:spacing w:line="360" w:lineRule="auto" w:before="0" w:after="80"/>
+        <w:ind w:left="0"/>
+      </w:pPr>
+      <w:r>
+        <w:rPr>
+          <w:rFonts w:ascii="Times New Roman" w:hAnsi="Times New Roman"/>
+          <w:b w:val="0"/>
+          <w:sz w:val="24"/>
+        </w:rPr>
+        <w:t>APROBACIÓN DEL TUTOR INDUSTRIAL</w:t>
+        <w:tab/>
+      </w:r>
+      <w:r>
+        <w:rPr>
+          <w:rFonts w:ascii="Times New Roman" w:hAnsi="Times New Roman"/>
+          <w:b w:val="0"/>
+          <w:sz w:val="24"/>
+        </w:rPr>
+        <w:t>iii</w:t>
+      </w:r>
+    </w:p>
+    <w:p>
+      <w:pPr>
+        <w:keepLines/>
+        <w:tabs>
+          <w:tab w:pos="8271" w:val="right" w:leader="dot"/>
+        </w:tabs>
+        <w:spacing w:line="360" w:lineRule="auto" w:before="0" w:after="80"/>
+        <w:ind w:left="0"/>
+      </w:pPr>
+      <w:r>
+        <w:rPr>
+          <w:rFonts w:ascii="Times New Roman" w:hAnsi="Times New Roman"/>
+          <w:b w:val="0"/>
+          <w:sz w:val="24"/>
+        </w:rPr>
+        <w:t>APROBACIÓN DEL TUTOR ACADÉMICO</w:t>
+        <w:tab/>
+      </w:r>
+      <w:r>
+        <w:rPr>
+          <w:rFonts w:ascii="Times New Roman" w:hAnsi="Times New Roman"/>
+          <w:b w:val="0"/>
+          <w:sz w:val="24"/>
+        </w:rPr>
+        <w:t>iv</w:t>
+      </w:r>
+    </w:p>
+    <w:p>
+      <w:pPr>
+        <w:keepLines/>
         <w:tabs>
           <w:tab w:pos="8271" w:val="right" w:leader="dot"/>
         </w:tabs>
@@ -915,15 +973,12 @@
           <w:b w:val="0"/>
           <w:sz w:val="24"/>
         </w:rPr>
-        <w:fldChar w:fldCharType="begin"/>
-        <w:instrText xml:space="preserve"> PAGEREF bm_agradecimientos \h </w:instrText>
-        <w:fldChar w:fldCharType="separate"/>
-        <w:t>?</w:t>
-        <w:fldChar w:fldCharType="end"/>
+        <w:t>v</w:t>
       </w:r>
     </w:p>
     <w:p>
       <w:pPr>
+        <w:keepLines/>
         <w:tabs>
           <w:tab w:pos="8271" w:val="right" w:leader="dot"/>
         </w:tabs>
@@ -945,75 +1000,12 @@
           <w:b w:val="0"/>
           <w:sz w:val="24"/>
         </w:rPr>
-        <w:fldChar w:fldCharType="begin"/>
-        <w:instrText xml:space="preserve"> PAGEREF bm_dedicatoria \h </w:instrText>
-        <w:fldChar w:fldCharType="separate"/>
-        <w:t>?</w:t>
-        <w:fldChar w:fldCharType="end"/>
+        <w:t>vi</w:t>
       </w:r>
     </w:p>
     <w:p>
       <w:pPr>
-        <w:tabs>
-          <w:tab w:pos="8271" w:val="right" w:leader="dot"/>
-        </w:tabs>
-        <w:spacing w:line="360" w:lineRule="auto" w:before="0" w:after="80"/>
-        <w:ind w:left="0"/>
-      </w:pPr>
-      <w:r>
-        <w:rPr>
-          <w:rFonts w:ascii="Times New Roman" w:hAnsi="Times New Roman"/>
-          <w:b w:val="0"/>
-          <w:sz w:val="24"/>
-        </w:rPr>
-        <w:t>APROBACIÓN DEL TUTOR INDUSTRIAL</w:t>
-        <w:tab/>
-      </w:r>
-      <w:r>
-        <w:rPr>
-          <w:rFonts w:ascii="Times New Roman" w:hAnsi="Times New Roman"/>
-          <w:b w:val="0"/>
-          <w:sz w:val="24"/>
-        </w:rPr>
-        <w:fldChar w:fldCharType="begin"/>
-        <w:instrText xml:space="preserve"> PAGEREF bm_aprob_ind \h </w:instrText>
-        <w:fldChar w:fldCharType="separate"/>
-        <w:t>?</w:t>
-        <w:fldChar w:fldCharType="end"/>
-      </w:r>
-    </w:p>
-    <w:p>
-      <w:pPr>
-        <w:tabs>
-          <w:tab w:pos="8271" w:val="right" w:leader="dot"/>
-        </w:tabs>
-        <w:spacing w:line="360" w:lineRule="auto" w:before="0" w:after="80"/>
-        <w:ind w:left="0"/>
-      </w:pPr>
-      <w:r>
-        <w:rPr>
-          <w:rFonts w:ascii="Times New Roman" w:hAnsi="Times New Roman"/>
-          <w:b w:val="0"/>
-          <w:sz w:val="24"/>
-        </w:rPr>
-        <w:t>APROBACIÓN DEL TUTOR ACADÉMICO</w:t>
-        <w:tab/>
-      </w:r>
-      <w:r>
-        <w:rPr>
-          <w:rFonts w:ascii="Times New Roman" w:hAnsi="Times New Roman"/>
-          <w:b w:val="0"/>
-          <w:sz w:val="24"/>
-        </w:rPr>
-        <w:fldChar w:fldCharType="begin"/>
-        <w:instrText xml:space="preserve"> PAGEREF bm_aprob_acad \h </w:instrText>
-        <w:fldChar w:fldCharType="separate"/>
-        <w:t>?</w:t>
-        <w:fldChar w:fldCharType="end"/>
-      </w:r>
-    </w:p>
-    <w:p>
-      <w:pPr>
+        <w:keepLines/>
         <w:tabs>
           <w:tab w:pos="8271" w:val="right" w:leader="dot"/>
         </w:tabs>
@@ -1035,15 +1027,12 @@
           <w:b w:val="0"/>
           <w:sz w:val="24"/>
         </w:rPr>
-        <w:fldChar w:fldCharType="begin"/>
-        <w:instrText xml:space="preserve"> PAGEREF bm_lista_cuadros \h </w:instrText>
-        <w:fldChar w:fldCharType="separate"/>
-        <w:t>?</w:t>
-        <w:fldChar w:fldCharType="end"/>
+        <w:t>viii</w:t>
       </w:r>
     </w:p>
     <w:p>
       <w:pPr>
+        <w:keepLines/>
         <w:tabs>
           <w:tab w:pos="8271" w:val="right" w:leader="dot"/>
         </w:tabs>
@@ -1065,15 +1054,12 @@
           <w:b w:val="0"/>
           <w:sz w:val="24"/>
         </w:rPr>
-        <w:fldChar w:fldCharType="begin"/>
-        <w:instrText xml:space="preserve"> PAGEREF bm_lista_graficos \h </w:instrText>
-        <w:fldChar w:fldCharType="separate"/>
-        <w:t>?</w:t>
-        <w:fldChar w:fldCharType="end"/>
+        <w:t>ix</w:t>
       </w:r>
     </w:p>
     <w:p>
       <w:pPr>
+        <w:keepLines/>
         <w:tabs>
           <w:tab w:pos="8271" w:val="right" w:leader="dot"/>
         </w:tabs>
@@ -1095,15 +1081,12 @@
           <w:b w:val="0"/>
           <w:sz w:val="24"/>
         </w:rPr>
-        <w:fldChar w:fldCharType="begin"/>
-        <w:instrText xml:space="preserve"> PAGEREF bm_lista_anexos \h </w:instrText>
-        <w:fldChar w:fldCharType="separate"/>
-        <w:t>?</w:t>
-        <w:fldChar w:fldCharType="end"/>
+        <w:t>x</w:t>
       </w:r>
     </w:p>
     <w:p>
       <w:pPr>
+        <w:keepLines/>
         <w:tabs>
           <w:tab w:pos="8271" w:val="right" w:leader="dot"/>
         </w:tabs>
@@ -1125,15 +1108,12 @@
           <w:b w:val="0"/>
           <w:sz w:val="24"/>
         </w:rPr>
-        <w:fldChar w:fldCharType="begin"/>
-        <w:instrText xml:space="preserve"> PAGEREF bm_resumen \h </w:instrText>
-        <w:fldChar w:fldCharType="separate"/>
-        <w:t>?</w:t>
-        <w:fldChar w:fldCharType="end"/>
+        <w:t>xi</w:t>
       </w:r>
     </w:p>
     <w:p>
       <w:pPr>
+        <w:keepLines/>
         <w:tabs>
           <w:tab w:pos="8271" w:val="right" w:leader="dot"/>
         </w:tabs>
@@ -1164,6 +1144,8 @@
     </w:p>
     <w:p>
       <w:pPr>
+        <w:keepNext/>
+        <w:keepLines/>
         <w:spacing w:before="240" w:after="120"/>
       </w:pPr>
       <w:r>
@@ -1175,6 +1157,7 @@
     </w:p>
     <w:p>
       <w:pPr>
+        <w:keepLines/>
         <w:tabs>
           <w:tab w:pos="8271" w:val="right" w:leader="dot"/>
         </w:tabs>
@@ -1205,6 +1188,7 @@
     </w:p>
     <w:p>
       <w:pPr>
+        <w:keepLines/>
         <w:tabs>
           <w:tab w:pos="8271" w:val="right" w:leader="dot"/>
         </w:tabs>
@@ -1235,6 +1219,7 @@
     </w:p>
     <w:p>
       <w:pPr>
+        <w:keepLines/>
         <w:tabs>
           <w:tab w:pos="8271" w:val="right" w:leader="dot"/>
         </w:tabs>
@@ -1265,6 +1250,7 @@
     </w:p>
     <w:p>
       <w:pPr>
+        <w:keepLines/>
         <w:tabs>
           <w:tab w:pos="8271" w:val="right" w:leader="dot"/>
         </w:tabs>
@@ -1295,6 +1281,7 @@
     </w:p>
     <w:p>
       <w:pPr>
+        <w:keepLines/>
         <w:tabs>
           <w:tab w:pos="8271" w:val="right" w:leader="dot"/>
         </w:tabs>
@@ -1325,6 +1312,7 @@
     </w:p>
     <w:p>
       <w:pPr>
+        <w:keepLines/>
         <w:tabs>
           <w:tab w:pos="8271" w:val="right" w:leader="dot"/>
         </w:tabs>
@@ -1355,6 +1343,7 @@
     </w:p>
     <w:p>
       <w:pPr>
+        <w:keepLines/>
         <w:tabs>
           <w:tab w:pos="8271" w:val="right" w:leader="dot"/>
         </w:tabs>
@@ -1385,6 +1374,7 @@
     </w:p>
     <w:p>
       <w:pPr>
+        <w:keepLines/>
         <w:tabs>
           <w:tab w:pos="8271" w:val="right" w:leader="dot"/>
         </w:tabs>
@@ -1415,6 +1405,7 @@
     </w:p>
     <w:p>
       <w:pPr>
+        <w:keepLines/>
         <w:tabs>
           <w:tab w:pos="8271" w:val="right" w:leader="dot"/>
         </w:tabs>
@@ -1445,6 +1436,7 @@
     </w:p>
     <w:p>
       <w:pPr>
+        <w:keepLines/>
         <w:tabs>
           <w:tab w:pos="8271" w:val="right" w:leader="dot"/>
         </w:tabs>
@@ -1475,6 +1467,38 @@
     </w:p>
     <w:p>
       <w:pPr>
+        <w:keepLines/>
+        <w:tabs>
+          <w:tab w:pos="8271" w:val="right" w:leader="dot"/>
+        </w:tabs>
+        <w:spacing w:line="360" w:lineRule="auto" w:before="0" w:after="80"/>
+        <w:ind w:left="283"/>
+      </w:pPr>
+      <w:r>
+        <w:rPr>
+          <w:rFonts w:ascii="Times New Roman" w:hAnsi="Times New Roman"/>
+          <w:b w:val="0"/>
+          <w:sz w:val="24"/>
+        </w:rPr>
+        <w:t>Descripción del departamento donde realizó la pasantía</w:t>
+        <w:tab/>
+      </w:r>
+      <w:r>
+        <w:rPr>
+          <w:rFonts w:ascii="Times New Roman" w:hAnsi="Times New Roman"/>
+          <w:b w:val="0"/>
+          <w:sz w:val="24"/>
+        </w:rPr>
+        <w:fldChar w:fldCharType="begin"/>
+        <w:instrText xml:space="preserve"> PAGEREF bm_cap1_departamento \h </w:instrText>
+        <w:fldChar w:fldCharType="separate"/>
+        <w:t>?</w:t>
+        <w:fldChar w:fldCharType="end"/>
+      </w:r>
+    </w:p>
+    <w:p>
+      <w:pPr>
+        <w:keepLines/>
         <w:tabs>
           <w:tab w:pos="8271" w:val="right" w:leader="dot"/>
         </w:tabs>
@@ -1505,6 +1529,7 @@
     </w:p>
     <w:p>
       <w:pPr>
+        <w:keepLines/>
         <w:tabs>
           <w:tab w:pos="8271" w:val="right" w:leader="dot"/>
         </w:tabs>
@@ -1536,19 +1561,21 @@
     <w:p>
       <w:pPr>
         <w:sectPr>
-          <w:footerReference w:type="default" r:id="rId23"/>
-          <w:type w:val="continuous"/>
+          <w:footerReference w:type="default" r:id="rId29"/>
           <w:pgSz w:w="12240" w:h="15840"/>
           <w:pgMar w:top="1701" w:right="1701" w:bottom="1701" w:left="2268" w:header="720" w:footer="720" w:gutter="0"/>
           <w:cols w:space="720"/>
-          <w:titlePg/>
           <w:docGrid w:linePitch="360"/>
+          <w:pgNumType w:fmt="lowerRoman"/>
         </w:sectPr>
       </w:pPr>
     </w:p>
     <w:p>
-      <w:bookmarkStart w:id="bm_lista_cuadros" w:name="bm_lista_cuadros"/>
-      <w:pPr>
+      <w:bookmarkStart w:id="6" w:name="bm_lista_cuadros"/>
+      <w:pPr>
+        <w:pStyle w:val="IUTECPPreliminar"/>
+        <w:keepNext/>
+        <w:keepLines/>
         <w:spacing w:before="1140" w:after="480"/>
         <w:jc w:val="center"/>
       </w:pPr>
@@ -1560,22 +1587,12 @@
         </w:rPr>
         <w:t>LISTA DE CUADROS</w:t>
       </w:r>
-      <w:bookmarkEnd w:id="bm_lista_cuadros"/>
+      <w:bookmarkEnd w:id="6"/>
     </w:p>
     <w:p>
       <w:pPr>
-        <w:sectPr>
-          <w:footerReference w:type="default" r:id="rId24"/>
-          <w:pgSz w:w="12240" w:h="15840"/>
-          <w:pgMar w:top="1701" w:right="1701" w:bottom="1701" w:left="2268" w:header="720" w:footer="720" w:gutter="0"/>
-          <w:cols w:space="720"/>
-          <w:titlePg/>
-          <w:docGrid w:linePitch="360"/>
-        </w:sectPr>
-      </w:pPr>
-    </w:p>
-    <w:p>
-      <w:pPr>
+        <w:keepNext/>
+        <w:keepLines/>
         <w:tabs>
           <w:tab w:pos="8271" w:val="right"/>
         </w:tabs>
@@ -1603,20 +1620,55 @@
     </w:p>
     <w:p>
       <w:pPr>
+        <w:keepLines/>
+        <w:tabs>
+          <w:tab w:pos="1020" w:val="left"/>
+          <w:tab w:pos="8271" w:val="right" w:leader="dot"/>
+        </w:tabs>
+        <w:spacing w:line="360" w:lineRule="auto" w:before="0" w:after="80"/>
+        <w:ind w:left="1020" w:hanging="1020"/>
+      </w:pPr>
+      <w:r>
+        <w:rPr>
+          <w:rFonts w:ascii="Times New Roman" w:hAnsi="Times New Roman"/>
+          <w:sz w:val="24"/>
+        </w:rPr>
+        <w:t>1</w:t>
+        <w:tab/>
+        <w:t>Población de los trabajadores del Departamento de Presidencia</w:t>
+        <w:tab/>
+      </w:r>
+      <w:r>
+        <w:rPr>
+          <w:rFonts w:ascii="Times New Roman" w:hAnsi="Times New Roman"/>
+          <w:b w:val="0"/>
+          <w:sz w:val="24"/>
+        </w:rPr>
+        <w:fldChar w:fldCharType="begin"/>
+        <w:instrText xml:space="preserve"> PAGEREF bm_cuadro1 \h </w:instrText>
+        <w:fldChar w:fldCharType="separate"/>
+        <w:t>?</w:t>
+        <w:fldChar w:fldCharType="end"/>
+      </w:r>
+    </w:p>
+    <w:p>
+      <w:pPr>
         <w:sectPr>
-          <w:footerReference w:type="default" r:id="rId25"/>
-          <w:type w:val="continuous"/>
+          <w:footerReference w:type="default" r:id="rId30"/>
           <w:pgSz w:w="12240" w:h="15840"/>
           <w:pgMar w:top="1701" w:right="1701" w:bottom="1701" w:left="2268" w:header="720" w:footer="720" w:gutter="0"/>
           <w:cols w:space="720"/>
-          <w:titlePg/>
           <w:docGrid w:linePitch="360"/>
+          <w:pgNumType w:fmt="lowerRoman"/>
         </w:sectPr>
       </w:pPr>
     </w:p>
     <w:p>
-      <w:bookmarkStart w:id="bm_lista_graficos" w:name="bm_lista_graficos"/>
-      <w:pPr>
+      <w:bookmarkStart w:id="7" w:name="bm_lista_graficos"/>
+      <w:pPr>
+        <w:pStyle w:val="IUTECPPreliminar"/>
+        <w:keepNext/>
+        <w:keepLines/>
         <w:spacing w:before="1140" w:after="480"/>
         <w:jc w:val="center"/>
       </w:pPr>
@@ -1628,22 +1680,12 @@
         </w:rPr>
         <w:t>LISTA DE GRÁFICOS</w:t>
       </w:r>
-      <w:bookmarkEnd w:id="bm_lista_graficos"/>
+      <w:bookmarkEnd w:id="7"/>
     </w:p>
     <w:p>
       <w:pPr>
-        <w:sectPr>
-          <w:footerReference w:type="default" r:id="rId26"/>
-          <w:pgSz w:w="12240" w:h="15840"/>
-          <w:pgMar w:top="1701" w:right="1701" w:bottom="1701" w:left="2268" w:header="720" w:footer="720" w:gutter="0"/>
-          <w:cols w:space="720"/>
-          <w:titlePg/>
-          <w:docGrid w:linePitch="360"/>
-        </w:sectPr>
-      </w:pPr>
-    </w:p>
-    <w:p>
-      <w:pPr>
+        <w:keepNext/>
+        <w:keepLines/>
         <w:tabs>
           <w:tab w:pos="8271" w:val="right"/>
         </w:tabs>
@@ -1671,6 +1713,7 @@
     </w:p>
     <w:p>
       <w:pPr>
+        <w:keepLines/>
         <w:tabs>
           <w:tab w:pos="1020" w:val="left"/>
           <w:tab w:pos="8271" w:val="right" w:leader="dot"/>
@@ -1703,6 +1746,7 @@
     </w:p>
     <w:p>
       <w:pPr>
+        <w:keepLines/>
         <w:tabs>
           <w:tab w:pos="1020" w:val="left"/>
           <w:tab w:pos="8271" w:val="right" w:leader="dot"/>
@@ -1735,6 +1779,7 @@
     </w:p>
     <w:p>
       <w:pPr>
+        <w:keepLines/>
         <w:tabs>
           <w:tab w:pos="1020" w:val="left"/>
           <w:tab w:pos="8271" w:val="right" w:leader="dot"/>
@@ -1767,6 +1812,7 @@
     </w:p>
     <w:p>
       <w:pPr>
+        <w:keepLines/>
         <w:tabs>
           <w:tab w:pos="1020" w:val="left"/>
           <w:tab w:pos="8271" w:val="right" w:leader="dot"/>
@@ -1800,19 +1846,21 @@
     <w:p>
       <w:pPr>
         <w:sectPr>
-          <w:footerReference w:type="default" r:id="rId27"/>
-          <w:type w:val="continuous"/>
+          <w:footerReference w:type="default" r:id="rId31"/>
           <w:pgSz w:w="12240" w:h="15840"/>
           <w:pgMar w:top="1701" w:right="1701" w:bottom="1701" w:left="2268" w:header="720" w:footer="720" w:gutter="0"/>
           <w:cols w:space="720"/>
-          <w:titlePg/>
           <w:docGrid w:linePitch="360"/>
+          <w:pgNumType w:fmt="lowerRoman"/>
         </w:sectPr>
       </w:pPr>
     </w:p>
     <w:p>
-      <w:bookmarkStart w:id="bm_lista_anexos" w:name="bm_lista_anexos"/>
-      <w:pPr>
+      <w:bookmarkStart w:id="8" w:name="bm_lista_anexos"/>
+      <w:pPr>
+        <w:pStyle w:val="IUTECPPreliminar"/>
+        <w:keepNext/>
+        <w:keepLines/>
         <w:spacing w:before="1140" w:after="480"/>
         <w:jc w:val="center"/>
       </w:pPr>
@@ -1824,22 +1872,12 @@
         </w:rPr>
         <w:t>LISTA DE ANEXOS</w:t>
       </w:r>
-      <w:bookmarkEnd w:id="bm_lista_anexos"/>
+      <w:bookmarkEnd w:id="8"/>
     </w:p>
     <w:p>
       <w:pPr>
-        <w:sectPr>
-          <w:footerReference w:type="default" r:id="rId28"/>
-          <w:pgSz w:w="12240" w:h="15840"/>
-          <w:pgMar w:top="1701" w:right="1701" w:bottom="1701" w:left="2268" w:header="720" w:footer="720" w:gutter="0"/>
-          <w:cols w:space="720"/>
-          <w:titlePg/>
-          <w:docGrid w:linePitch="360"/>
-        </w:sectPr>
-      </w:pPr>
-    </w:p>
-    <w:p>
-      <w:pPr>
+        <w:keepNext/>
+        <w:keepLines/>
         <w:tabs>
           <w:tab w:pos="8271" w:val="right"/>
         </w:tabs>
@@ -1867,6 +1905,7 @@
     </w:p>
     <w:p>
       <w:pPr>
+        <w:keepLines/>
         <w:tabs>
           <w:tab w:pos="1020" w:val="left"/>
           <w:tab w:pos="8271" w:val="right" w:leader="dot"/>
@@ -1899,20 +1938,283 @@
     </w:p>
     <w:p>
       <w:pPr>
+        <w:keepLines/>
+        <w:tabs>
+          <w:tab w:pos="1020" w:val="left"/>
+          <w:tab w:pos="8271" w:val="right" w:leader="dot"/>
+        </w:tabs>
+        <w:spacing w:line="360" w:lineRule="auto" w:before="0" w:after="80"/>
+        <w:ind w:left="1020" w:hanging="1020"/>
+      </w:pPr>
+      <w:r>
+        <w:rPr>
+          <w:rFonts w:ascii="Times New Roman" w:hAnsi="Times New Roman"/>
+          <w:sz w:val="24"/>
+        </w:rPr>
+        <w:t>B</w:t>
+        <w:tab/>
+        <w:t>Flujograma AS-IS del proceso documental actual de Presidencia</w:t>
+        <w:tab/>
+      </w:r>
+      <w:r>
+        <w:rPr>
+          <w:rFonts w:ascii="Times New Roman" w:hAnsi="Times New Roman"/>
+          <w:b w:val="0"/>
+          <w:sz w:val="24"/>
+        </w:rPr>
+        <w:fldChar w:fldCharType="begin"/>
+        <w:instrText xml:space="preserve"> PAGEREF bm_anexoB \h </w:instrText>
+        <w:fldChar w:fldCharType="separate"/>
+        <w:t>?</w:t>
+        <w:fldChar w:fldCharType="end"/>
+      </w:r>
+    </w:p>
+    <w:p>
+      <w:pPr>
+        <w:keepLines/>
+        <w:tabs>
+          <w:tab w:pos="1020" w:val="left"/>
+          <w:tab w:pos="8271" w:val="right" w:leader="dot"/>
+        </w:tabs>
+        <w:spacing w:line="360" w:lineRule="auto" w:before="0" w:after="80"/>
+        <w:ind w:left="1020" w:hanging="1020"/>
+      </w:pPr>
+      <w:r>
+        <w:rPr>
+          <w:rFonts w:ascii="Times New Roman" w:hAnsi="Times New Roman"/>
+          <w:sz w:val="24"/>
+        </w:rPr>
+        <w:t>C</w:t>
+        <w:tab/>
+        <w:t>Flujograma TO-BE del proceso con el sistema automatizado</w:t>
+        <w:tab/>
+      </w:r>
+      <w:r>
+        <w:rPr>
+          <w:rFonts w:ascii="Times New Roman" w:hAnsi="Times New Roman"/>
+          <w:b w:val="0"/>
+          <w:sz w:val="24"/>
+        </w:rPr>
+        <w:fldChar w:fldCharType="begin"/>
+        <w:instrText xml:space="preserve"> PAGEREF bm_anexoC \h </w:instrText>
+        <w:fldChar w:fldCharType="separate"/>
+        <w:t>?</w:t>
+        <w:fldChar w:fldCharType="end"/>
+      </w:r>
+    </w:p>
+    <w:p>
+      <w:pPr>
+        <w:keepLines/>
+        <w:tabs>
+          <w:tab w:pos="1020" w:val="left"/>
+          <w:tab w:pos="8271" w:val="right" w:leader="dot"/>
+        </w:tabs>
+        <w:spacing w:line="360" w:lineRule="auto" w:before="0" w:after="80"/>
+        <w:ind w:left="1020" w:hanging="1020"/>
+      </w:pPr>
+      <w:r>
+        <w:rPr>
+          <w:rFonts w:ascii="Times New Roman" w:hAnsi="Times New Roman"/>
+          <w:sz w:val="24"/>
+        </w:rPr>
+        <w:t>D</w:t>
+        <w:tab/>
+        <w:t>Diagrama entidad-relación del módulo de expedientes</w:t>
+        <w:tab/>
+      </w:r>
+      <w:r>
+        <w:rPr>
+          <w:rFonts w:ascii="Times New Roman" w:hAnsi="Times New Roman"/>
+          <w:b w:val="0"/>
+          <w:sz w:val="24"/>
+        </w:rPr>
+        <w:fldChar w:fldCharType="begin"/>
+        <w:instrText xml:space="preserve"> PAGEREF bm_anexoD \h </w:instrText>
+        <w:fldChar w:fldCharType="separate"/>
+        <w:t>?</w:t>
+        <w:fldChar w:fldCharType="end"/>
+      </w:r>
+    </w:p>
+    <w:p>
+      <w:pPr>
+        <w:keepLines/>
+        <w:tabs>
+          <w:tab w:pos="1020" w:val="left"/>
+          <w:tab w:pos="8271" w:val="right" w:leader="dot"/>
+        </w:tabs>
+        <w:spacing w:line="360" w:lineRule="auto" w:before="0" w:after="80"/>
+        <w:ind w:left="1020" w:hanging="1020"/>
+      </w:pPr>
+      <w:r>
+        <w:rPr>
+          <w:rFonts w:ascii="Times New Roman" w:hAnsi="Times New Roman"/>
+          <w:sz w:val="24"/>
+        </w:rPr>
+        <w:t>E</w:t>
+        <w:tab/>
+        <w:t>Arquitectura lógica del prototipo</w:t>
+        <w:tab/>
+      </w:r>
+      <w:r>
+        <w:rPr>
+          <w:rFonts w:ascii="Times New Roman" w:hAnsi="Times New Roman"/>
+          <w:b w:val="0"/>
+          <w:sz w:val="24"/>
+        </w:rPr>
+        <w:fldChar w:fldCharType="begin"/>
+        <w:instrText xml:space="preserve"> PAGEREF bm_anexoE \h </w:instrText>
+        <w:fldChar w:fldCharType="separate"/>
+        <w:t>?</w:t>
+        <w:fldChar w:fldCharType="end"/>
+      </w:r>
+    </w:p>
+    <w:p>
+      <w:pPr>
+        <w:keepLines/>
+        <w:tabs>
+          <w:tab w:pos="1020" w:val="left"/>
+          <w:tab w:pos="8271" w:val="right" w:leader="dot"/>
+        </w:tabs>
+        <w:spacing w:line="360" w:lineRule="auto" w:before="0" w:after="80"/>
+        <w:ind w:left="1020" w:hanging="1020"/>
+      </w:pPr>
+      <w:r>
+        <w:rPr>
+          <w:rFonts w:ascii="Times New Roman" w:hAnsi="Times New Roman"/>
+          <w:sz w:val="24"/>
+        </w:rPr>
+        <w:t>F</w:t>
+        <w:tab/>
+        <w:t>Secuencia de registro y despacho de un expediente</w:t>
+        <w:tab/>
+      </w:r>
+      <w:r>
+        <w:rPr>
+          <w:rFonts w:ascii="Times New Roman" w:hAnsi="Times New Roman"/>
+          <w:b w:val="0"/>
+          <w:sz w:val="24"/>
+        </w:rPr>
+        <w:fldChar w:fldCharType="begin"/>
+        <w:instrText xml:space="preserve"> PAGEREF bm_anexoF \h </w:instrText>
+        <w:fldChar w:fldCharType="separate"/>
+        <w:t>?</w:t>
+        <w:fldChar w:fldCharType="end"/>
+      </w:r>
+    </w:p>
+    <w:p>
+      <w:pPr>
+        <w:keepLines/>
+        <w:tabs>
+          <w:tab w:pos="1020" w:val="left"/>
+          <w:tab w:pos="8271" w:val="right" w:leader="dot"/>
+        </w:tabs>
+        <w:spacing w:line="360" w:lineRule="auto" w:before="0" w:after="80"/>
+        <w:ind w:left="1020" w:hanging="1020"/>
+      </w:pPr>
+      <w:r>
+        <w:rPr>
+          <w:rFonts w:ascii="Times New Roman" w:hAnsi="Times New Roman"/>
+          <w:sz w:val="24"/>
+        </w:rPr>
+        <w:t>G</w:t>
+        <w:tab/>
+        <w:t>Estados del expediente</w:t>
+        <w:tab/>
+      </w:r>
+      <w:r>
+        <w:rPr>
+          <w:rFonts w:ascii="Times New Roman" w:hAnsi="Times New Roman"/>
+          <w:b w:val="0"/>
+          <w:sz w:val="24"/>
+        </w:rPr>
+        <w:fldChar w:fldCharType="begin"/>
+        <w:instrText xml:space="preserve"> PAGEREF bm_anexoG \h </w:instrText>
+        <w:fldChar w:fldCharType="separate"/>
+        <w:t>?</w:t>
+        <w:fldChar w:fldCharType="end"/>
+      </w:r>
+    </w:p>
+    <w:p>
+      <w:pPr>
+        <w:keepLines/>
+        <w:tabs>
+          <w:tab w:pos="1020" w:val="left"/>
+          <w:tab w:pos="8271" w:val="right" w:leader="dot"/>
+        </w:tabs>
+        <w:spacing w:line="360" w:lineRule="auto" w:before="0" w:after="80"/>
+        <w:ind w:left="1020" w:hanging="1020"/>
+      </w:pPr>
+      <w:r>
+        <w:rPr>
+          <w:rFonts w:ascii="Times New Roman" w:hAnsi="Times New Roman"/>
+          <w:sz w:val="24"/>
+        </w:rPr>
+        <w:t>H</w:t>
+        <w:tab/>
+        <w:t>Mapa de módulos de la interfaz</w:t>
+        <w:tab/>
+      </w:r>
+      <w:r>
+        <w:rPr>
+          <w:rFonts w:ascii="Times New Roman" w:hAnsi="Times New Roman"/>
+          <w:b w:val="0"/>
+          <w:sz w:val="24"/>
+        </w:rPr>
+        <w:fldChar w:fldCharType="begin"/>
+        <w:instrText xml:space="preserve"> PAGEREF bm_anexoH \h </w:instrText>
+        <w:fldChar w:fldCharType="separate"/>
+        <w:t>?</w:t>
+        <w:fldChar w:fldCharType="end"/>
+      </w:r>
+    </w:p>
+    <w:p>
+      <w:pPr>
+        <w:keepLines/>
+        <w:tabs>
+          <w:tab w:pos="1020" w:val="left"/>
+          <w:tab w:pos="8271" w:val="right" w:leader="dot"/>
+        </w:tabs>
+        <w:spacing w:line="360" w:lineRule="auto" w:before="0" w:after="80"/>
+        <w:ind w:left="1020" w:hanging="1020"/>
+      </w:pPr>
+      <w:r>
+        <w:rPr>
+          <w:rFonts w:ascii="Times New Roman" w:hAnsi="Times New Roman"/>
+          <w:sz w:val="24"/>
+        </w:rPr>
+        <w:t>I</w:t>
+        <w:tab/>
+        <w:t>Proceso de respaldo periódico de SQLite</w:t>
+        <w:tab/>
+      </w:r>
+      <w:r>
+        <w:rPr>
+          <w:rFonts w:ascii="Times New Roman" w:hAnsi="Times New Roman"/>
+          <w:b w:val="0"/>
+          <w:sz w:val="24"/>
+        </w:rPr>
+        <w:fldChar w:fldCharType="begin"/>
+        <w:instrText xml:space="preserve"> PAGEREF bm_anexoI \h </w:instrText>
+        <w:fldChar w:fldCharType="separate"/>
+        <w:t>?</w:t>
+        <w:fldChar w:fldCharType="end"/>
+      </w:r>
+    </w:p>
+    <w:p>
+      <w:pPr>
         <w:sectPr>
-          <w:footerReference w:type="default" r:id="rId29"/>
-          <w:type w:val="continuous"/>
+          <w:footerReference w:type="default" r:id="rId32"/>
           <w:pgSz w:w="12240" w:h="15840"/>
           <w:pgMar w:top="1701" w:right="1701" w:bottom="1701" w:left="2268" w:header="720" w:footer="720" w:gutter="0"/>
           <w:cols w:space="720"/>
-          <w:titlePg/>
           <w:docGrid w:linePitch="360"/>
+          <w:pgNumType w:fmt="lowerRoman"/>
         </w:sectPr>
       </w:pPr>
     </w:p>
     <w:p>
       <w:pPr>
-        <w:spacing w:after="0"/>
+        <w:spacing w:line="240" w:lineRule="auto" w:after="0"/>
         <w:jc w:val="center"/>
       </w:pPr>
       <w:r>
@@ -1926,7 +2228,7 @@
     </w:p>
     <w:p>
       <w:pPr>
-        <w:spacing w:after="0"/>
+        <w:spacing w:line="240" w:lineRule="auto" w:after="0"/>
         <w:jc w:val="center"/>
       </w:pPr>
       <w:r>
@@ -1940,7 +2242,7 @@
     </w:p>
     <w:p>
       <w:pPr>
-        <w:spacing w:after="0"/>
+        <w:spacing w:line="240" w:lineRule="auto" w:after="0"/>
         <w:jc w:val="center"/>
       </w:pPr>
       <w:r>
@@ -1954,7 +2256,7 @@
     </w:p>
     <w:p>
       <w:pPr>
-        <w:spacing w:after="0"/>
+        <w:spacing w:line="240" w:lineRule="auto" w:after="0"/>
         <w:jc w:val="center"/>
       </w:pPr>
       <w:r>
@@ -1968,7 +2270,7 @@
     </w:p>
     <w:p>
       <w:pPr>
-        <w:spacing w:after="0"/>
+        <w:spacing w:line="240" w:lineRule="auto" w:after="0"/>
         <w:jc w:val="center"/>
       </w:pPr>
       <w:r>
@@ -1982,12 +2284,7 @@
     </w:p>
     <w:p>
       <w:pPr>
-        <w:spacing w:after="360"/>
-      </w:pPr>
-    </w:p>
-    <w:p>
-      <w:pPr>
-        <w:spacing w:after="480"/>
+        <w:spacing w:line="240" w:lineRule="auto" w:after="120"/>
         <w:jc w:val="center"/>
       </w:pPr>
       <w:r>
@@ -1996,12 +2293,12 @@
           <w:b/>
           <w:sz w:val="24"/>
         </w:rPr>
-        <w:t>DESARROLLO DE UN PROTOTIPO DE SISTEMA PARA EL CONTROL, TRAZABILIDAD Y REPORTE DOCUMENTAL EN LA PRESIDENCIA DE VENANGOCUPET, S.A.</w:t>
+        <w:t>DESARROLLO DE UN PROTOTIPO DE SISTEMA PARA EL CONTROL, TRAZABILIDAD Y REPORTE DOCUMENTAL EN LA PRESIDENCIA DE LA EMPRESA MIXTA PETROLERA VENANGOCUPET, S.A.</w:t>
       </w:r>
     </w:p>
     <w:p>
       <w:pPr>
-        <w:spacing w:after="480"/>
+        <w:spacing w:line="240" w:lineRule="auto" w:after="120"/>
         <w:ind w:left="0"/>
         <w:jc w:val="right"/>
       </w:pPr>
@@ -2011,15 +2308,7 @@
           <w:b/>
           <w:sz w:val="24"/>
         </w:rPr>
-        <w:t>Autor:</w:t>
-        <w:br/>
-      </w:r>
-      <w:r>
-        <w:rPr>
-          <w:rFonts w:ascii="Times New Roman" w:hAnsi="Times New Roman"/>
-          <w:sz w:val="24"/>
-        </w:rPr>
-        <w:t>Cardona, Juliano</w:t>
+        <w:t>Autor: Cardona, Juliano</w:t>
         <w:br/>
       </w:r>
       <w:r>
@@ -2039,9 +2328,9 @@
       </w:r>
     </w:p>
     <w:p>
-      <w:bookmarkStart w:id="bm_resumen" w:name="bm_resumen"/>
-      <w:pPr>
-        <w:spacing w:before="480" w:after="480"/>
+      <w:bookmarkStart w:id="9" w:name="bm_resumen"/>
+      <w:pPr>
+        <w:spacing w:line="240" w:lineRule="auto" w:before="120" w:after="120"/>
         <w:jc w:val="center"/>
       </w:pPr>
       <w:r>
@@ -2052,66 +2341,62 @@
         </w:rPr>
         <w:t>RESUMEN</w:t>
       </w:r>
-      <w:bookmarkEnd w:id="bm_resumen"/>
+      <w:bookmarkEnd w:id="9"/>
     </w:p>
     <w:p>
       <w:pPr>
+        <w:spacing w:line="240" w:lineRule="auto" w:before="0" w:after="0"/>
+        <w:ind w:firstLine="709"/>
+        <w:jc w:val="both"/>
+      </w:pPr>
+      <w:r>
+        <w:rPr>
+          <w:rFonts w:ascii="Times New Roman" w:hAnsi="Times New Roman"/>
+          <w:sz w:val="24"/>
+        </w:rPr>
+        <w:t>El presente informe expone las actividades realizadas durante nueve (9) semanas de pasantías profesionales en el Departamento de Presidencia de la Empresa Mixta Petrolera Venangocupet, S.A. La práctica permitió reconocer el flujo real de recepción, revisión, registro, firma y despacho de expedientes, cuyo control se efectúa mediante hojas de cálculo y requiere transcripción repetitiva de datos. Esta dinámica puede generar duplicidad u omisión de registros y dificulta la obtención inmediata de resúmenes sobre documentos ingresados, firmados, pendientes o despachados. En respuesta a esta situación se planteó como objetivo general desarrollar un sistema automatizado para el control, trazabilidad y reporte documental del área. Las actividades comprendieron el diagnóstico del proceso, levantamiento de requerimientos, modelado de una base de datos relacional, diseño de la interfaz, implementación con SQLite, integración de una aplicación de escritorio y pruebas funcionales de los módulos de registro, consulta, historial y reportes. Como resultado se obtuvo un prototipo funcional orientado a reducir tareas repetitivas y mantener un historial verificable del recorrido de los expedientes. Se concluye que la solución desarrollada responde a los requerimientos esenciales identificados en Presidencia. Se recomienda realizar una incorporación progresiva de los registros y establecer respaldos periódicos de la base de datos antes de su utilización continua.</w:t>
+      </w:r>
+    </w:p>
+    <w:p/>
+    <w:p>
+      <w:pPr>
+        <w:spacing w:line="240" w:lineRule="auto" w:before="0" w:after="0"/>
+        <w:ind w:firstLine="709"/>
+      </w:pPr>
+      <w:r>
+        <w:rPr>
+          <w:rFonts w:ascii="Times New Roman" w:hAnsi="Times New Roman"/>
+          <w:b/>
+          <w:sz w:val="24"/>
+        </w:rPr>
+        <w:t xml:space="preserve">Palabras claves: </w:t>
+      </w:r>
+      <w:r>
+        <w:rPr>
+          <w:rFonts w:ascii="Times New Roman" w:hAnsi="Times New Roman"/>
+          <w:sz w:val="24"/>
+        </w:rPr>
+        <w:t>sistema automatizado, trazabilidad documental, SQLite, Wails, pasantías</w:t>
+      </w:r>
+    </w:p>
+    <w:p>
+      <w:pPr>
         <w:sectPr>
-          <w:footerReference w:type="default" r:id="rId30"/>
+          <w:footerReference w:type="default" r:id="rId33"/>
           <w:pgSz w:w="12240" w:h="15840"/>
           <w:pgMar w:top="1701" w:right="1701" w:bottom="1701" w:left="2268" w:header="720" w:footer="720" w:gutter="0"/>
           <w:cols w:space="720"/>
-          <w:titlePg/>
           <w:docGrid w:linePitch="360"/>
+          <w:pgNumType w:fmt="lowerRoman"/>
         </w:sectPr>
       </w:pPr>
     </w:p>
     <w:p>
-      <w:pPr>
-        <w:spacing w:line="360" w:lineRule="auto" w:after="0" w:before="0"/>
-        <w:ind w:firstLine="709"/>
-        <w:jc w:val="both"/>
-      </w:pPr>
-      <w:r>
-        <w:rPr>
-          <w:rFonts w:ascii="Times New Roman" w:hAnsi="Times New Roman"/>
-          <w:i w:val="0"/>
-          <w:sz w:val="24"/>
-        </w:rPr>
-        <w:t>El presente informe expone las actividades realizadas durante nueve (9) semanas de pasantías profesionales en el Departamento de Presidencia de la Empresa Mixta Petrolera Venangocupet, S.A. La práctica permitió reconocer el flujo real de recepción, revisión, registro, firma y despacho de expedientes, cuyo control se efectúa mediante hojas de cálculo y requiere transcripción repetitiva de datos. Esta dinámica puede generar duplicidad u omisión de registros y dificulta la obtención inmediata de resúmenes sobre documentos ingresados, firmados, pendientes o despachados. En respuesta a esta situación se planteó como objetivo general desarrollar un sistema automatizado para el control, trazabilidad y reporte documental del área. Las actividades comprendieron el diagnóstico del proceso, levantamiento de requerimientos, modelado de una base de datos relacional, diseño de la interfaz, implementación con SQLite, integración de una aplicación de escritorio y pruebas funcionales de los módulos de registro, consulta, historial y reportes. Como resultado se obtuvo un prototipo funcional orientado a reducir tareas repetitivas y mantener un historial verificable del recorrido de los expedientes. Se concluye que la solución desarrollada responde a los requerimientos esenciales identificados en Presidencia. Se recomienda realizar una incorporación progresiva de los registros y establecer respaldos periódicos de la base de datos antes de su utilización continua.</w:t>
-      </w:r>
-    </w:p>
-    <w:p/>
-    <w:p>
-      <w:pPr>
-        <w:ind w:firstLine="709"/>
-      </w:pPr>
-      <w:r>
-        <w:rPr>
-          <w:b/>
-        </w:rPr>
-        <w:t xml:space="preserve">Palabras claves: </w:t>
-      </w:r>
-      <w:r>
-        <w:t>sistema automatizado, trazabilidad documental, SQLite, Wails, pasantías</w:t>
-      </w:r>
-    </w:p>
-    <w:p>
-      <w:pPr>
-        <w:sectPr>
-          <w:footerReference w:type="default" r:id="rId31"/>
-          <w:type w:val="continuous"/>
-          <w:pgSz w:w="12240" w:h="15840"/>
-          <w:pgMar w:top="1701" w:right="1701" w:bottom="1701" w:left="2268" w:header="720" w:footer="720" w:gutter="0"/>
-          <w:cols w:space="720"/>
-          <w:titlePg/>
-          <w:docGrid w:linePitch="360"/>
-        </w:sectPr>
-      </w:pPr>
-    </w:p>
-    <w:p>
-      <w:bookmarkStart w:id="bm_introduccion" w:name="bm_introduccion"/>
-      <w:pPr>
+      <w:bookmarkStart w:id="10" w:name="bm_introduccion"/>
+      <w:pPr>
+        <w:pStyle w:val="IUTECPPreliminar"/>
+        <w:keepNext/>
+        <w:keepLines/>
         <w:spacing w:before="1140" w:after="480"/>
         <w:jc w:val="center"/>
       </w:pPr>
@@ -2123,19 +2408,7 @@
         </w:rPr>
         <w:t>INTRODUCCIÓN</w:t>
       </w:r>
-      <w:bookmarkEnd w:id="bm_introduccion"/>
-    </w:p>
-    <w:p>
-      <w:pPr>
-        <w:sectPr>
-          <w:footerReference w:type="default" r:id="rId32"/>
-          <w:pgSz w:w="12240" w:h="15840"/>
-          <w:pgMar w:top="1701" w:right="1701" w:bottom="1701" w:left="2268" w:header="720" w:footer="720" w:gutter="0"/>
-          <w:cols w:space="720"/>
-          <w:titlePg/>
-          <w:docGrid w:linePitch="360"/>
-        </w:sectPr>
-      </w:pPr>
+      <w:bookmarkEnd w:id="10"/>
     </w:p>
     <w:p>
       <w:pPr>
@@ -2200,18 +2473,21 @@
     <w:p>
       <w:pPr>
         <w:sectPr>
-          <w:footerReference w:type="default" r:id="rId33"/>
-          <w:type w:val="continuous"/>
+          <w:footerReference w:type="default" r:id="rId34"/>
+          <w:footerReference w:type="first" r:id="rId35"/>
           <w:pgSz w:w="12240" w:h="15840"/>
           <w:pgMar w:top="1701" w:right="1701" w:bottom="1701" w:left="2268" w:header="720" w:footer="720" w:gutter="0"/>
           <w:cols w:space="720"/>
           <w:titlePg/>
           <w:docGrid w:linePitch="360"/>
+          <w:pgNumType w:fmt="decimal" w:start="1"/>
         </w:sectPr>
       </w:pPr>
     </w:p>
     <w:p>
       <w:pPr>
+        <w:keepNext/>
+        <w:keepLines/>
         <w:spacing w:before="1140" w:after="480"/>
         <w:jc w:val="center"/>
       </w:pPr>
@@ -2225,8 +2501,9 @@
       </w:r>
     </w:p>
     <w:p>
-      <w:bookmarkStart w:id="bm_cap1" w:name="bm_cap1"/>
-      <w:pPr>
+      <w:bookmarkStart w:id="11" w:name="bm_cap1"/>
+      <w:pPr>
+        <w:pStyle w:val="IUTECPCapítulo"/>
         <w:spacing w:before="480"/>
         <w:jc w:val="center"/>
       </w:pPr>
@@ -2238,23 +2515,12 @@
         </w:rPr>
         <w:t>REALIDAD ORGANIZACIONAL</w:t>
       </w:r>
-      <w:bookmarkEnd w:id="bm_cap1"/>
+      <w:bookmarkEnd w:id="11"/>
     </w:p>
     <w:p>
-      <w:pPr>
-        <w:sectPr>
-          <w:footerReference w:type="default" r:id="rId34"/>
-          <w:pgSz w:w="12240" w:h="15840"/>
-          <w:pgMar w:top="1701" w:right="1701" w:bottom="1701" w:left="2268" w:header="720" w:footer="720" w:gutter="0"/>
-          <w:cols w:space="720"/>
-          <w:titlePg/>
-          <w:docGrid w:linePitch="360"/>
-        </w:sectPr>
-      </w:pPr>
-    </w:p>
-    <w:p>
-      <w:bookmarkStart w:id="bm_cap1_ident" w:name="bm_cap1_ident"/>
-      <w:pPr>
+      <w:bookmarkStart w:id="12" w:name="bm_cap1_ident"/>
+      <w:pPr>
+        <w:pStyle w:val="IUTECPSubtítulocentrado"/>
         <w:spacing w:before="480" w:after="480" w:line="360" w:lineRule="auto"/>
         <w:jc w:val="center"/>
       </w:pPr>
@@ -2266,10 +2532,13 @@
         </w:rPr>
         <w:t>Identificación de la empresa</w:t>
       </w:r>
-      <w:bookmarkEnd w:id="bm_cap1_ident"/>
+      <w:bookmarkEnd w:id="12"/>
     </w:p>
     <w:p>
       <w:pPr>
+        <w:pStyle w:val="IUTECPTítulo2"/>
+        <w:keepNext/>
+        <w:keepLines/>
         <w:spacing w:before="480" w:after="480" w:line="360" w:lineRule="auto"/>
         <w:jc w:val="left"/>
       </w:pPr>
@@ -2298,8 +2567,11 @@
       </w:r>
     </w:p>
     <w:p>
-      <w:bookmarkStart w:id="bm_cap1_resena" w:name="bm_cap1_resena"/>
-      <w:pPr>
+      <w:bookmarkStart w:id="13" w:name="bm_cap1_resena"/>
+      <w:pPr>
+        <w:pStyle w:val="IUTECPTítulo2"/>
+        <w:keepNext/>
+        <w:keepLines/>
         <w:spacing w:before="480" w:after="480" w:line="360" w:lineRule="auto"/>
         <w:jc w:val="left"/>
       </w:pPr>
@@ -2311,7 +2583,7 @@
         </w:rPr>
         <w:t>Reseña histórica</w:t>
       </w:r>
-      <w:bookmarkEnd w:id="bm_cap1_resena"/>
+      <w:bookmarkEnd w:id="13"/>
     </w:p>
     <w:p>
       <w:pPr>
@@ -2344,8 +2616,11 @@
       </w:r>
     </w:p>
     <w:p>
-      <w:bookmarkStart w:id="bm_cap1_mision" w:name="bm_cap1_mision"/>
-      <w:pPr>
+      <w:bookmarkStart w:id="14" w:name="bm_cap1_mision"/>
+      <w:pPr>
+        <w:pStyle w:val="IUTECPTítulo2"/>
+        <w:keepNext/>
+        <w:keepLines/>
         <w:spacing w:before="480" w:after="480" w:line="360" w:lineRule="auto"/>
         <w:jc w:val="left"/>
       </w:pPr>
@@ -2357,7 +2632,7 @@
         </w:rPr>
         <w:t>Misión</w:t>
       </w:r>
-      <w:bookmarkEnd w:id="bm_cap1_mision"/>
+      <w:bookmarkEnd w:id="14"/>
     </w:p>
     <w:p>
       <w:pPr>
@@ -2375,8 +2650,11 @@
       </w:r>
     </w:p>
     <w:p>
-      <w:bookmarkStart w:id="bm_cap1_vision" w:name="bm_cap1_vision"/>
-      <w:pPr>
+      <w:bookmarkStart w:id="15" w:name="bm_cap1_vision"/>
+      <w:pPr>
+        <w:pStyle w:val="IUTECPTítulo2"/>
+        <w:keepNext/>
+        <w:keepLines/>
         <w:spacing w:before="480" w:after="480" w:line="360" w:lineRule="auto"/>
         <w:jc w:val="left"/>
       </w:pPr>
@@ -2388,7 +2666,7 @@
         </w:rPr>
         <w:t>Visión</w:t>
       </w:r>
-      <w:bookmarkEnd w:id="bm_cap1_vision"/>
+      <w:bookmarkEnd w:id="15"/>
     </w:p>
     <w:p>
       <w:pPr>
@@ -2406,8 +2684,11 @@
       </w:r>
     </w:p>
     <w:p>
-      <w:bookmarkStart w:id="bm_cap1_valores" w:name="bm_cap1_valores"/>
-      <w:pPr>
+      <w:bookmarkStart w:id="16" w:name="bm_cap1_valores"/>
+      <w:pPr>
+        <w:pStyle w:val="IUTECPTítulo2"/>
+        <w:keepNext/>
+        <w:keepLines/>
         <w:spacing w:before="480" w:after="480" w:line="360" w:lineRule="auto"/>
         <w:jc w:val="left"/>
       </w:pPr>
@@ -2419,7 +2700,7 @@
         </w:rPr>
         <w:t>Valores</w:t>
       </w:r>
-      <w:bookmarkEnd w:id="bm_cap1_valores"/>
+      <w:bookmarkEnd w:id="16"/>
     </w:p>
     <w:p>
       <w:pPr>
@@ -2553,8 +2834,11 @@
       </w:r>
     </w:p>
     <w:p>
-      <w:bookmarkStart w:id="bm_cap1_obj" w:name="bm_cap1_obj"/>
-      <w:pPr>
+      <w:bookmarkStart w:id="17" w:name="bm_cap1_obj"/>
+      <w:pPr>
+        <w:pStyle w:val="IUTECPTítulo2"/>
+        <w:keepNext/>
+        <w:keepLines/>
         <w:spacing w:before="480" w:after="480" w:line="360" w:lineRule="auto"/>
         <w:jc w:val="left"/>
       </w:pPr>
@@ -2566,10 +2850,13 @@
         </w:rPr>
         <w:t>Objetivos Organizacionales</w:t>
       </w:r>
-      <w:bookmarkEnd w:id="bm_cap1_obj"/>
+      <w:bookmarkEnd w:id="17"/>
     </w:p>
     <w:p>
       <w:pPr>
+        <w:pStyle w:val="IUTECPTítulo2"/>
+        <w:keepNext/>
+        <w:keepLines/>
         <w:spacing w:before="480" w:after="480" w:line="360" w:lineRule="auto"/>
         <w:jc w:val="left"/>
       </w:pPr>
@@ -2599,6 +2886,9 @@
     </w:p>
     <w:p>
       <w:pPr>
+        <w:pStyle w:val="IUTECPTítulo2"/>
+        <w:keepNext/>
+        <w:keepLines/>
         <w:spacing w:before="480" w:after="480" w:line="360" w:lineRule="auto"/>
         <w:jc w:val="left"/>
       </w:pPr>
@@ -2822,8 +3112,101 @@
       </w:r>
     </w:p>
     <w:p>
-      <w:bookmarkStart w:id="bm_cap1_ubic" w:name="bm_cap1_ubic"/>
-      <w:pPr>
+      <w:pPr>
+        <w:keepNext/>
+        <w:keepLines/>
+        <w:spacing w:before="480"/>
+        <w:jc w:val="center"/>
+      </w:pPr>
+      <w:r>
+        <w:drawing>
+          <wp:inline xmlns:a="http://schemas.openxmlformats.org/drawingml/2006/main" xmlns:pic="http://schemas.openxmlformats.org/drawingml/2006/picture">
+            <wp:extent cx="1512000" cy="1512000"/>
+            <wp:docPr id="2" name="Picture 2"/>
+            <wp:cNvGraphicFramePr>
+              <a:graphicFrameLocks noChangeAspect="1"/>
+            </wp:cNvGraphicFramePr>
+            <a:graphic>
+              <a:graphicData uri="http://schemas.openxmlformats.org/drawingml/2006/picture">
+                <pic:pic>
+                  <pic:nvPicPr>
+                    <pic:cNvPr id="0" name="logo.png"/>
+                    <pic:cNvPicPr/>
+                  </pic:nvPicPr>
+                  <pic:blipFill>
+                    <a:blip r:embed="rId10"/>
+                    <a:stretch>
+                      <a:fillRect/>
+                    </a:stretch>
+                  </pic:blipFill>
+                  <pic:spPr>
+                    <a:xfrm>
+                      <a:off x="0" y="0"/>
+                      <a:ext cx="1512000" cy="1512000"/>
+                    </a:xfrm>
+                    <a:prstGeom prst="rect"/>
+                  </pic:spPr>
+                </pic:pic>
+              </a:graphicData>
+            </a:graphic>
+          </wp:inline>
+        </w:drawing>
+      </w:r>
+    </w:p>
+    <w:p>
+      <w:bookmarkStart w:id="18" w:name="bm_grafico1"/>
+      <w:pPr>
+        <w:keepNext/>
+        <w:keepLines/>
+        <w:spacing w:before="120" w:after="480"/>
+        <w:jc w:val="center"/>
+      </w:pPr>
+      <w:r>
+        <w:rPr>
+          <w:rFonts w:ascii="Times New Roman" w:hAnsi="Times New Roman"/>
+          <w:i/>
+          <w:sz w:val="20"/>
+        </w:rPr>
+        <w:t xml:space="preserve">Gráfico 1. </w:t>
+      </w:r>
+      <w:r>
+        <w:rPr>
+          <w:rFonts w:ascii="Times New Roman" w:hAnsi="Times New Roman"/>
+          <w:b/>
+          <w:sz w:val="20"/>
+        </w:rPr>
+        <w:t>Logotipo de la Empresa Mixta Petrolera Venangocupet, S.A.</w:t>
+      </w:r>
+      <w:bookmarkEnd w:id="18"/>
+    </w:p>
+    <w:p>
+      <w:pPr>
+        <w:spacing w:line="240" w:lineRule="auto" w:before="0" w:after="240"/>
+        <w:ind w:firstLine="0"/>
+        <w:jc w:val="center"/>
+      </w:pPr>
+      <w:r>
+        <w:rPr>
+          <w:rFonts w:ascii="Times New Roman" w:hAnsi="Times New Roman"/>
+          <w:i/>
+          <w:sz w:val="20"/>
+        </w:rPr>
+        <w:t xml:space="preserve">Fuente: </w:t>
+      </w:r>
+      <w:r>
+        <w:rPr>
+          <w:rFonts w:ascii="Times New Roman" w:hAnsi="Times New Roman"/>
+          <w:sz w:val="20"/>
+        </w:rPr>
+        <w:t>Empresa Mixta Petrolera Venangocupet, S.A. (2026).</w:t>
+      </w:r>
+    </w:p>
+    <w:p>
+      <w:bookmarkStart w:id="19" w:name="bm_cap1_ubic"/>
+      <w:pPr>
+        <w:pStyle w:val="IUTECPTítulo2"/>
+        <w:keepNext/>
+        <w:keepLines/>
         <w:spacing w:before="480" w:after="480" w:line="360" w:lineRule="auto"/>
         <w:jc w:val="left"/>
       </w:pPr>
@@ -2835,7 +3218,7 @@
         </w:rPr>
         <w:t>Ubicación geográfica</w:t>
       </w:r>
-      <w:bookmarkEnd w:id="bm_cap1_ubic"/>
+      <w:bookmarkEnd w:id="19"/>
     </w:p>
     <w:p>
       <w:pPr>
@@ -2854,6 +3237,8 @@
     </w:p>
     <w:p>
       <w:pPr>
+        <w:keepNext/>
+        <w:keepLines/>
         <w:spacing w:before="480"/>
         <w:jc w:val="center"/>
       </w:pPr>
@@ -2861,7 +3246,7 @@
         <w:drawing>
           <wp:inline xmlns:a="http://schemas.openxmlformats.org/drawingml/2006/main" xmlns:pic="http://schemas.openxmlformats.org/drawingml/2006/picture">
             <wp:extent cx="3960000" cy="2482717"/>
-            <wp:docPr id="2" name="Picture 2"/>
+            <wp:docPr id="3" name="Picture 3"/>
             <wp:cNvGraphicFramePr>
               <a:graphicFrameLocks noChangeAspect="1"/>
             </wp:cNvGraphicFramePr>
@@ -2873,7 +3258,7 @@
                     <pic:cNvPicPr/>
                   </pic:nvPicPr>
                   <pic:blipFill>
-                    <a:blip r:embed="rId10"/>
+                    <a:blip r:embed="rId11"/>
                     <a:stretch>
                       <a:fillRect/>
                     </a:stretch>
@@ -2893,8 +3278,10 @@
       </w:r>
     </w:p>
     <w:p>
-      <w:bookmarkStart w:id="bm_grafico2" w:name="bm_grafico2"/>
-      <w:pPr>
+      <w:bookmarkStart w:id="20" w:name="bm_grafico2"/>
+      <w:pPr>
+        <w:keepNext/>
+        <w:keepLines/>
         <w:spacing w:before="120" w:after="480"/>
         <w:jc w:val="center"/>
       </w:pPr>
@@ -2902,7 +3289,7 @@
         <w:rPr>
           <w:rFonts w:ascii="Times New Roman" w:hAnsi="Times New Roman"/>
           <w:i/>
-          <w:sz w:val="24"/>
+          <w:sz w:val="20"/>
         </w:rPr>
         <w:t xml:space="preserve">Gráfico 2. </w:t>
       </w:r>
@@ -2910,36 +3297,40 @@
         <w:rPr>
           <w:rFonts w:ascii="Times New Roman" w:hAnsi="Times New Roman"/>
           <w:b/>
-          <w:sz w:val="24"/>
+          <w:sz w:val="20"/>
         </w:rPr>
         <w:t>Referencia cartográfica de la ubicación de las oficinas administrativas de Venangocupet, S.A.</w:t>
       </w:r>
-      <w:bookmarkEnd w:id="bm_grafico2"/>
+      <w:bookmarkEnd w:id="20"/>
     </w:p>
     <w:p>
       <w:pPr>
-        <w:spacing w:before="0" w:after="240"/>
+        <w:spacing w:line="240" w:lineRule="auto" w:before="0" w:after="240"/>
+        <w:ind w:firstLine="0"/>
         <w:jc w:val="center"/>
       </w:pPr>
       <w:r>
         <w:rPr>
           <w:rFonts w:ascii="Times New Roman" w:hAnsi="Times New Roman"/>
           <w:i/>
-          <w:sz w:val="24"/>
+          <w:sz w:val="20"/>
         </w:rPr>
         <w:t xml:space="preserve">Fuente: </w:t>
       </w:r>
       <w:r>
         <w:rPr>
           <w:rFonts w:ascii="Times New Roman" w:hAnsi="Times New Roman"/>
-          <w:sz w:val="24"/>
+          <w:sz w:val="20"/>
         </w:rPr>
         <w:t>Captura cartográfica de Google Maps (2026). La empresa no aparece rotulada de forma independiente; se emplea como referencia el Centro Comercial San Remo Mall.</w:t>
       </w:r>
     </w:p>
     <w:p>
-      <w:bookmarkStart w:id="bm_cap1_pobla" w:name="bm_cap1_pobla"/>
-      <w:pPr>
+      <w:bookmarkStart w:id="21" w:name="bm_cap1_pobla"/>
+      <w:pPr>
+        <w:pStyle w:val="IUTECPTítulo2"/>
+        <w:keepNext/>
+        <w:keepLines/>
         <w:spacing w:before="480" w:after="480" w:line="360" w:lineRule="auto"/>
         <w:jc w:val="left"/>
       </w:pPr>
@@ -2951,12 +3342,33 @@
         </w:rPr>
         <w:t>Población de los trabajadores de la empresa</w:t>
       </w:r>
-      <w:bookmarkEnd w:id="bm_cap1_pobla"/>
+      <w:bookmarkEnd w:id="21"/>
     </w:p>
     <w:p>
-      <w:pPr>
-        <w:spacing w:after="120"/>
-      </w:pPr>
+      <w:bookmarkStart w:id="22" w:name="bm_cuadro1"/>
+      <w:pPr>
+        <w:keepNext/>
+        <w:keepLines/>
+        <w:spacing w:before="480" w:after="240" w:line="360" w:lineRule="auto"/>
+        <w:jc w:val="left"/>
+      </w:pPr>
+      <w:r>
+        <w:rPr>
+          <w:rFonts w:ascii="Times New Roman" w:hAnsi="Times New Roman"/>
+          <w:b/>
+          <w:sz w:val="20"/>
+        </w:rPr>
+        <w:t xml:space="preserve">Cuadro 1. </w:t>
+      </w:r>
+      <w:r>
+        <w:rPr>
+          <w:rFonts w:ascii="Times New Roman" w:hAnsi="Times New Roman"/>
+          <w:i/>
+          <w:sz w:val="20"/>
+        </w:rPr>
+        <w:t>Población de los trabajadores del Departamento de Presidencia.</w:t>
+      </w:r>
+      <w:bookmarkEnd w:id="22"/>
     </w:p>
     <w:tbl>
       <w:tblPr>
@@ -2974,6 +3386,9 @@
         <w:gridCol w:w="1134"/>
       </w:tblGrid>
       <w:tr>
+        <w:trPr>
+          <w:tblHeader/>
+        </w:trPr>
         <w:tc>
           <w:tcPr>
             <w:tcW w:w="1984" w:type="dxa"/>
@@ -2981,6 +3396,7 @@
           </w:tcPr>
           <w:p>
             <w:pPr>
+              <w:spacing w:line="240" w:lineRule="auto" w:before="40" w:after="40"/>
               <w:jc w:val="center"/>
             </w:pPr>
             <w:r/>
@@ -2988,7 +3404,7 @@
               <w:rPr>
                 <w:rFonts w:ascii="Times New Roman" w:hAnsi="Times New Roman"/>
                 <w:b/>
-                <w:sz w:val="16"/>
+                <w:sz w:val="20"/>
               </w:rPr>
               <w:t>Departamento / Área</w:t>
             </w:r>
@@ -3001,6 +3417,7 @@
           </w:tcPr>
           <w:p>
             <w:pPr>
+              <w:spacing w:line="240" w:lineRule="auto" w:before="40" w:after="40"/>
               <w:jc w:val="center"/>
             </w:pPr>
             <w:r/>
@@ -3008,7 +3425,7 @@
               <w:rPr>
                 <w:rFonts w:ascii="Times New Roman" w:hAnsi="Times New Roman"/>
                 <w:b/>
-                <w:sz w:val="16"/>
+                <w:sz w:val="20"/>
               </w:rPr>
               <w:t>Cargo</w:t>
             </w:r>
@@ -3021,6 +3438,7 @@
           </w:tcPr>
           <w:p>
             <w:pPr>
+              <w:spacing w:line="240" w:lineRule="auto" w:before="40" w:after="40"/>
               <w:jc w:val="center"/>
             </w:pPr>
             <w:r/>
@@ -3028,7 +3446,7 @@
               <w:rPr>
                 <w:rFonts w:ascii="Times New Roman" w:hAnsi="Times New Roman"/>
                 <w:b/>
-                <w:sz w:val="16"/>
+                <w:sz w:val="20"/>
               </w:rPr>
               <w:t>Femenino</w:t>
             </w:r>
@@ -3041,6 +3459,7 @@
           </w:tcPr>
           <w:p>
             <w:pPr>
+              <w:spacing w:line="240" w:lineRule="auto" w:before="40" w:after="40"/>
               <w:jc w:val="center"/>
             </w:pPr>
             <w:r/>
@@ -3048,7 +3467,7 @@
               <w:rPr>
                 <w:rFonts w:ascii="Times New Roman" w:hAnsi="Times New Roman"/>
                 <w:b/>
-                <w:sz w:val="16"/>
+                <w:sz w:val="20"/>
               </w:rPr>
               <w:t>Masculino</w:t>
             </w:r>
@@ -3061,6 +3480,7 @@
           </w:tcPr>
           <w:p>
             <w:pPr>
+              <w:spacing w:line="240" w:lineRule="auto" w:before="40" w:after="40"/>
               <w:jc w:val="center"/>
             </w:pPr>
             <w:r/>
@@ -3068,7 +3488,7 @@
               <w:rPr>
                 <w:rFonts w:ascii="Times New Roman" w:hAnsi="Times New Roman"/>
                 <w:b/>
-                <w:sz w:val="16"/>
+                <w:sz w:val="20"/>
               </w:rPr>
               <w:t>Total</w:t>
             </w:r>
@@ -3082,13 +3502,14 @@
           </w:tcPr>
           <w:p>
             <w:pPr>
+              <w:spacing w:line="240" w:lineRule="auto" w:before="40" w:after="40"/>
               <w:jc w:val="left"/>
             </w:pPr>
             <w:r/>
             <w:r>
               <w:rPr>
                 <w:rFonts w:ascii="Times New Roman" w:hAnsi="Times New Roman"/>
-                <w:sz w:val="16"/>
+                <w:sz w:val="20"/>
               </w:rPr>
               <w:t>Departamento de Presidencia</w:t>
             </w:r>
@@ -3100,13 +3521,14 @@
           </w:tcPr>
           <w:p>
             <w:pPr>
+              <w:spacing w:line="240" w:lineRule="auto" w:before="40" w:after="40"/>
               <w:jc w:val="left"/>
             </w:pPr>
             <w:r/>
             <w:r>
               <w:rPr>
                 <w:rFonts w:ascii="Times New Roman" w:hAnsi="Times New Roman"/>
-                <w:sz w:val="16"/>
+                <w:sz w:val="20"/>
               </w:rPr>
               <w:t>Presidente</w:t>
             </w:r>
@@ -3118,13 +3540,14 @@
           </w:tcPr>
           <w:p>
             <w:pPr>
+              <w:spacing w:line="240" w:lineRule="auto" w:before="40" w:after="40"/>
               <w:jc w:val="center"/>
             </w:pPr>
             <w:r/>
             <w:r>
               <w:rPr>
                 <w:rFonts w:ascii="Times New Roman" w:hAnsi="Times New Roman"/>
-                <w:sz w:val="16"/>
+                <w:sz w:val="20"/>
               </w:rPr>
               <w:t>0</w:t>
             </w:r>
@@ -3136,13 +3559,14 @@
           </w:tcPr>
           <w:p>
             <w:pPr>
+              <w:spacing w:line="240" w:lineRule="auto" w:before="40" w:after="40"/>
               <w:jc w:val="center"/>
             </w:pPr>
             <w:r/>
             <w:r>
               <w:rPr>
                 <w:rFonts w:ascii="Times New Roman" w:hAnsi="Times New Roman"/>
-                <w:sz w:val="16"/>
+                <w:sz w:val="20"/>
               </w:rPr>
               <w:t>1</w:t>
             </w:r>
@@ -3154,13 +3578,14 @@
           </w:tcPr>
           <w:p>
             <w:pPr>
+              <w:spacing w:line="240" w:lineRule="auto" w:before="40" w:after="40"/>
               <w:jc w:val="center"/>
             </w:pPr>
             <w:r/>
             <w:r>
               <w:rPr>
                 <w:rFonts w:ascii="Times New Roman" w:hAnsi="Times New Roman"/>
-                <w:sz w:val="16"/>
+                <w:sz w:val="20"/>
               </w:rPr>
               <w:t>1</w:t>
             </w:r>
@@ -3174,13 +3599,14 @@
           </w:tcPr>
           <w:p>
             <w:pPr>
+              <w:spacing w:line="240" w:lineRule="auto" w:before="40" w:after="40"/>
               <w:jc w:val="left"/>
             </w:pPr>
             <w:r/>
             <w:r>
               <w:rPr>
                 <w:rFonts w:ascii="Times New Roman" w:hAnsi="Times New Roman"/>
-                <w:sz w:val="16"/>
+                <w:sz w:val="20"/>
               </w:rPr>
               <w:t>Departamento de Presidencia</w:t>
             </w:r>
@@ -3192,13 +3618,14 @@
           </w:tcPr>
           <w:p>
             <w:pPr>
+              <w:spacing w:line="240" w:lineRule="auto" w:before="40" w:after="40"/>
               <w:jc w:val="left"/>
             </w:pPr>
             <w:r/>
             <w:r>
               <w:rPr>
                 <w:rFonts w:ascii="Times New Roman" w:hAnsi="Times New Roman"/>
-                <w:sz w:val="16"/>
+                <w:sz w:val="20"/>
               </w:rPr>
               <w:t>Secretaría</w:t>
             </w:r>
@@ -3210,13 +3637,14 @@
           </w:tcPr>
           <w:p>
             <w:pPr>
+              <w:spacing w:line="240" w:lineRule="auto" w:before="40" w:after="40"/>
               <w:jc w:val="center"/>
             </w:pPr>
             <w:r/>
             <w:r>
               <w:rPr>
                 <w:rFonts w:ascii="Times New Roman" w:hAnsi="Times New Roman"/>
-                <w:sz w:val="16"/>
+                <w:sz w:val="20"/>
               </w:rPr>
               <w:t>1</w:t>
             </w:r>
@@ -3228,13 +3656,14 @@
           </w:tcPr>
           <w:p>
             <w:pPr>
+              <w:spacing w:line="240" w:lineRule="auto" w:before="40" w:after="40"/>
               <w:jc w:val="center"/>
             </w:pPr>
             <w:r/>
             <w:r>
               <w:rPr>
                 <w:rFonts w:ascii="Times New Roman" w:hAnsi="Times New Roman"/>
-                <w:sz w:val="16"/>
+                <w:sz w:val="20"/>
               </w:rPr>
               <w:t>0</w:t>
             </w:r>
@@ -3246,13 +3675,14 @@
           </w:tcPr>
           <w:p>
             <w:pPr>
+              <w:spacing w:line="240" w:lineRule="auto" w:before="40" w:after="40"/>
               <w:jc w:val="center"/>
             </w:pPr>
             <w:r/>
             <w:r>
               <w:rPr>
                 <w:rFonts w:ascii="Times New Roman" w:hAnsi="Times New Roman"/>
-                <w:sz w:val="16"/>
+                <w:sz w:val="20"/>
               </w:rPr>
               <w:t>1</w:t>
             </w:r>
@@ -3266,13 +3696,14 @@
           </w:tcPr>
           <w:p>
             <w:pPr>
+              <w:spacing w:line="240" w:lineRule="auto" w:before="40" w:after="40"/>
               <w:jc w:val="left"/>
             </w:pPr>
             <w:r/>
             <w:r>
               <w:rPr>
                 <w:rFonts w:ascii="Times New Roman" w:hAnsi="Times New Roman"/>
-                <w:sz w:val="16"/>
+                <w:sz w:val="20"/>
               </w:rPr>
               <w:t>TOTAL GENERAL</w:t>
             </w:r>
@@ -3284,13 +3715,14 @@
           </w:tcPr>
           <w:p>
             <w:pPr>
+              <w:spacing w:line="240" w:lineRule="auto" w:before="40" w:after="40"/>
               <w:jc w:val="left"/>
             </w:pPr>
             <w:r/>
             <w:r>
               <w:rPr>
                 <w:rFonts w:ascii="Times New Roman" w:hAnsi="Times New Roman"/>
-                <w:sz w:val="16"/>
+                <w:sz w:val="20"/>
               </w:rPr>
             </w:r>
           </w:p>
@@ -3301,13 +3733,14 @@
           </w:tcPr>
           <w:p>
             <w:pPr>
+              <w:spacing w:line="240" w:lineRule="auto" w:before="40" w:after="40"/>
               <w:jc w:val="center"/>
             </w:pPr>
             <w:r/>
             <w:r>
               <w:rPr>
                 <w:rFonts w:ascii="Times New Roman" w:hAnsi="Times New Roman"/>
-                <w:sz w:val="16"/>
+                <w:sz w:val="20"/>
               </w:rPr>
               <w:t>1</w:t>
             </w:r>
@@ -3319,13 +3752,14 @@
           </w:tcPr>
           <w:p>
             <w:pPr>
+              <w:spacing w:line="240" w:lineRule="auto" w:before="40" w:after="40"/>
               <w:jc w:val="center"/>
             </w:pPr>
             <w:r/>
             <w:r>
               <w:rPr>
                 <w:rFonts w:ascii="Times New Roman" w:hAnsi="Times New Roman"/>
-                <w:sz w:val="16"/>
+                <w:sz w:val="20"/>
               </w:rPr>
               <w:t>1</w:t>
             </w:r>
@@ -3337,13 +3771,14 @@
           </w:tcPr>
           <w:p>
             <w:pPr>
+              <w:spacing w:line="240" w:lineRule="auto" w:before="40" w:after="40"/>
               <w:jc w:val="center"/>
             </w:pPr>
             <w:r/>
             <w:r>
               <w:rPr>
                 <w:rFonts w:ascii="Times New Roman" w:hAnsi="Times New Roman"/>
-                <w:sz w:val="16"/>
+                <w:sz w:val="20"/>
               </w:rPr>
               <w:t>2</w:t>
             </w:r>
@@ -3353,15 +3788,24 @@
     </w:tbl>
     <w:p>
       <w:pPr>
-        <w:spacing w:before="120"/>
+        <w:spacing w:line="240" w:lineRule="auto" w:before="0" w:after="240"/>
+        <w:ind w:firstLine="0"/>
+        <w:jc w:val="left"/>
       </w:pPr>
       <w:r>
         <w:rPr>
           <w:rFonts w:ascii="Times New Roman" w:hAnsi="Times New Roman"/>
           <w:i/>
-          <w:sz w:val="16"/>
+          <w:sz w:val="20"/>
         </w:rPr>
-        <w:t>Fuente: Información suministrada por el Departamento de Presidencia de la Empresa Mixta Petrolera Venangocupet, S.A. (2026).</w:t>
+        <w:t xml:space="preserve">Fuente: </w:t>
+      </w:r>
+      <w:r>
+        <w:rPr>
+          <w:rFonts w:ascii="Times New Roman" w:hAnsi="Times New Roman"/>
+          <w:sz w:val="20"/>
+        </w:rPr>
+        <w:t>Información suministrada por el Departamento de Presidencia de la Empresa Mixta Petrolera Venangocupet, S.A. (2026).</w:t>
       </w:r>
     </w:p>
     <w:p>
@@ -3380,8 +3824,11 @@
       </w:r>
     </w:p>
     <w:p>
-      <w:bookmarkStart w:id="bm_cap1_estruct" w:name="bm_cap1_estruct"/>
-      <w:pPr>
+      <w:bookmarkStart w:id="23" w:name="bm_cap1_estruct"/>
+      <w:pPr>
+        <w:pStyle w:val="IUTECPTítulo2"/>
+        <w:keepNext/>
+        <w:keepLines/>
         <w:spacing w:before="480" w:after="480" w:line="360" w:lineRule="auto"/>
         <w:jc w:val="left"/>
       </w:pPr>
@@ -3393,7 +3840,7 @@
         </w:rPr>
         <w:t>Estructura Organizativa</w:t>
       </w:r>
-      <w:bookmarkEnd w:id="bm_cap1_estruct"/>
+      <w:bookmarkEnd w:id="23"/>
     </w:p>
     <w:p>
       <w:pPr>
@@ -3412,6 +3859,8 @@
     </w:p>
     <w:p>
       <w:pPr>
+        <w:keepNext/>
+        <w:keepLines/>
         <w:spacing w:before="480"/>
         <w:jc w:val="center"/>
       </w:pPr>
@@ -3419,7 +3868,7 @@
         <w:drawing>
           <wp:inline xmlns:a="http://schemas.openxmlformats.org/drawingml/2006/main" xmlns:pic="http://schemas.openxmlformats.org/drawingml/2006/picture">
             <wp:extent cx="4320000" cy="3674391"/>
-            <wp:docPr id="3" name="Picture 3"/>
+            <wp:docPr id="4" name="Picture 4"/>
             <wp:cNvGraphicFramePr>
               <a:graphicFrameLocks noChangeAspect="1"/>
             </wp:cNvGraphicFramePr>
@@ -3431,7 +3880,7 @@
                     <pic:cNvPicPr/>
                   </pic:nvPicPr>
                   <pic:blipFill>
-                    <a:blip r:embed="rId11"/>
+                    <a:blip r:embed="rId12"/>
                     <a:stretch>
                       <a:fillRect/>
                     </a:stretch>
@@ -3451,8 +3900,10 @@
       </w:r>
     </w:p>
     <w:p>
-      <w:bookmarkStart w:id="bm_grafico3" w:name="bm_grafico3"/>
-      <w:pPr>
+      <w:bookmarkStart w:id="24" w:name="bm_grafico3"/>
+      <w:pPr>
+        <w:keepNext/>
+        <w:keepLines/>
         <w:spacing w:before="120" w:after="480"/>
         <w:jc w:val="center"/>
       </w:pPr>
@@ -3460,7 +3911,7 @@
         <w:rPr>
           <w:rFonts w:ascii="Times New Roman" w:hAnsi="Times New Roman"/>
           <w:i/>
-          <w:sz w:val="24"/>
+          <w:sz w:val="20"/>
         </w:rPr>
         <w:t xml:space="preserve">Gráfico 3. </w:t>
       </w:r>
@@ -3468,35 +3919,38 @@
         <w:rPr>
           <w:rFonts w:ascii="Times New Roman" w:hAnsi="Times New Roman"/>
           <w:b/>
-          <w:sz w:val="24"/>
+          <w:sz w:val="20"/>
         </w:rPr>
         <w:t>Organigrama estructural y niveles jerárquicos de Venangocupet, S.A.</w:t>
       </w:r>
-      <w:bookmarkEnd w:id="bm_grafico3"/>
+      <w:bookmarkEnd w:id="24"/>
     </w:p>
     <w:p>
       <w:pPr>
-        <w:spacing w:before="0" w:after="240"/>
+        <w:spacing w:line="240" w:lineRule="auto" w:before="0" w:after="240"/>
+        <w:ind w:firstLine="0"/>
         <w:jc w:val="center"/>
       </w:pPr>
       <w:r>
         <w:rPr>
           <w:rFonts w:ascii="Times New Roman" w:hAnsi="Times New Roman"/>
           <w:i/>
-          <w:sz w:val="24"/>
+          <w:sz w:val="20"/>
         </w:rPr>
         <w:t xml:space="preserve">Fuente: </w:t>
       </w:r>
       <w:r>
         <w:rPr>
           <w:rFonts w:ascii="Times New Roman" w:hAnsi="Times New Roman"/>
-          <w:sz w:val="24"/>
+          <w:sz w:val="20"/>
         </w:rPr>
         <w:t>Empresa Mixta Petrolera Venangocupet, S.A. (2026).</w:t>
       </w:r>
     </w:p>
     <w:p>
       <w:pPr>
+        <w:keepNext/>
+        <w:keepLines/>
         <w:spacing w:before="480"/>
         <w:jc w:val="center"/>
       </w:pPr>
@@ -3504,7 +3958,7 @@
         <w:drawing>
           <wp:inline xmlns:a="http://schemas.openxmlformats.org/drawingml/2006/main" xmlns:pic="http://schemas.openxmlformats.org/drawingml/2006/picture">
             <wp:extent cx="4320000" cy="2881208"/>
-            <wp:docPr id="4" name="Picture 4"/>
+            <wp:docPr id="5" name="Picture 5"/>
             <wp:cNvGraphicFramePr>
               <a:graphicFrameLocks noChangeAspect="1"/>
             </wp:cNvGraphicFramePr>
@@ -3516,7 +3970,7 @@
                     <pic:cNvPicPr/>
                   </pic:nvPicPr>
                   <pic:blipFill>
-                    <a:blip r:embed="rId12"/>
+                    <a:blip r:embed="rId13"/>
                     <a:stretch>
                       <a:fillRect/>
                     </a:stretch>
@@ -3536,8 +3990,10 @@
       </w:r>
     </w:p>
     <w:p>
-      <w:bookmarkStart w:id="bm_grafico4" w:name="bm_grafico4"/>
-      <w:pPr>
+      <w:bookmarkStart w:id="25" w:name="bm_grafico4"/>
+      <w:pPr>
+        <w:keepNext/>
+        <w:keepLines/>
         <w:spacing w:before="120" w:after="480"/>
         <w:jc w:val="center"/>
       </w:pPr>
@@ -3545,57 +4001,96 @@
         <w:rPr>
           <w:rFonts w:ascii="Times New Roman" w:hAnsi="Times New Roman"/>
           <w:i/>
-          <w:sz w:val="24"/>
+          <w:sz w:val="20"/>
         </w:rPr>
         <w:t xml:space="preserve">Gráfico 4. </w:t>
       </w:r>
+      <w:r>
+        <w:rPr>
+          <w:rFonts w:ascii="Times New Roman" w:hAnsi="Times New Roman"/>
+          <w:b/>
+          <w:sz w:val="20"/>
+        </w:rPr>
+        <w:t>Organigrama del Departamento de Presidencia.</w:t>
+      </w:r>
+      <w:bookmarkEnd w:id="25"/>
+    </w:p>
+    <w:p>
+      <w:pPr>
+        <w:spacing w:line="240" w:lineRule="auto" w:before="0" w:after="240"/>
+        <w:ind w:firstLine="0"/>
+        <w:jc w:val="center"/>
+      </w:pPr>
+      <w:r>
+        <w:rPr>
+          <w:rFonts w:ascii="Times New Roman" w:hAnsi="Times New Roman"/>
+          <w:i/>
+          <w:sz w:val="20"/>
+        </w:rPr>
+        <w:t xml:space="preserve">Fuente: </w:t>
+      </w:r>
+      <w:r>
+        <w:rPr>
+          <w:rFonts w:ascii="Times New Roman" w:hAnsi="Times New Roman"/>
+          <w:sz w:val="20"/>
+        </w:rPr>
+        <w:t>Empresa Mixta Petrolera Venangocupet, S.A. (2026).</w:t>
+      </w:r>
+    </w:p>
+    <w:p>
+      <w:bookmarkStart w:id="26" w:name="bm_cap1_departamento"/>
+      <w:pPr>
+        <w:pStyle w:val="IUTECPTítulo2"/>
+        <w:keepNext/>
+        <w:keepLines/>
+        <w:spacing w:before="480" w:after="480" w:line="360" w:lineRule="auto"/>
+        <w:jc w:val="left"/>
+      </w:pPr>
       <w:r>
         <w:rPr>
           <w:rFonts w:ascii="Times New Roman" w:hAnsi="Times New Roman"/>
           <w:b/>
           <w:sz w:val="24"/>
         </w:rPr>
-        <w:t>Organigrama del Departamento de Presidencia.</w:t>
-      </w:r>
-      <w:bookmarkEnd w:id="bm_grafico4"/>
+        <w:t>Descripción del departamento donde realizó la pasantía</w:t>
+      </w:r>
+      <w:bookmarkEnd w:id="26"/>
     </w:p>
     <w:p>
       <w:pPr>
-        <w:spacing w:before="0" w:after="240"/>
-        <w:jc w:val="center"/>
+        <w:spacing w:line="360" w:lineRule="auto" w:after="0" w:before="0"/>
+        <w:ind w:firstLine="709"/>
+        <w:jc w:val="both"/>
       </w:pPr>
       <w:r>
         <w:rPr>
           <w:rFonts w:ascii="Times New Roman" w:hAnsi="Times New Roman"/>
-          <w:i/>
+          <w:i w:val="0"/>
           <w:sz w:val="24"/>
         </w:rPr>
-        <w:t xml:space="preserve">Fuente: </w:t>
-      </w:r>
-      <w:r>
-        <w:rPr>
-          <w:rFonts w:ascii="Times New Roman" w:hAnsi="Times New Roman"/>
-          <w:sz w:val="24"/>
-        </w:rPr>
-        <w:t>Empresa Mixta Petrolera Venangocupet, S.A. (2026).</w:t>
+        <w:t>El Departamento de Presidencia fue el área donde se desarrollaron las pasantías y funciona como punto de recepción, revisión, firma y despacho de correspondencia ejecutiva. El flujo observado comprende la recepción externa del documento, la revisión ortográfica y de formato, el registro de ingreso, la entrega al Presidente para firma, el registro de egreso y el despacho al departamento de destino. La práctica también incluyó el registro y actualización de expedientes, la revisión y canalización de correspondencia y la elaboración de reportes.</w:t>
       </w:r>
     </w:p>
     <w:p>
       <w:pPr>
         <w:sectPr>
-          <w:footerReference w:type="default" r:id="rId35"/>
-          <w:type w:val="continuous"/>
+          <w:footerReference w:type="default" r:id="rId36"/>
+          <w:footerReference w:type="first" r:id="rId37"/>
           <w:pgSz w:w="12240" w:h="15840"/>
           <w:pgMar w:top="1701" w:right="1701" w:bottom="1701" w:left="2268" w:header="720" w:footer="720" w:gutter="0"/>
           <w:cols w:space="720"/>
           <w:titlePg/>
           <w:docGrid w:linePitch="360"/>
+          <w:pgNumType w:fmt="decimal"/>
         </w:sectPr>
       </w:pPr>
     </w:p>
     <w:p>
-      <w:bookmarkStart w:id="bm_referencias" w:name="bm_referencias"/>
-      <w:pPr>
+      <w:bookmarkStart w:id="27" w:name="bm_referencias"/>
+      <w:pPr>
+        <w:pStyle w:val="IUTECPPreliminar"/>
+        <w:keepNext/>
+        <w:keepLines/>
         <w:spacing w:before="1140" w:after="480"/>
         <w:jc w:val="center"/>
       </w:pPr>
@@ -3607,231 +4102,379 @@
         </w:rPr>
         <w:t>REFERENCIAS</w:t>
       </w:r>
-      <w:bookmarkEnd w:id="bm_referencias"/>
+      <w:bookmarkEnd w:id="27"/>
     </w:p>
     <w:p>
       <w:pPr>
+        <w:spacing w:before="480" w:after="0"/>
+      </w:pPr>
+    </w:p>
+    <w:p>
+      <w:pPr>
+        <w:spacing w:line="240" w:lineRule="auto" w:after="480" w:before="0"/>
+        <w:ind w:left="425" w:hanging="425"/>
+        <w:jc w:val="both"/>
+      </w:pPr>
+      <w:r>
+        <w:rPr>
+          <w:rFonts w:ascii="Times New Roman" w:hAnsi="Times New Roman"/>
+          <w:b w:val="0"/>
+          <w:sz w:val="24"/>
+        </w:rPr>
+        <w:t xml:space="preserve">Arias, F. (2012). </w:t>
+      </w:r>
+      <w:r>
+        <w:rPr>
+          <w:rFonts w:ascii="Times New Roman" w:hAnsi="Times New Roman"/>
+          <w:b/>
+          <w:sz w:val="24"/>
+        </w:rPr>
+        <w:t>El proyecto de investigación: Introducción a la metodología científica (6ta ed.)</w:t>
+      </w:r>
+      <w:r>
+        <w:rPr>
+          <w:rFonts w:ascii="Times New Roman" w:hAnsi="Times New Roman"/>
+          <w:b w:val="0"/>
+          <w:sz w:val="24"/>
+        </w:rPr>
+        <w:t>. Episteme, Venezuela.</w:t>
+      </w:r>
+    </w:p>
+    <w:p>
+      <w:pPr>
+        <w:spacing w:line="240" w:lineRule="auto" w:after="480" w:before="0"/>
+        <w:ind w:left="425" w:hanging="425"/>
+        <w:jc w:val="both"/>
+      </w:pPr>
+      <w:r>
+        <w:rPr>
+          <w:rFonts w:ascii="Times New Roman" w:hAnsi="Times New Roman"/>
+          <w:b w:val="0"/>
+          <w:sz w:val="24"/>
+        </w:rPr>
+        <w:t xml:space="preserve">Codd, E. F. (1970). </w:t>
+      </w:r>
+      <w:r>
+        <w:rPr>
+          <w:rFonts w:ascii="Times New Roman" w:hAnsi="Times New Roman"/>
+          <w:b/>
+          <w:sz w:val="24"/>
+        </w:rPr>
+        <w:t>A relational model of data for large shared data banks</w:t>
+      </w:r>
+      <w:r>
+        <w:rPr>
+          <w:rFonts w:ascii="Times New Roman" w:hAnsi="Times New Roman"/>
+          <w:b w:val="0"/>
+          <w:sz w:val="24"/>
+        </w:rPr>
+        <w:t>. Communications of the ACM, 13(6), 377-387.</w:t>
+      </w:r>
+    </w:p>
+    <w:p>
+      <w:pPr>
+        <w:spacing w:line="240" w:lineRule="auto" w:after="480" w:before="0"/>
+        <w:ind w:left="425" w:hanging="425"/>
+        <w:jc w:val="both"/>
+      </w:pPr>
+      <w:r>
+        <w:rPr>
+          <w:rFonts w:ascii="Times New Roman" w:hAnsi="Times New Roman"/>
+          <w:b w:val="0"/>
+          <w:sz w:val="24"/>
+        </w:rPr>
+        <w:t xml:space="preserve">Cruz Mundet, J. R. (2011). </w:t>
+      </w:r>
+      <w:r>
+        <w:rPr>
+          <w:rFonts w:ascii="Times New Roman" w:hAnsi="Times New Roman"/>
+          <w:b/>
+          <w:sz w:val="24"/>
+        </w:rPr>
+        <w:t>Administración de documentos y archivos: Textos fundamentales</w:t>
+      </w:r>
+      <w:r>
+        <w:rPr>
+          <w:rFonts w:ascii="Times New Roman" w:hAnsi="Times New Roman"/>
+          <w:b w:val="0"/>
+          <w:sz w:val="24"/>
+        </w:rPr>
+        <w:t>. Coordinadora de Asociaciones de Archiveros, España.</w:t>
+      </w:r>
+    </w:p>
+    <w:p>
+      <w:pPr>
+        <w:spacing w:line="240" w:lineRule="auto" w:after="480" w:before="0"/>
+        <w:ind w:left="425" w:hanging="425"/>
+        <w:jc w:val="both"/>
+      </w:pPr>
+      <w:r>
+        <w:rPr>
+          <w:rFonts w:ascii="Times New Roman" w:hAnsi="Times New Roman"/>
+          <w:b w:val="0"/>
+          <w:sz w:val="24"/>
+        </w:rPr>
+        <w:t xml:space="preserve">Date, C. J. (2001). </w:t>
+      </w:r>
+      <w:r>
+        <w:rPr>
+          <w:rFonts w:ascii="Times New Roman" w:hAnsi="Times New Roman"/>
+          <w:b/>
+          <w:sz w:val="24"/>
+        </w:rPr>
+        <w:t>Introducción a los sistemas de bases de datos (7ma ed.)</w:t>
+      </w:r>
+      <w:r>
+        <w:rPr>
+          <w:rFonts w:ascii="Times New Roman" w:hAnsi="Times New Roman"/>
+          <w:b w:val="0"/>
+          <w:sz w:val="24"/>
+        </w:rPr>
+        <w:t>. Pearson Educación, México.</w:t>
+      </w:r>
+    </w:p>
+    <w:p>
+      <w:pPr>
+        <w:spacing w:line="240" w:lineRule="auto" w:after="480" w:before="0"/>
+        <w:ind w:left="425" w:hanging="425"/>
+        <w:jc w:val="both"/>
+      </w:pPr>
+      <w:r>
+        <w:rPr>
+          <w:rFonts w:ascii="Times New Roman" w:hAnsi="Times New Roman"/>
+          <w:b w:val="0"/>
+          <w:sz w:val="24"/>
+        </w:rPr>
+        <w:t xml:space="preserve">Gómez, R. (2019). </w:t>
+      </w:r>
+      <w:r>
+        <w:rPr>
+          <w:rFonts w:ascii="Times New Roman" w:hAnsi="Times New Roman"/>
+          <w:b/>
+          <w:sz w:val="24"/>
+        </w:rPr>
+        <w:t>Gestión Documental y Sistemas</w:t>
+      </w:r>
+      <w:r>
+        <w:rPr>
+          <w:rFonts w:ascii="Times New Roman" w:hAnsi="Times New Roman"/>
+          <w:b w:val="0"/>
+          <w:sz w:val="24"/>
+        </w:rPr>
+        <w:t>. Editorial Trillas, México.</w:t>
+      </w:r>
+    </w:p>
+    <w:p>
+      <w:pPr>
+        <w:spacing w:line="240" w:lineRule="auto" w:after="480" w:before="0"/>
+        <w:ind w:left="425" w:hanging="425"/>
+        <w:jc w:val="both"/>
+      </w:pPr>
+      <w:r>
+        <w:rPr>
+          <w:rFonts w:ascii="Times New Roman" w:hAnsi="Times New Roman"/>
+          <w:b w:val="0"/>
+          <w:sz w:val="24"/>
+        </w:rPr>
+        <w:t xml:space="preserve">Kendall, K., y Kendall, J. (2011). </w:t>
+      </w:r>
+      <w:r>
+        <w:rPr>
+          <w:rFonts w:ascii="Times New Roman" w:hAnsi="Times New Roman"/>
+          <w:b/>
+          <w:sz w:val="24"/>
+        </w:rPr>
+        <w:t>Análisis y diseño de sistemas (8va ed.)</w:t>
+      </w:r>
+      <w:r>
+        <w:rPr>
+          <w:rFonts w:ascii="Times New Roman" w:hAnsi="Times New Roman"/>
+          <w:b w:val="0"/>
+          <w:sz w:val="24"/>
+        </w:rPr>
+        <w:t>. Pearson Educación, México.</w:t>
+      </w:r>
+    </w:p>
+    <w:p>
+      <w:pPr>
+        <w:spacing w:line="240" w:lineRule="auto" w:after="480" w:before="0"/>
+        <w:ind w:left="425" w:hanging="425"/>
+        <w:jc w:val="both"/>
+      </w:pPr>
+      <w:r>
+        <w:rPr>
+          <w:rFonts w:ascii="Times New Roman" w:hAnsi="Times New Roman"/>
+          <w:b w:val="0"/>
+          <w:sz w:val="24"/>
+        </w:rPr>
+        <w:t xml:space="preserve">Laudon, K., y Laudon, J. (2016). </w:t>
+      </w:r>
+      <w:r>
+        <w:rPr>
+          <w:rFonts w:ascii="Times New Roman" w:hAnsi="Times New Roman"/>
+          <w:b/>
+          <w:sz w:val="24"/>
+        </w:rPr>
+        <w:t>Sistemas de información gerencial (14va ed.)</w:t>
+      </w:r>
+      <w:r>
+        <w:rPr>
+          <w:rFonts w:ascii="Times New Roman" w:hAnsi="Times New Roman"/>
+          <w:b w:val="0"/>
+          <w:sz w:val="24"/>
+        </w:rPr>
+        <w:t>. Pearson Educación, México.</w:t>
+      </w:r>
+    </w:p>
+    <w:p>
+      <w:pPr>
+        <w:spacing w:line="240" w:lineRule="auto" w:after="480" w:before="0"/>
+        <w:ind w:left="425" w:hanging="425"/>
+        <w:jc w:val="both"/>
+      </w:pPr>
+      <w:r>
+        <w:rPr>
+          <w:rFonts w:ascii="Times New Roman" w:hAnsi="Times New Roman"/>
+          <w:b w:val="0"/>
+          <w:sz w:val="24"/>
+        </w:rPr>
+        <w:t xml:space="preserve">Pressman, R. (2010). </w:t>
+      </w:r>
+      <w:r>
+        <w:rPr>
+          <w:rFonts w:ascii="Times New Roman" w:hAnsi="Times New Roman"/>
+          <w:b/>
+          <w:sz w:val="24"/>
+        </w:rPr>
+        <w:t>Ingeniería de Software: Un enfoque práctico (7ma ed.)</w:t>
+      </w:r>
+      <w:r>
+        <w:rPr>
+          <w:rFonts w:ascii="Times New Roman" w:hAnsi="Times New Roman"/>
+          <w:b w:val="0"/>
+          <w:sz w:val="24"/>
+        </w:rPr>
+        <w:t>. McGraw-Hill, México.</w:t>
+      </w:r>
+    </w:p>
+    <w:p>
+      <w:pPr>
+        <w:spacing w:line="240" w:lineRule="auto" w:after="480" w:before="0"/>
+        <w:ind w:left="425" w:hanging="425"/>
+        <w:jc w:val="both"/>
+      </w:pPr>
+      <w:r>
+        <w:rPr>
+          <w:rFonts w:ascii="Times New Roman" w:hAnsi="Times New Roman"/>
+          <w:b w:val="0"/>
+          <w:sz w:val="24"/>
+        </w:rPr>
+        <w:t xml:space="preserve">Universidad Pedagógica Experimental Libertador. (2016). </w:t>
+      </w:r>
+      <w:r>
+        <w:rPr>
+          <w:rFonts w:ascii="Times New Roman" w:hAnsi="Times New Roman"/>
+          <w:b/>
+          <w:sz w:val="24"/>
+        </w:rPr>
+        <w:t>Manual de trabajos de grado de especialización y maestría y tesis doctorales (5ta ed.)</w:t>
+      </w:r>
+      <w:r>
+        <w:rPr>
+          <w:rFonts w:ascii="Times New Roman" w:hAnsi="Times New Roman"/>
+          <w:b w:val="0"/>
+          <w:sz w:val="24"/>
+        </w:rPr>
+        <w:t>. FEDUPEL, Venezuela.</w:t>
+      </w:r>
+    </w:p>
+    <w:p>
+      <w:pPr>
         <w:sectPr>
-          <w:footerReference w:type="default" r:id="rId36"/>
+          <w:footerReference w:type="default" r:id="rId38"/>
+          <w:footerReference w:type="first" r:id="rId39"/>
           <w:pgSz w:w="12240" w:h="15840"/>
           <w:pgMar w:top="1701" w:right="1701" w:bottom="1701" w:left="2268" w:header="720" w:footer="720" w:gutter="0"/>
           <w:cols w:space="720"/>
           <w:titlePg/>
           <w:docGrid w:linePitch="360"/>
+          <w:pgNumType w:fmt="decimal"/>
         </w:sectPr>
       </w:pPr>
     </w:p>
     <w:p>
-      <w:pPr>
-        <w:spacing w:before="480" w:after="0"/>
-      </w:pPr>
-    </w:p>
-    <w:p>
-      <w:pPr>
-        <w:spacing w:line="240" w:lineRule="auto" w:after="480" w:before="0"/>
-        <w:ind w:left="425" w:hanging="425"/>
-        <w:jc w:val="both"/>
-      </w:pPr>
-      <w:r>
-        <w:rPr>
-          <w:rFonts w:ascii="Times New Roman" w:hAnsi="Times New Roman"/>
-          <w:sz w:val="24"/>
-        </w:rPr>
-        <w:t>Arias, F. (2012). El proyecto de investigación: Introducción a la metodología científica (6ta ed.). Episteme, Venezuela.</w:t>
-      </w:r>
-    </w:p>
-    <w:p>
-      <w:pPr>
-        <w:spacing w:line="240" w:lineRule="auto" w:after="480" w:before="0"/>
-        <w:ind w:left="425" w:hanging="425"/>
-        <w:jc w:val="both"/>
-      </w:pPr>
-      <w:r>
-        <w:rPr>
-          <w:rFonts w:ascii="Times New Roman" w:hAnsi="Times New Roman"/>
-          <w:sz w:val="24"/>
-        </w:rPr>
-        <w:t>Codd, E. F. (1970). A relational model of data for large shared data banks. Communications of the ACM, 13(6), 377-387.</w:t>
-      </w:r>
-    </w:p>
-    <w:p>
-      <w:pPr>
-        <w:spacing w:line="240" w:lineRule="auto" w:after="480" w:before="0"/>
-        <w:ind w:left="425" w:hanging="425"/>
-        <w:jc w:val="both"/>
-      </w:pPr>
-      <w:r>
-        <w:rPr>
-          <w:rFonts w:ascii="Times New Roman" w:hAnsi="Times New Roman"/>
-          <w:sz w:val="24"/>
-        </w:rPr>
-        <w:t>Cruz Mundet, J. R. (2011). Administración de documentos y archivos: Textos fundamentales. Coordinadora de Asociaciones de Archiveros, España.</w:t>
-      </w:r>
-    </w:p>
-    <w:p>
-      <w:pPr>
-        <w:spacing w:line="240" w:lineRule="auto" w:after="480" w:before="0"/>
-        <w:ind w:left="425" w:hanging="425"/>
-        <w:jc w:val="both"/>
-      </w:pPr>
-      <w:r>
-        <w:rPr>
-          <w:rFonts w:ascii="Times New Roman" w:hAnsi="Times New Roman"/>
-          <w:sz w:val="24"/>
-        </w:rPr>
-        <w:t>Date, C. J. (2001). Introducción a los sistemas de bases de datos (7ma ed.). Pearson Educación, México.</w:t>
-      </w:r>
-    </w:p>
-    <w:p>
-      <w:pPr>
-        <w:spacing w:line="240" w:lineRule="auto" w:after="480" w:before="0"/>
-        <w:ind w:left="425" w:hanging="425"/>
-        <w:jc w:val="both"/>
-      </w:pPr>
-      <w:r>
-        <w:rPr>
-          <w:rFonts w:ascii="Times New Roman" w:hAnsi="Times New Roman"/>
-          <w:sz w:val="24"/>
-        </w:rPr>
-        <w:t>Gómez, R. (2019). Gestión Documental y Sistemas. Editorial Trillas, México.</w:t>
-      </w:r>
-    </w:p>
-    <w:p>
-      <w:pPr>
-        <w:spacing w:line="240" w:lineRule="auto" w:after="480" w:before="0"/>
-        <w:ind w:left="425" w:hanging="425"/>
-        <w:jc w:val="both"/>
-      </w:pPr>
-      <w:r>
-        <w:rPr>
-          <w:rFonts w:ascii="Times New Roman" w:hAnsi="Times New Roman"/>
-          <w:sz w:val="24"/>
-        </w:rPr>
-        <w:t>Kendall, K., y Kendall, J. (2011). Análisis y diseño de sistemas (8va ed.). Pearson Educación, México.</w:t>
-      </w:r>
-    </w:p>
-    <w:p>
-      <w:pPr>
-        <w:spacing w:line="240" w:lineRule="auto" w:after="480" w:before="0"/>
-        <w:ind w:left="425" w:hanging="425"/>
-        <w:jc w:val="both"/>
-      </w:pPr>
-      <w:r>
-        <w:rPr>
-          <w:rFonts w:ascii="Times New Roman" w:hAnsi="Times New Roman"/>
-          <w:sz w:val="24"/>
-        </w:rPr>
-        <w:t>Laudon, K., y Laudon, J. (2016). Sistemas de información gerencial (14va ed.). Pearson Educación, México.</w:t>
-      </w:r>
-    </w:p>
-    <w:p>
-      <w:pPr>
-        <w:spacing w:line="240" w:lineRule="auto" w:after="480" w:before="0"/>
-        <w:ind w:left="425" w:hanging="425"/>
-        <w:jc w:val="both"/>
-      </w:pPr>
-      <w:r>
-        <w:rPr>
-          <w:rFonts w:ascii="Times New Roman" w:hAnsi="Times New Roman"/>
-          <w:sz w:val="24"/>
-        </w:rPr>
-        <w:t>Pressman, R. (2010). Ingeniería de Software: Un enfoque práctico (7ma ed.). McGraw-Hill, México.</w:t>
-      </w:r>
-    </w:p>
-    <w:p>
-      <w:pPr>
-        <w:spacing w:line="240" w:lineRule="auto" w:after="480" w:before="0"/>
-        <w:ind w:left="425" w:hanging="425"/>
-        <w:jc w:val="both"/>
-      </w:pPr>
-      <w:r>
-        <w:rPr>
-          <w:rFonts w:ascii="Times New Roman" w:hAnsi="Times New Roman"/>
-          <w:sz w:val="24"/>
-        </w:rPr>
-        <w:t>Universidad Pedagógica Experimental Libertador. (2016). Manual de trabajos de grado de especialización y maestría y tesis doctorales (5ta ed.). FEDUPEL, Venezuela.</w:t>
-      </w:r>
-    </w:p>
-    <w:p>
-      <w:pPr>
-        <w:sectPr>
-          <w:footerReference w:type="default" r:id="rId37"/>
-          <w:type w:val="continuous"/>
-          <w:pgSz w:w="12240" w:h="15840"/>
-          <w:pgMar w:top="1701" w:right="1701" w:bottom="1701" w:left="2268" w:header="720" w:footer="720" w:gutter="0"/>
-          <w:cols w:space="720"/>
-          <w:titlePg/>
-          <w:docGrid w:linePitch="360"/>
-        </w:sectPr>
-      </w:pPr>
-    </w:p>
-    <w:p>
-      <w:bookmarkStart w:id="bm_anexos" w:name="bm_anexos"/>
-      <w:pPr>
-        <w:spacing w:before="4740"/>
+      <w:bookmarkStart w:id="28" w:name="bm_anexos"/>
+      <w:pPr>
+        <w:spacing w:before="6075"/>
         <w:jc w:val="center"/>
       </w:pPr>
-      <w:r>
-        <w:rPr>
-          <w:rFonts w:ascii="Times New Roman" w:hAnsi="Times New Roman"/>
-          <w:b/>
-          <w:sz w:val="32"/>
-        </w:rPr>
-        <w:t>ANEXOS</w:t>
-      </w:r>
-      <w:bookmarkEnd w:id="bm_anexos"/>
-    </w:p>
-    <w:p>
-      <w:pPr>
-        <w:sectPr>
-          <w:footerReference w:type="default" r:id="rId38"/>
-          <w:pgSz w:w="12240" w:h="15840"/>
-          <w:pgMar w:top="1701" w:right="1701" w:bottom="1701" w:left="2268" w:header="720" w:footer="720" w:gutter="0"/>
-          <w:cols w:space="720"/>
-          <w:titlePg/>
-          <w:docGrid w:linePitch="360"/>
-        </w:sectPr>
-      </w:pPr>
-    </w:p>
-    <w:p>
-      <w:bookmarkStart w:id="bm_anexoA" w:name="bm_anexoA"/>
-      <w:pPr>
-        <w:spacing w:before="0" w:after="480"/>
-        <w:jc w:val="center"/>
-      </w:pPr>
-      <w:bookmarkEnd w:id="bm_anexoA"/>
       <w:r>
         <w:rPr>
           <w:rFonts w:ascii="Times New Roman" w:hAnsi="Times New Roman"/>
           <w:b/>
           <w:sz w:val="24"/>
         </w:rPr>
-        <w:t>ANEXO A</w:t>
-      </w:r>
+        <w:t>ANEXOS</w:t>
+      </w:r>
+      <w:bookmarkEnd w:id="28"/>
     </w:p>
     <w:p>
       <w:pPr>
-        <w:spacing w:before="240" w:after="480"/>
+        <w:sectPr>
+          <w:footerReference w:type="default" r:id="rId40"/>
+          <w:pgSz w:w="12240" w:h="15840"/>
+          <w:pgMar w:top="1701" w:right="1701" w:bottom="1701" w:left="2268" w:header="720" w:footer="720" w:gutter="0"/>
+          <w:cols w:space="720"/>
+          <w:docGrid w:linePitch="360"/>
+          <w:pgNumType w:fmt="decimal"/>
+        </w:sectPr>
+      </w:pPr>
+    </w:p>
+    <w:p>
+      <w:bookmarkStart w:id="29" w:name="bm_anexoA"/>
+      <w:pPr>
+        <w:keepNext/>
+        <w:keepLines/>
+        <w:spacing w:before="0" w:after="480"/>
         <w:jc w:val="center"/>
       </w:pPr>
+      <w:bookmarkEnd w:id="29"/>
       <w:r>
         <w:rPr>
           <w:rFonts w:ascii="Times New Roman" w:hAnsi="Times New Roman"/>
           <w:b/>
-          <w:sz w:val="24"/>
+          <w:sz w:val="20"/>
+        </w:rPr>
+        <w:t>ANEXO A</w:t>
+      </w:r>
+    </w:p>
+    <w:p>
+      <w:pPr>
+        <w:keepNext/>
+        <w:keepLines/>
+        <w:spacing w:before="240" w:after="480"/>
+        <w:jc w:val="center"/>
+      </w:pPr>
+      <w:r>
+        <w:rPr>
+          <w:rFonts w:ascii="Times New Roman" w:hAnsi="Times New Roman"/>
+          <w:b/>
+          <w:sz w:val="20"/>
         </w:rPr>
         <w:t>[Árbol del problema del control de movimientos documentales]</w:t>
       </w:r>
     </w:p>
     <w:p>
       <w:pPr>
+        <w:keepNext/>
+        <w:keepLines/>
         <w:jc w:val="center"/>
       </w:pPr>
       <w:r>
         <w:drawing>
           <wp:inline xmlns:a="http://schemas.openxmlformats.org/drawingml/2006/main" xmlns:pic="http://schemas.openxmlformats.org/drawingml/2006/picture">
-            <wp:extent cx="3960000" cy="4860000"/>
-            <wp:docPr id="5" name="Picture 5"/>
+            <wp:extent cx="3960000" cy="2317669"/>
+            <wp:docPr id="6" name="Picture 6"/>
             <wp:cNvGraphicFramePr>
               <a:graphicFrameLocks noChangeAspect="1"/>
             </wp:cNvGraphicFramePr>
@@ -3843,7 +4486,7 @@
                     <pic:cNvPicPr/>
                   </pic:nvPicPr>
                   <pic:blipFill>
-                    <a:blip r:embed="rId13"/>
+                    <a:blip r:embed="rId14"/>
                     <a:stretch>
                       <a:fillRect/>
                     </a:stretch>
@@ -3851,7 +4494,7 @@
                   <pic:spPr>
                     <a:xfrm>
                       <a:off x="0" y="0"/>
-                      <a:ext cx="3960000" cy="4860000"/>
+                      <a:ext cx="3960000" cy="2317669"/>
                     </a:xfrm>
                     <a:prstGeom prst="rect"/>
                   </pic:spPr>
@@ -3862,13 +4505,907 @@
         </w:drawing>
       </w:r>
     </w:p>
+    <w:p>
+      <w:pPr>
+        <w:spacing w:line="240" w:lineRule="auto" w:before="0" w:after="240"/>
+        <w:ind w:firstLine="0"/>
+        <w:jc w:val="center"/>
+      </w:pPr>
+      <w:r>
+        <w:rPr>
+          <w:rFonts w:ascii="Times New Roman" w:hAnsi="Times New Roman"/>
+          <w:i/>
+          <w:sz w:val="20"/>
+        </w:rPr>
+        <w:t xml:space="preserve">Fuente: </w:t>
+      </w:r>
+      <w:r>
+        <w:rPr>
+          <w:rFonts w:ascii="Times New Roman" w:hAnsi="Times New Roman"/>
+          <w:sz w:val="20"/>
+        </w:rPr>
+        <w:t>Elaboración propia (2026).</w:t>
+      </w:r>
+    </w:p>
+    <w:p>
+      <w:pPr>
+        <w:sectPr>
+          <w:footerReference w:type="default" r:id="rId41"/>
+          <w:pgSz w:w="12240" w:h="15840"/>
+          <w:pgMar w:top="1701" w:right="1701" w:bottom="1701" w:left="2268" w:header="720" w:footer="720" w:gutter="0"/>
+          <w:cols w:space="720"/>
+          <w:docGrid w:linePitch="360"/>
+          <w:pgNumType w:fmt="decimal"/>
+        </w:sectPr>
+      </w:pPr>
+    </w:p>
+    <w:p>
+      <w:bookmarkStart w:id="30" w:name="bm_anexoB"/>
+      <w:pPr>
+        <w:keepNext/>
+        <w:keepLines/>
+        <w:spacing w:before="0" w:after="480"/>
+        <w:jc w:val="center"/>
+      </w:pPr>
+      <w:bookmarkEnd w:id="30"/>
+      <w:r>
+        <w:rPr>
+          <w:rFonts w:ascii="Times New Roman" w:hAnsi="Times New Roman"/>
+          <w:b/>
+          <w:sz w:val="20"/>
+        </w:rPr>
+        <w:t>ANEXO B</w:t>
+      </w:r>
+    </w:p>
+    <w:p>
+      <w:pPr>
+        <w:keepNext/>
+        <w:keepLines/>
+        <w:spacing w:before="240" w:after="480"/>
+        <w:jc w:val="center"/>
+      </w:pPr>
+      <w:r>
+        <w:rPr>
+          <w:rFonts w:ascii="Times New Roman" w:hAnsi="Times New Roman"/>
+          <w:b/>
+          <w:sz w:val="20"/>
+        </w:rPr>
+        <w:t>[Flujograma AS-IS del proceso documental actual de Presidencia]</w:t>
+      </w:r>
+    </w:p>
+    <w:p>
+      <w:pPr>
+        <w:keepNext/>
+        <w:keepLines/>
+        <w:jc w:val="center"/>
+      </w:pPr>
+      <w:r>
+        <w:drawing>
+          <wp:inline xmlns:a="http://schemas.openxmlformats.org/drawingml/2006/main" xmlns:pic="http://schemas.openxmlformats.org/drawingml/2006/picture">
+            <wp:extent cx="3960000" cy="4934286"/>
+            <wp:docPr id="7" name="Picture 7"/>
+            <wp:cNvGraphicFramePr>
+              <a:graphicFrameLocks noChangeAspect="1"/>
+            </wp:cNvGraphicFramePr>
+            <a:graphic>
+              <a:graphicData uri="http://schemas.openxmlformats.org/drawingml/2006/picture">
+                <pic:pic>
+                  <pic:nvPicPr>
+                    <pic:cNvPr id="0" name="02_flujo_as_is_presidencia.png"/>
+                    <pic:cNvPicPr/>
+                  </pic:nvPicPr>
+                  <pic:blipFill>
+                    <a:blip r:embed="rId15"/>
+                    <a:stretch>
+                      <a:fillRect/>
+                    </a:stretch>
+                  </pic:blipFill>
+                  <pic:spPr>
+                    <a:xfrm>
+                      <a:off x="0" y="0"/>
+                      <a:ext cx="3960000" cy="4934286"/>
+                    </a:xfrm>
+                    <a:prstGeom prst="rect"/>
+                  </pic:spPr>
+                </pic:pic>
+              </a:graphicData>
+            </a:graphic>
+          </wp:inline>
+        </w:drawing>
+      </w:r>
+    </w:p>
+    <w:p>
+      <w:pPr>
+        <w:spacing w:line="240" w:lineRule="auto" w:before="0" w:after="240"/>
+        <w:ind w:firstLine="0"/>
+        <w:jc w:val="center"/>
+      </w:pPr>
+      <w:r>
+        <w:rPr>
+          <w:rFonts w:ascii="Times New Roman" w:hAnsi="Times New Roman"/>
+          <w:i/>
+          <w:sz w:val="20"/>
+        </w:rPr>
+        <w:t xml:space="preserve">Fuente: </w:t>
+      </w:r>
+      <w:r>
+        <w:rPr>
+          <w:rFonts w:ascii="Times New Roman" w:hAnsi="Times New Roman"/>
+          <w:sz w:val="20"/>
+        </w:rPr>
+        <w:t>Elaboración propia (2026).</w:t>
+      </w:r>
+    </w:p>
+    <w:p>
+      <w:pPr>
+        <w:sectPr>
+          <w:footerReference w:type="default" r:id="rId42"/>
+          <w:pgSz w:w="12240" w:h="15840"/>
+          <w:pgMar w:top="1701" w:right="1701" w:bottom="1701" w:left="2268" w:header="720" w:footer="720" w:gutter="0"/>
+          <w:cols w:space="720"/>
+          <w:docGrid w:linePitch="360"/>
+          <w:pgNumType w:fmt="decimal"/>
+        </w:sectPr>
+      </w:pPr>
+    </w:p>
+    <w:p>
+      <w:bookmarkStart w:id="31" w:name="bm_anexoC"/>
+      <w:pPr>
+        <w:keepNext/>
+        <w:keepLines/>
+        <w:spacing w:before="0" w:after="480"/>
+        <w:jc w:val="center"/>
+      </w:pPr>
+      <w:bookmarkEnd w:id="31"/>
+      <w:r>
+        <w:rPr>
+          <w:rFonts w:ascii="Times New Roman" w:hAnsi="Times New Roman"/>
+          <w:b/>
+          <w:sz w:val="20"/>
+        </w:rPr>
+        <w:t>ANEXO C</w:t>
+      </w:r>
+    </w:p>
+    <w:p>
+      <w:pPr>
+        <w:keepNext/>
+        <w:keepLines/>
+        <w:spacing w:before="240" w:after="480"/>
+        <w:jc w:val="center"/>
+      </w:pPr>
+      <w:r>
+        <w:rPr>
+          <w:rFonts w:ascii="Times New Roman" w:hAnsi="Times New Roman"/>
+          <w:b/>
+          <w:sz w:val="20"/>
+        </w:rPr>
+        <w:t>[Flujograma TO-BE del proceso con el sistema automatizado]</w:t>
+      </w:r>
+    </w:p>
+    <w:p>
+      <w:pPr>
+        <w:keepNext/>
+        <w:keepLines/>
+        <w:jc w:val="center"/>
+      </w:pPr>
+      <w:r>
+        <w:drawing>
+          <wp:inline xmlns:a="http://schemas.openxmlformats.org/drawingml/2006/main" xmlns:pic="http://schemas.openxmlformats.org/drawingml/2006/picture">
+            <wp:extent cx="2959378" cy="5400000"/>
+            <wp:docPr id="8" name="Picture 8"/>
+            <wp:cNvGraphicFramePr>
+              <a:graphicFrameLocks noChangeAspect="1"/>
+            </wp:cNvGraphicFramePr>
+            <a:graphic>
+              <a:graphicData uri="http://schemas.openxmlformats.org/drawingml/2006/picture">
+                <pic:pic>
+                  <pic:nvPicPr>
+                    <pic:cNvPr id="0" name="03_flujo_to_be_sistema_automatizado.png"/>
+                    <pic:cNvPicPr/>
+                  </pic:nvPicPr>
+                  <pic:blipFill>
+                    <a:blip r:embed="rId16"/>
+                    <a:stretch>
+                      <a:fillRect/>
+                    </a:stretch>
+                  </pic:blipFill>
+                  <pic:spPr>
+                    <a:xfrm>
+                      <a:off x="0" y="0"/>
+                      <a:ext cx="2959378" cy="5400000"/>
+                    </a:xfrm>
+                    <a:prstGeom prst="rect"/>
+                  </pic:spPr>
+                </pic:pic>
+              </a:graphicData>
+            </a:graphic>
+          </wp:inline>
+        </w:drawing>
+      </w:r>
+    </w:p>
+    <w:p>
+      <w:pPr>
+        <w:spacing w:line="240" w:lineRule="auto" w:before="0" w:after="240"/>
+        <w:ind w:firstLine="0"/>
+        <w:jc w:val="center"/>
+      </w:pPr>
+      <w:r>
+        <w:rPr>
+          <w:rFonts w:ascii="Times New Roman" w:hAnsi="Times New Roman"/>
+          <w:i/>
+          <w:sz w:val="20"/>
+        </w:rPr>
+        <w:t xml:space="preserve">Fuente: </w:t>
+      </w:r>
+      <w:r>
+        <w:rPr>
+          <w:rFonts w:ascii="Times New Roman" w:hAnsi="Times New Roman"/>
+          <w:sz w:val="20"/>
+        </w:rPr>
+        <w:t>Elaboración propia (2026).</w:t>
+      </w:r>
+    </w:p>
+    <w:p>
+      <w:pPr>
+        <w:sectPr>
+          <w:footerReference w:type="default" r:id="rId43"/>
+          <w:pgSz w:w="12240" w:h="15840"/>
+          <w:pgMar w:top="1701" w:right="1701" w:bottom="1701" w:left="2268" w:header="720" w:footer="720" w:gutter="0"/>
+          <w:cols w:space="720"/>
+          <w:docGrid w:linePitch="360"/>
+          <w:pgNumType w:fmt="decimal"/>
+        </w:sectPr>
+      </w:pPr>
+    </w:p>
+    <w:p>
+      <w:bookmarkStart w:id="32" w:name="bm_anexoD"/>
+      <w:pPr>
+        <w:keepNext/>
+        <w:keepLines/>
+        <w:spacing w:before="0" w:after="480"/>
+        <w:jc w:val="center"/>
+      </w:pPr>
+      <w:bookmarkEnd w:id="32"/>
+      <w:r>
+        <w:rPr>
+          <w:rFonts w:ascii="Times New Roman" w:hAnsi="Times New Roman"/>
+          <w:b/>
+          <w:sz w:val="20"/>
+        </w:rPr>
+        <w:t>ANEXO D</w:t>
+      </w:r>
+    </w:p>
+    <w:p>
+      <w:pPr>
+        <w:keepNext/>
+        <w:keepLines/>
+        <w:spacing w:before="240" w:after="480"/>
+        <w:jc w:val="center"/>
+      </w:pPr>
+      <w:r>
+        <w:rPr>
+          <w:rFonts w:ascii="Times New Roman" w:hAnsi="Times New Roman"/>
+          <w:b/>
+          <w:sz w:val="20"/>
+        </w:rPr>
+        <w:t>[Diagrama entidad-relación del módulo de expedientes]</w:t>
+      </w:r>
+    </w:p>
+    <w:p>
+      <w:pPr>
+        <w:keepNext/>
+        <w:keepLines/>
+        <w:jc w:val="center"/>
+      </w:pPr>
+      <w:r>
+        <w:drawing>
+          <wp:inline xmlns:a="http://schemas.openxmlformats.org/drawingml/2006/main" xmlns:pic="http://schemas.openxmlformats.org/drawingml/2006/picture">
+            <wp:extent cx="5039999" cy="4452114"/>
+            <wp:docPr id="9" name="Picture 9"/>
+            <wp:cNvGraphicFramePr>
+              <a:graphicFrameLocks noChangeAspect="1"/>
+            </wp:cNvGraphicFramePr>
+            <a:graphic>
+              <a:graphicData uri="http://schemas.openxmlformats.org/drawingml/2006/picture">
+                <pic:pic>
+                  <pic:nvPicPr>
+                    <pic:cNvPr id="0" name="04_modelo_relacional_documental.png"/>
+                    <pic:cNvPicPr/>
+                  </pic:nvPicPr>
+                  <pic:blipFill>
+                    <a:blip r:embed="rId17"/>
+                    <a:stretch>
+                      <a:fillRect/>
+                    </a:stretch>
+                  </pic:blipFill>
+                  <pic:spPr>
+                    <a:xfrm>
+                      <a:off x="0" y="0"/>
+                      <a:ext cx="5039999" cy="4452114"/>
+                    </a:xfrm>
+                    <a:prstGeom prst="rect"/>
+                  </pic:spPr>
+                </pic:pic>
+              </a:graphicData>
+            </a:graphic>
+          </wp:inline>
+        </w:drawing>
+      </w:r>
+    </w:p>
+    <w:p>
+      <w:pPr>
+        <w:spacing w:line="240" w:lineRule="auto" w:before="0" w:after="240"/>
+        <w:ind w:firstLine="0"/>
+        <w:jc w:val="center"/>
+      </w:pPr>
+      <w:r>
+        <w:rPr>
+          <w:rFonts w:ascii="Times New Roman" w:hAnsi="Times New Roman"/>
+          <w:i/>
+          <w:sz w:val="20"/>
+        </w:rPr>
+        <w:t xml:space="preserve">Fuente: </w:t>
+      </w:r>
+      <w:r>
+        <w:rPr>
+          <w:rFonts w:ascii="Times New Roman" w:hAnsi="Times New Roman"/>
+          <w:sz w:val="20"/>
+        </w:rPr>
+        <w:t>Elaboración propia a partir de expedientes_schema.sql (2026).</w:t>
+      </w:r>
+    </w:p>
+    <w:p>
+      <w:pPr>
+        <w:sectPr>
+          <w:footerReference w:type="default" r:id="rId44"/>
+          <w:pgSz w:w="12240" w:h="15840"/>
+          <w:pgMar w:top="1701" w:right="1701" w:bottom="1701" w:left="2268" w:header="720" w:footer="720" w:gutter="0"/>
+          <w:cols w:space="720"/>
+          <w:docGrid w:linePitch="360"/>
+          <w:pgNumType w:fmt="decimal"/>
+        </w:sectPr>
+      </w:pPr>
+    </w:p>
+    <w:p>
+      <w:bookmarkStart w:id="33" w:name="bm_anexoE"/>
+      <w:pPr>
+        <w:keepNext/>
+        <w:keepLines/>
+        <w:spacing w:before="0" w:after="480"/>
+        <w:jc w:val="center"/>
+      </w:pPr>
+      <w:bookmarkEnd w:id="33"/>
+      <w:r>
+        <w:rPr>
+          <w:rFonts w:ascii="Times New Roman" w:hAnsi="Times New Roman"/>
+          <w:b/>
+          <w:sz w:val="20"/>
+        </w:rPr>
+        <w:t>ANEXO E</w:t>
+      </w:r>
+    </w:p>
+    <w:p>
+      <w:pPr>
+        <w:keepNext/>
+        <w:keepLines/>
+        <w:spacing w:before="240" w:after="480"/>
+        <w:jc w:val="center"/>
+      </w:pPr>
+      <w:r>
+        <w:rPr>
+          <w:rFonts w:ascii="Times New Roman" w:hAnsi="Times New Roman"/>
+          <w:b/>
+          <w:sz w:val="20"/>
+        </w:rPr>
+        <w:t>[Arquitectura lógica del prototipo]</w:t>
+      </w:r>
+    </w:p>
+    <w:p>
+      <w:pPr>
+        <w:keepNext/>
+        <w:keepLines/>
+        <w:jc w:val="center"/>
+      </w:pPr>
+      <w:r>
+        <w:drawing>
+          <wp:inline xmlns:a="http://schemas.openxmlformats.org/drawingml/2006/main" xmlns:pic="http://schemas.openxmlformats.org/drawingml/2006/picture">
+            <wp:extent cx="5040000" cy="805177"/>
+            <wp:docPr id="10" name="Picture 10"/>
+            <wp:cNvGraphicFramePr>
+              <a:graphicFrameLocks noChangeAspect="1"/>
+            </wp:cNvGraphicFramePr>
+            <a:graphic>
+              <a:graphicData uri="http://schemas.openxmlformats.org/drawingml/2006/picture">
+                <pic:pic>
+                  <pic:nvPicPr>
+                    <pic:cNvPr id="0" name="06_arquitectura_prototipo.png"/>
+                    <pic:cNvPicPr/>
+                  </pic:nvPicPr>
+                  <pic:blipFill>
+                    <a:blip r:embed="rId18"/>
+                    <a:stretch>
+                      <a:fillRect/>
+                    </a:stretch>
+                  </pic:blipFill>
+                  <pic:spPr>
+                    <a:xfrm>
+                      <a:off x="0" y="0"/>
+                      <a:ext cx="5040000" cy="805177"/>
+                    </a:xfrm>
+                    <a:prstGeom prst="rect"/>
+                  </pic:spPr>
+                </pic:pic>
+              </a:graphicData>
+            </a:graphic>
+          </wp:inline>
+        </w:drawing>
+      </w:r>
+    </w:p>
+    <w:p>
+      <w:pPr>
+        <w:spacing w:line="240" w:lineRule="auto" w:before="0" w:after="240"/>
+        <w:ind w:firstLine="0"/>
+        <w:jc w:val="center"/>
+      </w:pPr>
+      <w:r>
+        <w:rPr>
+          <w:rFonts w:ascii="Times New Roman" w:hAnsi="Times New Roman"/>
+          <w:i/>
+          <w:sz w:val="20"/>
+        </w:rPr>
+        <w:t xml:space="preserve">Fuente: </w:t>
+      </w:r>
+      <w:r>
+        <w:rPr>
+          <w:rFonts w:ascii="Times New Roman" w:hAnsi="Times New Roman"/>
+          <w:sz w:val="20"/>
+        </w:rPr>
+        <w:t>Elaboración propia (2026).</w:t>
+      </w:r>
+    </w:p>
+    <w:p>
+      <w:pPr>
+        <w:sectPr>
+          <w:footerReference w:type="default" r:id="rId45"/>
+          <w:pgSz w:w="12240" w:h="15840"/>
+          <w:pgMar w:top="1701" w:right="1701" w:bottom="1701" w:left="2268" w:header="720" w:footer="720" w:gutter="0"/>
+          <w:cols w:space="720"/>
+          <w:docGrid w:linePitch="360"/>
+          <w:pgNumType w:fmt="decimal"/>
+        </w:sectPr>
+      </w:pPr>
+    </w:p>
+    <w:p>
+      <w:bookmarkStart w:id="34" w:name="bm_anexoF"/>
+      <w:pPr>
+        <w:keepNext/>
+        <w:keepLines/>
+        <w:spacing w:before="0" w:after="480"/>
+        <w:jc w:val="center"/>
+      </w:pPr>
+      <w:bookmarkEnd w:id="34"/>
+      <w:r>
+        <w:rPr>
+          <w:rFonts w:ascii="Times New Roman" w:hAnsi="Times New Roman"/>
+          <w:b/>
+          <w:sz w:val="20"/>
+        </w:rPr>
+        <w:t>ANEXO F</w:t>
+      </w:r>
+    </w:p>
+    <w:p>
+      <w:pPr>
+        <w:keepNext/>
+        <w:keepLines/>
+        <w:spacing w:before="240" w:after="480"/>
+        <w:jc w:val="center"/>
+      </w:pPr>
+      <w:r>
+        <w:rPr>
+          <w:rFonts w:ascii="Times New Roman" w:hAnsi="Times New Roman"/>
+          <w:b/>
+          <w:sz w:val="20"/>
+        </w:rPr>
+        <w:t>[Secuencia de registro y despacho de un expediente]</w:t>
+      </w:r>
+    </w:p>
+    <w:p>
+      <w:pPr>
+        <w:keepNext/>
+        <w:keepLines/>
+        <w:jc w:val="center"/>
+      </w:pPr>
+      <w:r>
+        <w:drawing>
+          <wp:inline xmlns:a="http://schemas.openxmlformats.org/drawingml/2006/main" xmlns:pic="http://schemas.openxmlformats.org/drawingml/2006/picture">
+            <wp:extent cx="5040000" cy="3856847"/>
+            <wp:docPr id="11" name="Picture 11"/>
+            <wp:cNvGraphicFramePr>
+              <a:graphicFrameLocks noChangeAspect="1"/>
+            </wp:cNvGraphicFramePr>
+            <a:graphic>
+              <a:graphicData uri="http://schemas.openxmlformats.org/drawingml/2006/picture">
+                <pic:pic>
+                  <pic:nvPicPr>
+                    <pic:cNvPr id="0" name="07_secuencia_registro_despacho.png"/>
+                    <pic:cNvPicPr/>
+                  </pic:nvPicPr>
+                  <pic:blipFill>
+                    <a:blip r:embed="rId19"/>
+                    <a:stretch>
+                      <a:fillRect/>
+                    </a:stretch>
+                  </pic:blipFill>
+                  <pic:spPr>
+                    <a:xfrm>
+                      <a:off x="0" y="0"/>
+                      <a:ext cx="5040000" cy="3856847"/>
+                    </a:xfrm>
+                    <a:prstGeom prst="rect"/>
+                  </pic:spPr>
+                </pic:pic>
+              </a:graphicData>
+            </a:graphic>
+          </wp:inline>
+        </w:drawing>
+      </w:r>
+    </w:p>
+    <w:p>
+      <w:pPr>
+        <w:spacing w:line="240" w:lineRule="auto" w:before="0" w:after="240"/>
+        <w:ind w:firstLine="0"/>
+        <w:jc w:val="center"/>
+      </w:pPr>
+      <w:r>
+        <w:rPr>
+          <w:rFonts w:ascii="Times New Roman" w:hAnsi="Times New Roman"/>
+          <w:i/>
+          <w:sz w:val="20"/>
+        </w:rPr>
+        <w:t xml:space="preserve">Fuente: </w:t>
+      </w:r>
+      <w:r>
+        <w:rPr>
+          <w:rFonts w:ascii="Times New Roman" w:hAnsi="Times New Roman"/>
+          <w:sz w:val="20"/>
+        </w:rPr>
+        <w:t>Elaboración propia (2026).</w:t>
+      </w:r>
+    </w:p>
+    <w:p>
+      <w:pPr>
+        <w:sectPr>
+          <w:footerReference w:type="default" r:id="rId46"/>
+          <w:pgSz w:w="12240" w:h="15840"/>
+          <w:pgMar w:top="1701" w:right="1701" w:bottom="1701" w:left="2268" w:header="720" w:footer="720" w:gutter="0"/>
+          <w:cols w:space="720"/>
+          <w:docGrid w:linePitch="360"/>
+          <w:pgNumType w:fmt="decimal"/>
+        </w:sectPr>
+      </w:pPr>
+    </w:p>
+    <w:p>
+      <w:bookmarkStart w:id="35" w:name="bm_anexoG"/>
+      <w:pPr>
+        <w:keepNext/>
+        <w:keepLines/>
+        <w:spacing w:before="0" w:after="480"/>
+        <w:jc w:val="center"/>
+      </w:pPr>
+      <w:bookmarkEnd w:id="35"/>
+      <w:r>
+        <w:rPr>
+          <w:rFonts w:ascii="Times New Roman" w:hAnsi="Times New Roman"/>
+          <w:b/>
+          <w:sz w:val="20"/>
+        </w:rPr>
+        <w:t>ANEXO G</w:t>
+      </w:r>
+    </w:p>
+    <w:p>
+      <w:pPr>
+        <w:keepNext/>
+        <w:keepLines/>
+        <w:spacing w:before="240" w:after="480"/>
+        <w:jc w:val="center"/>
+      </w:pPr>
+      <w:r>
+        <w:rPr>
+          <w:rFonts w:ascii="Times New Roman" w:hAnsi="Times New Roman"/>
+          <w:b/>
+          <w:sz w:val="20"/>
+        </w:rPr>
+        <w:t>[Estados del expediente]</w:t>
+      </w:r>
+    </w:p>
+    <w:p>
+      <w:pPr>
+        <w:keepNext/>
+        <w:keepLines/>
+        <w:jc w:val="center"/>
+      </w:pPr>
+      <w:r>
+        <w:drawing>
+          <wp:inline xmlns:a="http://schemas.openxmlformats.org/drawingml/2006/main" xmlns:pic="http://schemas.openxmlformats.org/drawingml/2006/picture">
+            <wp:extent cx="5040000" cy="2401030"/>
+            <wp:docPr id="12" name="Picture 12"/>
+            <wp:cNvGraphicFramePr>
+              <a:graphicFrameLocks noChangeAspect="1"/>
+            </wp:cNvGraphicFramePr>
+            <a:graphic>
+              <a:graphicData uri="http://schemas.openxmlformats.org/drawingml/2006/picture">
+                <pic:pic>
+                  <pic:nvPicPr>
+                    <pic:cNvPr id="0" name="08_estados_expediente.png"/>
+                    <pic:cNvPicPr/>
+                  </pic:nvPicPr>
+                  <pic:blipFill>
+                    <a:blip r:embed="rId20"/>
+                    <a:stretch>
+                      <a:fillRect/>
+                    </a:stretch>
+                  </pic:blipFill>
+                  <pic:spPr>
+                    <a:xfrm>
+                      <a:off x="0" y="0"/>
+                      <a:ext cx="5040000" cy="2401030"/>
+                    </a:xfrm>
+                    <a:prstGeom prst="rect"/>
+                  </pic:spPr>
+                </pic:pic>
+              </a:graphicData>
+            </a:graphic>
+          </wp:inline>
+        </w:drawing>
+      </w:r>
+    </w:p>
+    <w:p>
+      <w:pPr>
+        <w:spacing w:line="240" w:lineRule="auto" w:before="0" w:after="240"/>
+        <w:ind w:firstLine="0"/>
+        <w:jc w:val="center"/>
+      </w:pPr>
+      <w:r>
+        <w:rPr>
+          <w:rFonts w:ascii="Times New Roman" w:hAnsi="Times New Roman"/>
+          <w:i/>
+          <w:sz w:val="20"/>
+        </w:rPr>
+        <w:t xml:space="preserve">Fuente: </w:t>
+      </w:r>
+      <w:r>
+        <w:rPr>
+          <w:rFonts w:ascii="Times New Roman" w:hAnsi="Times New Roman"/>
+          <w:sz w:val="20"/>
+        </w:rPr>
+        <w:t>Elaboración propia (2026).</w:t>
+      </w:r>
+    </w:p>
+    <w:p>
+      <w:pPr>
+        <w:sectPr>
+          <w:footerReference w:type="default" r:id="rId47"/>
+          <w:pgSz w:w="12240" w:h="15840"/>
+          <w:pgMar w:top="1701" w:right="1701" w:bottom="1701" w:left="2268" w:header="720" w:footer="720" w:gutter="0"/>
+          <w:cols w:space="720"/>
+          <w:docGrid w:linePitch="360"/>
+          <w:pgNumType w:fmt="decimal"/>
+        </w:sectPr>
+      </w:pPr>
+    </w:p>
+    <w:p>
+      <w:bookmarkStart w:id="36" w:name="bm_anexoH"/>
+      <w:pPr>
+        <w:keepNext/>
+        <w:keepLines/>
+        <w:spacing w:before="0" w:after="480"/>
+        <w:jc w:val="center"/>
+      </w:pPr>
+      <w:bookmarkEnd w:id="36"/>
+      <w:r>
+        <w:rPr>
+          <w:rFonts w:ascii="Times New Roman" w:hAnsi="Times New Roman"/>
+          <w:b/>
+          <w:sz w:val="20"/>
+        </w:rPr>
+        <w:t>ANEXO H</w:t>
+      </w:r>
+    </w:p>
+    <w:p>
+      <w:pPr>
+        <w:keepNext/>
+        <w:keepLines/>
+        <w:spacing w:before="240" w:after="480"/>
+        <w:jc w:val="center"/>
+      </w:pPr>
+      <w:r>
+        <w:rPr>
+          <w:rFonts w:ascii="Times New Roman" w:hAnsi="Times New Roman"/>
+          <w:b/>
+          <w:sz w:val="20"/>
+        </w:rPr>
+        <w:t>[Mapa de módulos de la interfaz]</w:t>
+      </w:r>
+    </w:p>
+    <w:p>
+      <w:pPr>
+        <w:keepNext/>
+        <w:keepLines/>
+        <w:jc w:val="center"/>
+      </w:pPr>
+      <w:r>
+        <w:drawing>
+          <wp:inline xmlns:a="http://schemas.openxmlformats.org/drawingml/2006/main" xmlns:pic="http://schemas.openxmlformats.org/drawingml/2006/picture">
+            <wp:extent cx="2027283" cy="5400000"/>
+            <wp:docPr id="13" name="Picture 13"/>
+            <wp:cNvGraphicFramePr>
+              <a:graphicFrameLocks noChangeAspect="1"/>
+            </wp:cNvGraphicFramePr>
+            <a:graphic>
+              <a:graphicData uri="http://schemas.openxmlformats.org/drawingml/2006/picture">
+                <pic:pic>
+                  <pic:nvPicPr>
+                    <pic:cNvPr id="0" name="11_mapa_modulos_interfaz.png"/>
+                    <pic:cNvPicPr/>
+                  </pic:nvPicPr>
+                  <pic:blipFill>
+                    <a:blip r:embed="rId21"/>
+                    <a:stretch>
+                      <a:fillRect/>
+                    </a:stretch>
+                  </pic:blipFill>
+                  <pic:spPr>
+                    <a:xfrm>
+                      <a:off x="0" y="0"/>
+                      <a:ext cx="2027283" cy="5400000"/>
+                    </a:xfrm>
+                    <a:prstGeom prst="rect"/>
+                  </pic:spPr>
+                </pic:pic>
+              </a:graphicData>
+            </a:graphic>
+          </wp:inline>
+        </w:drawing>
+      </w:r>
+    </w:p>
+    <w:p>
+      <w:pPr>
+        <w:spacing w:line="240" w:lineRule="auto" w:before="0" w:after="240"/>
+        <w:ind w:firstLine="0"/>
+        <w:jc w:val="center"/>
+      </w:pPr>
+      <w:r>
+        <w:rPr>
+          <w:rFonts w:ascii="Times New Roman" w:hAnsi="Times New Roman"/>
+          <w:i/>
+          <w:sz w:val="20"/>
+        </w:rPr>
+        <w:t xml:space="preserve">Fuente: </w:t>
+      </w:r>
+      <w:r>
+        <w:rPr>
+          <w:rFonts w:ascii="Times New Roman" w:hAnsi="Times New Roman"/>
+          <w:sz w:val="20"/>
+        </w:rPr>
+        <w:t>Elaboración propia (2026).</w:t>
+      </w:r>
+    </w:p>
+    <w:p>
+      <w:pPr>
+        <w:sectPr>
+          <w:footerReference w:type="default" r:id="rId48"/>
+          <w:pgSz w:w="12240" w:h="15840"/>
+          <w:pgMar w:top="1701" w:right="1701" w:bottom="1701" w:left="2268" w:header="720" w:footer="720" w:gutter="0"/>
+          <w:cols w:space="720"/>
+          <w:docGrid w:linePitch="360"/>
+          <w:pgNumType w:fmt="decimal"/>
+        </w:sectPr>
+      </w:pPr>
+    </w:p>
+    <w:p>
+      <w:bookmarkStart w:id="37" w:name="bm_anexoI"/>
+      <w:pPr>
+        <w:keepNext/>
+        <w:keepLines/>
+        <w:spacing w:before="0" w:after="480"/>
+        <w:jc w:val="center"/>
+      </w:pPr>
+      <w:bookmarkEnd w:id="37"/>
+      <w:r>
+        <w:rPr>
+          <w:rFonts w:ascii="Times New Roman" w:hAnsi="Times New Roman"/>
+          <w:b/>
+          <w:sz w:val="20"/>
+        </w:rPr>
+        <w:t>ANEXO I</w:t>
+      </w:r>
+    </w:p>
+    <w:p>
+      <w:pPr>
+        <w:keepNext/>
+        <w:keepLines/>
+        <w:spacing w:before="240" w:after="480"/>
+        <w:jc w:val="center"/>
+      </w:pPr>
+      <w:r>
+        <w:rPr>
+          <w:rFonts w:ascii="Times New Roman" w:hAnsi="Times New Roman"/>
+          <w:b/>
+          <w:sz w:val="20"/>
+        </w:rPr>
+        <w:t>[Proceso de respaldo periódico de SQLite]</w:t>
+      </w:r>
+    </w:p>
+    <w:p>
+      <w:pPr>
+        <w:keepNext/>
+        <w:keepLines/>
+        <w:jc w:val="center"/>
+      </w:pPr>
+      <w:r>
+        <w:drawing>
+          <wp:inline xmlns:a="http://schemas.openxmlformats.org/drawingml/2006/main" xmlns:pic="http://schemas.openxmlformats.org/drawingml/2006/picture">
+            <wp:extent cx="2883349" cy="5400000"/>
+            <wp:docPr id="14" name="Picture 14"/>
+            <wp:cNvGraphicFramePr>
+              <a:graphicFrameLocks noChangeAspect="1"/>
+            </wp:cNvGraphicFramePr>
+            <a:graphic>
+              <a:graphicData uri="http://schemas.openxmlformats.org/drawingml/2006/picture">
+                <pic:pic>
+                  <pic:nvPicPr>
+                    <pic:cNvPr id="0" name="12_proceso_respaldo_sqlite.png"/>
+                    <pic:cNvPicPr/>
+                  </pic:nvPicPr>
+                  <pic:blipFill>
+                    <a:blip r:embed="rId22"/>
+                    <a:stretch>
+                      <a:fillRect/>
+                    </a:stretch>
+                  </pic:blipFill>
+                  <pic:spPr>
+                    <a:xfrm>
+                      <a:off x="0" y="0"/>
+                      <a:ext cx="2883349" cy="5400000"/>
+                    </a:xfrm>
+                    <a:prstGeom prst="rect"/>
+                  </pic:spPr>
+                </pic:pic>
+              </a:graphicData>
+            </a:graphic>
+          </wp:inline>
+        </w:drawing>
+      </w:r>
+    </w:p>
+    <w:p>
+      <w:pPr>
+        <w:spacing w:line="240" w:lineRule="auto" w:before="0" w:after="240"/>
+        <w:ind w:firstLine="0"/>
+        <w:jc w:val="center"/>
+      </w:pPr>
+      <w:r>
+        <w:rPr>
+          <w:rFonts w:ascii="Times New Roman" w:hAnsi="Times New Roman"/>
+          <w:i/>
+          <w:sz w:val="20"/>
+        </w:rPr>
+        <w:t xml:space="preserve">Fuente: </w:t>
+      </w:r>
+      <w:r>
+        <w:rPr>
+          <w:rFonts w:ascii="Times New Roman" w:hAnsi="Times New Roman"/>
+          <w:sz w:val="20"/>
+        </w:rPr>
+        <w:t>Elaboración propia (2026).</w:t>
+      </w:r>
+    </w:p>
     <w:sectPr>
-      <w:footerReference w:type="default" r:id="rId39"/>
+      <w:footerReference w:type="default" r:id="rId49"/>
       <w:pgSz w:w="12240" w:h="15840"/>
       <w:pgMar w:top="1701" w:right="1701" w:bottom="1701" w:left="2268" w:header="720" w:footer="720" w:gutter="0"/>
       <w:cols w:space="720"/>
-      <w:titlePg/>
       <w:docGrid w:linePitch="360"/>
+      <w:pgNumType w:fmt="decimal"/>
     </w:sectPr>
   </w:body>
 </w:document>
@@ -3876,11 +5413,7 @@
 
 <file path=word/footer1.xml><?xml version="1.0" encoding="utf-8"?>
 <w:ftr xmlns:m="http://schemas.openxmlformats.org/officeDocument/2006/math" xmlns:mc="http://schemas.openxmlformats.org/markup-compatibility/2006" xmlns:mo="http://schemas.microsoft.com/office/mac/office/2008/main" xmlns:mv="urn:schemas-microsoft-com:mac:vml" xmlns:o="urn:schemas-microsoft-com:office:office" xmlns:r="http://schemas.openxmlformats.org/officeDocument/2006/relationships" xmlns:v="urn:schemas-microsoft-com:vml" xmlns:w10="urn:schemas-microsoft-com:office:word" xmlns:w14="http://schemas.microsoft.com/office/word/2010/wordml" xmlns:w="http://schemas.openxmlformats.org/wordprocessingml/2006/main" xmlns:wne="http://schemas.microsoft.com/office/word/2006/wordml" xmlns:wp14="http://schemas.microsoft.com/office/word/2010/wordprocessingDrawing" xmlns:wp="http://schemas.openxmlformats.org/drawingml/2006/wordprocessingDrawing" xmlns:wpc="http://schemas.microsoft.com/office/word/2010/wordprocessingCanvas" xmlns:wpg="http://schemas.microsoft.com/office/word/2010/wordprocessingGroup" xmlns:wpi="http://schemas.microsoft.com/office/word/2010/wordprocessingInk" xmlns:wps="http://schemas.microsoft.com/office/word/2010/wordprocessingShape" mc:Ignorable="w14 wp14">
-  <w:p>
-    <w:pPr>
-      <w:pStyle w:val="Footer"/>
-    </w:pPr>
-  </w:p>
+  <w:p/>
 </w:ftr>
 </file>
 
@@ -3888,8 +5421,18 @@
 <w:ftr xmlns:m="http://schemas.openxmlformats.org/officeDocument/2006/math" xmlns:mc="http://schemas.openxmlformats.org/markup-compatibility/2006" xmlns:mo="http://schemas.microsoft.com/office/mac/office/2008/main" xmlns:mv="urn:schemas-microsoft-com:mac:vml" xmlns:o="urn:schemas-microsoft-com:office:office" xmlns:r="http://schemas.openxmlformats.org/officeDocument/2006/relationships" xmlns:v="urn:schemas-microsoft-com:vml" xmlns:w10="urn:schemas-microsoft-com:office:word" xmlns:w14="http://schemas.microsoft.com/office/word/2010/wordml" xmlns:w="http://schemas.openxmlformats.org/wordprocessingml/2006/main" xmlns:wne="http://schemas.microsoft.com/office/word/2006/wordml" xmlns:wp14="http://schemas.microsoft.com/office/word/2010/wordprocessingDrawing" xmlns:wp="http://schemas.openxmlformats.org/drawingml/2006/wordprocessingDrawing" xmlns:wpc="http://schemas.microsoft.com/office/word/2010/wordprocessingCanvas" xmlns:wpg="http://schemas.microsoft.com/office/word/2010/wordprocessingGroup" xmlns:wpi="http://schemas.microsoft.com/office/word/2010/wordprocessingInk" xmlns:wps="http://schemas.microsoft.com/office/word/2010/wordprocessingShape" mc:Ignorable="w14 wp14">
   <w:p>
     <w:pPr>
-      <w:pStyle w:val="Footer"/>
+      <w:jc w:val="center"/>
     </w:pPr>
+    <w:r>
+      <w:rPr>
+        <w:rFonts w:ascii="Times New Roman" w:hAnsi="Times New Roman"/>
+        <w:sz w:val="24"/>
+      </w:rPr>
+      <w:fldChar w:fldCharType="begin"/>
+      <w:instrText xml:space="preserve"> PAGE </w:instrText>
+      <w:fldChar w:fldCharType="separate"/>
+      <w:fldChar w:fldCharType="end"/>
+    </w:r>
   </w:p>
 </w:ftr>
 </file>
@@ -3898,7 +5441,6 @@
 <w:ftr xmlns:m="http://schemas.openxmlformats.org/officeDocument/2006/math" xmlns:mc="http://schemas.openxmlformats.org/markup-compatibility/2006" xmlns:mo="http://schemas.microsoft.com/office/mac/office/2008/main" xmlns:mv="urn:schemas-microsoft-com:mac:vml" xmlns:o="urn:schemas-microsoft-com:office:office" xmlns:r="http://schemas.openxmlformats.org/officeDocument/2006/relationships" xmlns:v="urn:schemas-microsoft-com:vml" xmlns:w10="urn:schemas-microsoft-com:office:word" xmlns:w14="http://schemas.microsoft.com/office/word/2010/wordml" xmlns:w="http://schemas.openxmlformats.org/wordprocessingml/2006/main" xmlns:wne="http://schemas.microsoft.com/office/word/2006/wordml" xmlns:wp14="http://schemas.microsoft.com/office/word/2010/wordprocessingDrawing" xmlns:wp="http://schemas.openxmlformats.org/drawingml/2006/wordprocessingDrawing" xmlns:wpc="http://schemas.microsoft.com/office/word/2010/wordprocessingCanvas" xmlns:wpg="http://schemas.microsoft.com/office/word/2010/wordprocessingGroup" xmlns:wpi="http://schemas.microsoft.com/office/word/2010/wordprocessingInk" xmlns:wps="http://schemas.microsoft.com/office/word/2010/wordprocessingShape" mc:Ignorable="w14 wp14">
   <w:p>
     <w:pPr>
-      <w:pStyle w:val="Footer"/>
       <w:jc w:val="center"/>
     </w:pPr>
     <w:r>
@@ -3907,7 +5449,7 @@
         <w:sz w:val="24"/>
       </w:rPr>
       <w:fldChar w:fldCharType="begin"/>
-      <w:instrText xml:space="preserve"> PAGE \* roman </w:instrText>
+      <w:instrText xml:space="preserve"> PAGE </w:instrText>
       <w:fldChar w:fldCharType="separate"/>
       <w:fldChar w:fldCharType="end"/>
     </w:r>
@@ -3919,7 +5461,6 @@
 <w:ftr xmlns:m="http://schemas.openxmlformats.org/officeDocument/2006/math" xmlns:mc="http://schemas.openxmlformats.org/markup-compatibility/2006" xmlns:mo="http://schemas.microsoft.com/office/mac/office/2008/main" xmlns:mv="urn:schemas-microsoft-com:mac:vml" xmlns:o="urn:schemas-microsoft-com:office:office" xmlns:r="http://schemas.openxmlformats.org/officeDocument/2006/relationships" xmlns:v="urn:schemas-microsoft-com:vml" xmlns:w10="urn:schemas-microsoft-com:office:word" xmlns:w14="http://schemas.microsoft.com/office/word/2010/wordml" xmlns:w="http://schemas.openxmlformats.org/wordprocessingml/2006/main" xmlns:wne="http://schemas.microsoft.com/office/word/2006/wordml" xmlns:wp14="http://schemas.microsoft.com/office/word/2010/wordprocessingDrawing" xmlns:wp="http://schemas.openxmlformats.org/drawingml/2006/wordprocessingDrawing" xmlns:wpc="http://schemas.microsoft.com/office/word/2010/wordprocessingCanvas" xmlns:wpg="http://schemas.microsoft.com/office/word/2010/wordprocessingGroup" xmlns:wpi="http://schemas.microsoft.com/office/word/2010/wordprocessingInk" xmlns:wps="http://schemas.microsoft.com/office/word/2010/wordprocessingShape" mc:Ignorable="w14 wp14">
   <w:p>
     <w:pPr>
-      <w:pStyle w:val="Footer"/>
       <w:jc w:val="center"/>
     </w:pPr>
     <w:r>
@@ -3928,7 +5469,7 @@
         <w:sz w:val="24"/>
       </w:rPr>
       <w:fldChar w:fldCharType="begin"/>
-      <w:instrText xml:space="preserve"> PAGE \* roman </w:instrText>
+      <w:instrText xml:space="preserve"> PAGE </w:instrText>
       <w:fldChar w:fldCharType="separate"/>
       <w:fldChar w:fldCharType="end"/>
     </w:r>
@@ -3938,22 +5479,7 @@
 
 <file path=word/footer13.xml><?xml version="1.0" encoding="utf-8"?>
 <w:ftr xmlns:m="http://schemas.openxmlformats.org/officeDocument/2006/math" xmlns:mc="http://schemas.openxmlformats.org/markup-compatibility/2006" xmlns:mo="http://schemas.microsoft.com/office/mac/office/2008/main" xmlns:mv="urn:schemas-microsoft-com:mac:vml" xmlns:o="urn:schemas-microsoft-com:office:office" xmlns:r="http://schemas.openxmlformats.org/officeDocument/2006/relationships" xmlns:v="urn:schemas-microsoft-com:vml" xmlns:w10="urn:schemas-microsoft-com:office:word" xmlns:w14="http://schemas.microsoft.com/office/word/2010/wordml" xmlns:w="http://schemas.openxmlformats.org/wordprocessingml/2006/main" xmlns:wne="http://schemas.microsoft.com/office/word/2006/wordml" xmlns:wp14="http://schemas.microsoft.com/office/word/2010/wordprocessingDrawing" xmlns:wp="http://schemas.openxmlformats.org/drawingml/2006/wordprocessingDrawing" xmlns:wpc="http://schemas.microsoft.com/office/word/2010/wordprocessingCanvas" xmlns:wpg="http://schemas.microsoft.com/office/word/2010/wordprocessingGroup" xmlns:wpi="http://schemas.microsoft.com/office/word/2010/wordprocessingInk" xmlns:wps="http://schemas.microsoft.com/office/word/2010/wordprocessingShape" mc:Ignorable="w14 wp14">
-  <w:p>
-    <w:pPr>
-      <w:pStyle w:val="Footer"/>
-      <w:jc w:val="center"/>
-    </w:pPr>
-    <w:r>
-      <w:rPr>
-        <w:rFonts w:ascii="Times New Roman" w:hAnsi="Times New Roman"/>
-        <w:sz w:val="24"/>
-      </w:rPr>
-      <w:fldChar w:fldCharType="begin"/>
-      <w:instrText xml:space="preserve"> PAGE \* roman </w:instrText>
-      <w:fldChar w:fldCharType="separate"/>
-      <w:fldChar w:fldCharType="end"/>
-    </w:r>
-  </w:p>
+  <w:p/>
 </w:ftr>
 </file>
 
@@ -3961,7 +5487,6 @@
 <w:ftr xmlns:m="http://schemas.openxmlformats.org/officeDocument/2006/math" xmlns:mc="http://schemas.openxmlformats.org/markup-compatibility/2006" xmlns:mo="http://schemas.microsoft.com/office/mac/office/2008/main" xmlns:mv="urn:schemas-microsoft-com:mac:vml" xmlns:o="urn:schemas-microsoft-com:office:office" xmlns:r="http://schemas.openxmlformats.org/officeDocument/2006/relationships" xmlns:v="urn:schemas-microsoft-com:vml" xmlns:w10="urn:schemas-microsoft-com:office:word" xmlns:w14="http://schemas.microsoft.com/office/word/2010/wordml" xmlns:w="http://schemas.openxmlformats.org/wordprocessingml/2006/main" xmlns:wne="http://schemas.microsoft.com/office/word/2006/wordml" xmlns:wp14="http://schemas.microsoft.com/office/word/2010/wordprocessingDrawing" xmlns:wp="http://schemas.openxmlformats.org/drawingml/2006/wordprocessingDrawing" xmlns:wpc="http://schemas.microsoft.com/office/word/2010/wordprocessingCanvas" xmlns:wpg="http://schemas.microsoft.com/office/word/2010/wordprocessingGroup" xmlns:wpi="http://schemas.microsoft.com/office/word/2010/wordprocessingInk" xmlns:wps="http://schemas.microsoft.com/office/word/2010/wordprocessingShape" mc:Ignorable="w14 wp14">
   <w:p>
     <w:pPr>
-      <w:pStyle w:val="Footer"/>
       <w:jc w:val="center"/>
     </w:pPr>
     <w:r>
@@ -3970,7 +5495,7 @@
         <w:sz w:val="24"/>
       </w:rPr>
       <w:fldChar w:fldCharType="begin"/>
-      <w:instrText xml:space="preserve"> PAGE \* roman </w:instrText>
+      <w:instrText xml:space="preserve"> PAGE </w:instrText>
       <w:fldChar w:fldCharType="separate"/>
       <w:fldChar w:fldCharType="end"/>
     </w:r>
@@ -3980,22 +5505,7 @@
 
 <file path=word/footer15.xml><?xml version="1.0" encoding="utf-8"?>
 <w:ftr xmlns:m="http://schemas.openxmlformats.org/officeDocument/2006/math" xmlns:mc="http://schemas.openxmlformats.org/markup-compatibility/2006" xmlns:mo="http://schemas.microsoft.com/office/mac/office/2008/main" xmlns:mv="urn:schemas-microsoft-com:mac:vml" xmlns:o="urn:schemas-microsoft-com:office:office" xmlns:r="http://schemas.openxmlformats.org/officeDocument/2006/relationships" xmlns:v="urn:schemas-microsoft-com:vml" xmlns:w10="urn:schemas-microsoft-com:office:word" xmlns:w14="http://schemas.microsoft.com/office/word/2010/wordml" xmlns:w="http://schemas.openxmlformats.org/wordprocessingml/2006/main" xmlns:wne="http://schemas.microsoft.com/office/word/2006/wordml" xmlns:wp14="http://schemas.microsoft.com/office/word/2010/wordprocessingDrawing" xmlns:wp="http://schemas.openxmlformats.org/drawingml/2006/wordprocessingDrawing" xmlns:wpc="http://schemas.microsoft.com/office/word/2010/wordprocessingCanvas" xmlns:wpg="http://schemas.microsoft.com/office/word/2010/wordprocessingGroup" xmlns:wpi="http://schemas.microsoft.com/office/word/2010/wordprocessingInk" xmlns:wps="http://schemas.microsoft.com/office/word/2010/wordprocessingShape" mc:Ignorable="w14 wp14">
-  <w:p>
-    <w:pPr>
-      <w:pStyle w:val="Footer"/>
-      <w:jc w:val="center"/>
-    </w:pPr>
-    <w:r>
-      <w:rPr>
-        <w:rFonts w:ascii="Times New Roman" w:hAnsi="Times New Roman"/>
-        <w:sz w:val="24"/>
-      </w:rPr>
-      <w:fldChar w:fldCharType="begin"/>
-      <w:instrText xml:space="preserve"> PAGE \* roman </w:instrText>
-      <w:fldChar w:fldCharType="separate"/>
-      <w:fldChar w:fldCharType="end"/>
-    </w:r>
-  </w:p>
+  <w:p/>
 </w:ftr>
 </file>
 
@@ -4003,7 +5513,6 @@
 <w:ftr xmlns:m="http://schemas.openxmlformats.org/officeDocument/2006/math" xmlns:mc="http://schemas.openxmlformats.org/markup-compatibility/2006" xmlns:mo="http://schemas.microsoft.com/office/mac/office/2008/main" xmlns:mv="urn:schemas-microsoft-com:mac:vml" xmlns:o="urn:schemas-microsoft-com:office:office" xmlns:r="http://schemas.openxmlformats.org/officeDocument/2006/relationships" xmlns:v="urn:schemas-microsoft-com:vml" xmlns:w10="urn:schemas-microsoft-com:office:word" xmlns:w14="http://schemas.microsoft.com/office/word/2010/wordml" xmlns:w="http://schemas.openxmlformats.org/wordprocessingml/2006/main" xmlns:wne="http://schemas.microsoft.com/office/word/2006/wordml" xmlns:wp14="http://schemas.microsoft.com/office/word/2010/wordprocessingDrawing" xmlns:wp="http://schemas.openxmlformats.org/drawingml/2006/wordprocessingDrawing" xmlns:wpc="http://schemas.microsoft.com/office/word/2010/wordprocessingCanvas" xmlns:wpg="http://schemas.microsoft.com/office/word/2010/wordprocessingGroup" xmlns:wpi="http://schemas.microsoft.com/office/word/2010/wordprocessingInk" xmlns:wps="http://schemas.microsoft.com/office/word/2010/wordprocessingShape" mc:Ignorable="w14 wp14">
   <w:p>
     <w:pPr>
-      <w:pStyle w:val="Footer"/>
       <w:jc w:val="center"/>
     </w:pPr>
     <w:r>
@@ -4012,7 +5521,7 @@
         <w:sz w:val="24"/>
       </w:rPr>
       <w:fldChar w:fldCharType="begin"/>
-      <w:instrText xml:space="preserve"> PAGE \* roman </w:instrText>
+      <w:instrText xml:space="preserve"> PAGE </w:instrText>
       <w:fldChar w:fldCharType="separate"/>
       <w:fldChar w:fldCharType="end"/>
     </w:r>
@@ -4022,22 +5531,7 @@
 
 <file path=word/footer17.xml><?xml version="1.0" encoding="utf-8"?>
 <w:ftr xmlns:m="http://schemas.openxmlformats.org/officeDocument/2006/math" xmlns:mc="http://schemas.openxmlformats.org/markup-compatibility/2006" xmlns:mo="http://schemas.microsoft.com/office/mac/office/2008/main" xmlns:mv="urn:schemas-microsoft-com:mac:vml" xmlns:o="urn:schemas-microsoft-com:office:office" xmlns:r="http://schemas.openxmlformats.org/officeDocument/2006/relationships" xmlns:v="urn:schemas-microsoft-com:vml" xmlns:w10="urn:schemas-microsoft-com:office:word" xmlns:w14="http://schemas.microsoft.com/office/word/2010/wordml" xmlns:w="http://schemas.openxmlformats.org/wordprocessingml/2006/main" xmlns:wne="http://schemas.microsoft.com/office/word/2006/wordml" xmlns:wp14="http://schemas.microsoft.com/office/word/2010/wordprocessingDrawing" xmlns:wp="http://schemas.openxmlformats.org/drawingml/2006/wordprocessingDrawing" xmlns:wpc="http://schemas.microsoft.com/office/word/2010/wordprocessingCanvas" xmlns:wpg="http://schemas.microsoft.com/office/word/2010/wordprocessingGroup" xmlns:wpi="http://schemas.microsoft.com/office/word/2010/wordprocessingInk" xmlns:wps="http://schemas.microsoft.com/office/word/2010/wordprocessingShape" mc:Ignorable="w14 wp14">
-  <w:p>
-    <w:pPr>
-      <w:pStyle w:val="Footer"/>
-      <w:jc w:val="center"/>
-    </w:pPr>
-    <w:r>
-      <w:rPr>
-        <w:rFonts w:ascii="Times New Roman" w:hAnsi="Times New Roman"/>
-        <w:sz w:val="24"/>
-      </w:rPr>
-      <w:fldChar w:fldCharType="begin"/>
-      <w:instrText xml:space="preserve"> PAGE \* roman </w:instrText>
-      <w:fldChar w:fldCharType="separate"/>
-      <w:fldChar w:fldCharType="end"/>
-    </w:r>
-  </w:p>
+  <w:p/>
 </w:ftr>
 </file>
 
@@ -4045,7 +5539,6 @@
 <w:ftr xmlns:m="http://schemas.openxmlformats.org/officeDocument/2006/math" xmlns:mc="http://schemas.openxmlformats.org/markup-compatibility/2006" xmlns:mo="http://schemas.microsoft.com/office/mac/office/2008/main" xmlns:mv="urn:schemas-microsoft-com:mac:vml" xmlns:o="urn:schemas-microsoft-com:office:office" xmlns:r="http://schemas.openxmlformats.org/officeDocument/2006/relationships" xmlns:v="urn:schemas-microsoft-com:vml" xmlns:w10="urn:schemas-microsoft-com:office:word" xmlns:w14="http://schemas.microsoft.com/office/word/2010/wordml" xmlns:w="http://schemas.openxmlformats.org/wordprocessingml/2006/main" xmlns:wne="http://schemas.microsoft.com/office/word/2006/wordml" xmlns:wp14="http://schemas.microsoft.com/office/word/2010/wordprocessingDrawing" xmlns:wp="http://schemas.openxmlformats.org/drawingml/2006/wordprocessingDrawing" xmlns:wpc="http://schemas.microsoft.com/office/word/2010/wordprocessingCanvas" xmlns:wpg="http://schemas.microsoft.com/office/word/2010/wordprocessingGroup" xmlns:wpi="http://schemas.microsoft.com/office/word/2010/wordprocessingInk" xmlns:wps="http://schemas.microsoft.com/office/word/2010/wordprocessingShape" mc:Ignorable="w14 wp14">
   <w:p>
     <w:pPr>
-      <w:pStyle w:val="Footer"/>
       <w:jc w:val="center"/>
     </w:pPr>
     <w:r>
@@ -4054,7 +5547,7 @@
         <w:sz w:val="24"/>
       </w:rPr>
       <w:fldChar w:fldCharType="begin"/>
-      <w:instrText xml:space="preserve"> PAGE \* roman </w:instrText>
+      <w:instrText xml:space="preserve"> PAGE </w:instrText>
       <w:fldChar w:fldCharType="separate"/>
       <w:fldChar w:fldCharType="end"/>
     </w:r>
@@ -4066,7 +5559,6 @@
 <w:ftr xmlns:m="http://schemas.openxmlformats.org/officeDocument/2006/math" xmlns:mc="http://schemas.openxmlformats.org/markup-compatibility/2006" xmlns:mo="http://schemas.microsoft.com/office/mac/office/2008/main" xmlns:mv="urn:schemas-microsoft-com:mac:vml" xmlns:o="urn:schemas-microsoft-com:office:office" xmlns:r="http://schemas.openxmlformats.org/officeDocument/2006/relationships" xmlns:v="urn:schemas-microsoft-com:vml" xmlns:w10="urn:schemas-microsoft-com:office:word" xmlns:w14="http://schemas.microsoft.com/office/word/2010/wordml" xmlns:w="http://schemas.openxmlformats.org/wordprocessingml/2006/main" xmlns:wne="http://schemas.microsoft.com/office/word/2006/wordml" xmlns:wp14="http://schemas.microsoft.com/office/word/2010/wordprocessingDrawing" xmlns:wp="http://schemas.openxmlformats.org/drawingml/2006/wordprocessingDrawing" xmlns:wpc="http://schemas.microsoft.com/office/word/2010/wordprocessingCanvas" xmlns:wpg="http://schemas.microsoft.com/office/word/2010/wordprocessingGroup" xmlns:wpi="http://schemas.microsoft.com/office/word/2010/wordprocessingInk" xmlns:wps="http://schemas.microsoft.com/office/word/2010/wordprocessingShape" mc:Ignorable="w14 wp14">
   <w:p>
     <w:pPr>
-      <w:pStyle w:val="Footer"/>
       <w:jc w:val="center"/>
     </w:pPr>
     <w:r>
@@ -4075,7 +5567,7 @@
         <w:sz w:val="24"/>
       </w:rPr>
       <w:fldChar w:fldCharType="begin"/>
-      <w:instrText xml:space="preserve"> PAGE \* roman </w:instrText>
+      <w:instrText xml:space="preserve"> PAGE </w:instrText>
       <w:fldChar w:fldCharType="separate"/>
       <w:fldChar w:fldCharType="end"/>
     </w:r>
@@ -4087,8 +5579,18 @@
 <w:ftr xmlns:m="http://schemas.openxmlformats.org/officeDocument/2006/math" xmlns:mc="http://schemas.openxmlformats.org/markup-compatibility/2006" xmlns:mo="http://schemas.microsoft.com/office/mac/office/2008/main" xmlns:mv="urn:schemas-microsoft-com:mac:vml" xmlns:o="urn:schemas-microsoft-com:office:office" xmlns:r="http://schemas.openxmlformats.org/officeDocument/2006/relationships" xmlns:v="urn:schemas-microsoft-com:vml" xmlns:w10="urn:schemas-microsoft-com:office:word" xmlns:w14="http://schemas.microsoft.com/office/word/2010/wordml" xmlns:w="http://schemas.openxmlformats.org/wordprocessingml/2006/main" xmlns:wne="http://schemas.microsoft.com/office/word/2006/wordml" xmlns:wp14="http://schemas.microsoft.com/office/word/2010/wordprocessingDrawing" xmlns:wp="http://schemas.openxmlformats.org/drawingml/2006/wordprocessingDrawing" xmlns:wpc="http://schemas.microsoft.com/office/word/2010/wordprocessingCanvas" xmlns:wpg="http://schemas.microsoft.com/office/word/2010/wordprocessingGroup" xmlns:wpi="http://schemas.microsoft.com/office/word/2010/wordprocessingInk" xmlns:wps="http://schemas.microsoft.com/office/word/2010/wordprocessingShape" mc:Ignorable="w14 wp14">
   <w:p>
     <w:pPr>
-      <w:pStyle w:val="Footer"/>
+      <w:jc w:val="center"/>
     </w:pPr>
+    <w:r>
+      <w:rPr>
+        <w:rFonts w:ascii="Times New Roman" w:hAnsi="Times New Roman"/>
+        <w:sz w:val="24"/>
+      </w:rPr>
+      <w:fldChar w:fldCharType="begin"/>
+      <w:instrText xml:space="preserve"> PAGE </w:instrText>
+      <w:fldChar w:fldCharType="separate"/>
+      <w:fldChar w:fldCharType="end"/>
+    </w:r>
   </w:p>
 </w:ftr>
 </file>
@@ -4097,7 +5599,6 @@
 <w:ftr xmlns:m="http://schemas.openxmlformats.org/officeDocument/2006/math" xmlns:mc="http://schemas.openxmlformats.org/markup-compatibility/2006" xmlns:mo="http://schemas.microsoft.com/office/mac/office/2008/main" xmlns:mv="urn:schemas-microsoft-com:mac:vml" xmlns:o="urn:schemas-microsoft-com:office:office" xmlns:r="http://schemas.openxmlformats.org/officeDocument/2006/relationships" xmlns:v="urn:schemas-microsoft-com:vml" xmlns:w10="urn:schemas-microsoft-com:office:word" xmlns:w14="http://schemas.microsoft.com/office/word/2010/wordml" xmlns:w="http://schemas.openxmlformats.org/wordprocessingml/2006/main" xmlns:wne="http://schemas.microsoft.com/office/word/2006/wordml" xmlns:wp14="http://schemas.microsoft.com/office/word/2010/wordprocessingDrawing" xmlns:wp="http://schemas.openxmlformats.org/drawingml/2006/wordprocessingDrawing" xmlns:wpc="http://schemas.microsoft.com/office/word/2010/wordprocessingCanvas" xmlns:wpg="http://schemas.microsoft.com/office/word/2010/wordprocessingGroup" xmlns:wpi="http://schemas.microsoft.com/office/word/2010/wordprocessingInk" xmlns:wps="http://schemas.microsoft.com/office/word/2010/wordprocessingShape" mc:Ignorable="w14 wp14">
   <w:p>
     <w:pPr>
-      <w:pStyle w:val="Footer"/>
       <w:jc w:val="center"/>
     </w:pPr>
     <w:r>
@@ -4106,7 +5607,7 @@
         <w:sz w:val="24"/>
       </w:rPr>
       <w:fldChar w:fldCharType="begin"/>
-      <w:instrText xml:space="preserve"> PAGE \* roman </w:instrText>
+      <w:instrText xml:space="preserve"> PAGE </w:instrText>
       <w:fldChar w:fldCharType="separate"/>
       <w:fldChar w:fldCharType="end"/>
     </w:r>
@@ -4118,7 +5619,6 @@
 <w:ftr xmlns:m="http://schemas.openxmlformats.org/officeDocument/2006/math" xmlns:mc="http://schemas.openxmlformats.org/markup-compatibility/2006" xmlns:mo="http://schemas.microsoft.com/office/mac/office/2008/main" xmlns:mv="urn:schemas-microsoft-com:mac:vml" xmlns:o="urn:schemas-microsoft-com:office:office" xmlns:r="http://schemas.openxmlformats.org/officeDocument/2006/relationships" xmlns:v="urn:schemas-microsoft-com:vml" xmlns:w10="urn:schemas-microsoft-com:office:word" xmlns:w14="http://schemas.microsoft.com/office/word/2010/wordml" xmlns:w="http://schemas.openxmlformats.org/wordprocessingml/2006/main" xmlns:wne="http://schemas.microsoft.com/office/word/2006/wordml" xmlns:wp14="http://schemas.microsoft.com/office/word/2010/wordprocessingDrawing" xmlns:wp="http://schemas.openxmlformats.org/drawingml/2006/wordprocessingDrawing" xmlns:wpc="http://schemas.microsoft.com/office/word/2010/wordprocessingCanvas" xmlns:wpg="http://schemas.microsoft.com/office/word/2010/wordprocessingGroup" xmlns:wpi="http://schemas.microsoft.com/office/word/2010/wordprocessingInk" xmlns:wps="http://schemas.microsoft.com/office/word/2010/wordprocessingShape" mc:Ignorable="w14 wp14">
   <w:p>
     <w:pPr>
-      <w:pStyle w:val="Footer"/>
       <w:jc w:val="center"/>
     </w:pPr>
     <w:r>
@@ -4139,7 +5639,6 @@
 <w:ftr xmlns:m="http://schemas.openxmlformats.org/officeDocument/2006/math" xmlns:mc="http://schemas.openxmlformats.org/markup-compatibility/2006" xmlns:mo="http://schemas.microsoft.com/office/mac/office/2008/main" xmlns:mv="urn:schemas-microsoft-com:mac:vml" xmlns:o="urn:schemas-microsoft-com:office:office" xmlns:r="http://schemas.openxmlformats.org/officeDocument/2006/relationships" xmlns:v="urn:schemas-microsoft-com:vml" xmlns:w10="urn:schemas-microsoft-com:office:word" xmlns:w14="http://schemas.microsoft.com/office/word/2010/wordml" xmlns:w="http://schemas.openxmlformats.org/wordprocessingml/2006/main" xmlns:wne="http://schemas.microsoft.com/office/word/2006/wordml" xmlns:wp14="http://schemas.microsoft.com/office/word/2010/wordprocessingDrawing" xmlns:wp="http://schemas.openxmlformats.org/drawingml/2006/wordprocessingDrawing" xmlns:wpc="http://schemas.microsoft.com/office/word/2010/wordprocessingCanvas" xmlns:wpg="http://schemas.microsoft.com/office/word/2010/wordprocessingGroup" xmlns:wpi="http://schemas.microsoft.com/office/word/2010/wordprocessingInk" xmlns:wps="http://schemas.microsoft.com/office/word/2010/wordprocessingShape" mc:Ignorable="w14 wp14">
   <w:p>
     <w:pPr>
-      <w:pStyle w:val="Footer"/>
       <w:jc w:val="center"/>
     </w:pPr>
     <w:r>
@@ -4160,7 +5659,6 @@
 <w:ftr xmlns:m="http://schemas.openxmlformats.org/officeDocument/2006/math" xmlns:mc="http://schemas.openxmlformats.org/markup-compatibility/2006" xmlns:mo="http://schemas.microsoft.com/office/mac/office/2008/main" xmlns:mv="urn:schemas-microsoft-com:mac:vml" xmlns:o="urn:schemas-microsoft-com:office:office" xmlns:r="http://schemas.openxmlformats.org/officeDocument/2006/relationships" xmlns:v="urn:schemas-microsoft-com:vml" xmlns:w10="urn:schemas-microsoft-com:office:word" xmlns:w14="http://schemas.microsoft.com/office/word/2010/wordml" xmlns:w="http://schemas.openxmlformats.org/wordprocessingml/2006/main" xmlns:wne="http://schemas.microsoft.com/office/word/2006/wordml" xmlns:wp14="http://schemas.microsoft.com/office/word/2010/wordprocessingDrawing" xmlns:wp="http://schemas.openxmlformats.org/drawingml/2006/wordprocessingDrawing" xmlns:wpc="http://schemas.microsoft.com/office/word/2010/wordprocessingCanvas" xmlns:wpg="http://schemas.microsoft.com/office/word/2010/wordprocessingGroup" xmlns:wpi="http://schemas.microsoft.com/office/word/2010/wordprocessingInk" xmlns:wps="http://schemas.microsoft.com/office/word/2010/wordprocessingShape" mc:Ignorable="w14 wp14">
   <w:p>
     <w:pPr>
-      <w:pStyle w:val="Footer"/>
       <w:jc w:val="center"/>
     </w:pPr>
     <w:r>
@@ -4181,7 +5679,6 @@
 <w:ftr xmlns:m="http://schemas.openxmlformats.org/officeDocument/2006/math" xmlns:mc="http://schemas.openxmlformats.org/markup-compatibility/2006" xmlns:mo="http://schemas.microsoft.com/office/mac/office/2008/main" xmlns:mv="urn:schemas-microsoft-com:mac:vml" xmlns:o="urn:schemas-microsoft-com:office:office" xmlns:r="http://schemas.openxmlformats.org/officeDocument/2006/relationships" xmlns:v="urn:schemas-microsoft-com:vml" xmlns:w10="urn:schemas-microsoft-com:office:word" xmlns:w14="http://schemas.microsoft.com/office/word/2010/wordml" xmlns:w="http://schemas.openxmlformats.org/wordprocessingml/2006/main" xmlns:wne="http://schemas.microsoft.com/office/word/2006/wordml" xmlns:wp14="http://schemas.microsoft.com/office/word/2010/wordprocessingDrawing" xmlns:wp="http://schemas.openxmlformats.org/drawingml/2006/wordprocessingDrawing" xmlns:wpc="http://schemas.microsoft.com/office/word/2010/wordprocessingCanvas" xmlns:wpg="http://schemas.microsoft.com/office/word/2010/wordprocessingGroup" xmlns:wpi="http://schemas.microsoft.com/office/word/2010/wordprocessingInk" xmlns:wps="http://schemas.microsoft.com/office/word/2010/wordprocessingShape" mc:Ignorable="w14 wp14">
   <w:p>
     <w:pPr>
-      <w:pStyle w:val="Footer"/>
       <w:jc w:val="center"/>
     </w:pPr>
     <w:r>
@@ -4202,7 +5699,6 @@
 <w:ftr xmlns:m="http://schemas.openxmlformats.org/officeDocument/2006/math" xmlns:mc="http://schemas.openxmlformats.org/markup-compatibility/2006" xmlns:mo="http://schemas.microsoft.com/office/mac/office/2008/main" xmlns:mv="urn:schemas-microsoft-com:mac:vml" xmlns:o="urn:schemas-microsoft-com:office:office" xmlns:r="http://schemas.openxmlformats.org/officeDocument/2006/relationships" xmlns:v="urn:schemas-microsoft-com:vml" xmlns:w10="urn:schemas-microsoft-com:office:word" xmlns:w14="http://schemas.microsoft.com/office/word/2010/wordml" xmlns:w="http://schemas.openxmlformats.org/wordprocessingml/2006/main" xmlns:wne="http://schemas.microsoft.com/office/word/2006/wordml" xmlns:wp14="http://schemas.microsoft.com/office/word/2010/wordprocessingDrawing" xmlns:wp="http://schemas.openxmlformats.org/drawingml/2006/wordprocessingDrawing" xmlns:wpc="http://schemas.microsoft.com/office/word/2010/wordprocessingCanvas" xmlns:wpg="http://schemas.microsoft.com/office/word/2010/wordprocessingGroup" xmlns:wpi="http://schemas.microsoft.com/office/word/2010/wordprocessingInk" xmlns:wps="http://schemas.microsoft.com/office/word/2010/wordprocessingShape" mc:Ignorable="w14 wp14">
   <w:p>
     <w:pPr>
-      <w:pStyle w:val="Footer"/>
       <w:jc w:val="center"/>
     </w:pPr>
     <w:r>
@@ -4223,7 +5719,26 @@
 <w:ftr xmlns:m="http://schemas.openxmlformats.org/officeDocument/2006/math" xmlns:mc="http://schemas.openxmlformats.org/markup-compatibility/2006" xmlns:mo="http://schemas.microsoft.com/office/mac/office/2008/main" xmlns:mv="urn:schemas-microsoft-com:mac:vml" xmlns:o="urn:schemas-microsoft-com:office:office" xmlns:r="http://schemas.openxmlformats.org/officeDocument/2006/relationships" xmlns:v="urn:schemas-microsoft-com:vml" xmlns:w10="urn:schemas-microsoft-com:office:word" xmlns:w14="http://schemas.microsoft.com/office/word/2010/wordml" xmlns:w="http://schemas.openxmlformats.org/wordprocessingml/2006/main" xmlns:wne="http://schemas.microsoft.com/office/word/2006/wordml" xmlns:wp14="http://schemas.microsoft.com/office/word/2010/wordprocessingDrawing" xmlns:wp="http://schemas.openxmlformats.org/drawingml/2006/wordprocessingDrawing" xmlns:wpc="http://schemas.microsoft.com/office/word/2010/wordprocessingCanvas" xmlns:wpg="http://schemas.microsoft.com/office/word/2010/wordprocessingGroup" xmlns:wpi="http://schemas.microsoft.com/office/word/2010/wordprocessingInk" xmlns:wps="http://schemas.microsoft.com/office/word/2010/wordprocessingShape" mc:Ignorable="w14 wp14">
   <w:p>
     <w:pPr>
-      <w:pStyle w:val="Footer"/>
+      <w:jc w:val="center"/>
+    </w:pPr>
+    <w:r>
+      <w:rPr>
+        <w:rFonts w:ascii="Times New Roman" w:hAnsi="Times New Roman"/>
+        <w:sz w:val="24"/>
+      </w:rPr>
+      <w:fldChar w:fldCharType="begin"/>
+      <w:instrText xml:space="preserve"> PAGE </w:instrText>
+      <w:fldChar w:fldCharType="separate"/>
+      <w:fldChar w:fldCharType="end"/>
+    </w:r>
+  </w:p>
+</w:ftr>
+</file>
+
+<file path=word/footer27.xml><?xml version="1.0" encoding="utf-8"?>
+<w:ftr xmlns:m="http://schemas.openxmlformats.org/officeDocument/2006/math" xmlns:mc="http://schemas.openxmlformats.org/markup-compatibility/2006" xmlns:mo="http://schemas.microsoft.com/office/mac/office/2008/main" xmlns:mv="urn:schemas-microsoft-com:mac:vml" xmlns:o="urn:schemas-microsoft-com:office:office" xmlns:r="http://schemas.openxmlformats.org/officeDocument/2006/relationships" xmlns:v="urn:schemas-microsoft-com:vml" xmlns:w10="urn:schemas-microsoft-com:office:word" xmlns:w14="http://schemas.microsoft.com/office/word/2010/wordml" xmlns:w="http://schemas.openxmlformats.org/wordprocessingml/2006/main" xmlns:wne="http://schemas.microsoft.com/office/word/2006/wordml" xmlns:wp14="http://schemas.microsoft.com/office/word/2010/wordprocessingDrawing" xmlns:wp="http://schemas.openxmlformats.org/drawingml/2006/wordprocessingDrawing" xmlns:wpc="http://schemas.microsoft.com/office/word/2010/wordprocessingCanvas" xmlns:wpg="http://schemas.microsoft.com/office/word/2010/wordprocessingGroup" xmlns:wpi="http://schemas.microsoft.com/office/word/2010/wordprocessingInk" xmlns:wps="http://schemas.microsoft.com/office/word/2010/wordprocessingShape" mc:Ignorable="w14 wp14">
+  <w:p>
+    <w:pPr>
       <w:jc w:val="center"/>
     </w:pPr>
     <w:r>
@@ -4244,7 +5759,6 @@
 <w:ftr xmlns:m="http://schemas.openxmlformats.org/officeDocument/2006/math" xmlns:mc="http://schemas.openxmlformats.org/markup-compatibility/2006" xmlns:mo="http://schemas.microsoft.com/office/mac/office/2008/main" xmlns:mv="urn:schemas-microsoft-com:mac:vml" xmlns:o="urn:schemas-microsoft-com:office:office" xmlns:r="http://schemas.openxmlformats.org/officeDocument/2006/relationships" xmlns:v="urn:schemas-microsoft-com:vml" xmlns:w10="urn:schemas-microsoft-com:office:word" xmlns:w14="http://schemas.microsoft.com/office/word/2010/wordml" xmlns:w="http://schemas.openxmlformats.org/wordprocessingml/2006/main" xmlns:wne="http://schemas.microsoft.com/office/word/2006/wordml" xmlns:wp14="http://schemas.microsoft.com/office/word/2010/wordprocessingDrawing" xmlns:wp="http://schemas.openxmlformats.org/drawingml/2006/wordprocessingDrawing" xmlns:wpc="http://schemas.microsoft.com/office/word/2010/wordprocessingCanvas" xmlns:wpg="http://schemas.microsoft.com/office/word/2010/wordprocessingGroup" xmlns:wpi="http://schemas.microsoft.com/office/word/2010/wordprocessingInk" xmlns:wps="http://schemas.microsoft.com/office/word/2010/wordprocessingShape" mc:Ignorable="w14 wp14">
   <w:p>
     <w:pPr>
-      <w:pStyle w:val="Footer"/>
       <w:jc w:val="center"/>
     </w:pPr>
     <w:r>
@@ -4253,7 +5767,7 @@
         <w:sz w:val="24"/>
       </w:rPr>
       <w:fldChar w:fldCharType="begin"/>
-      <w:instrText xml:space="preserve"> PAGE \* roman </w:instrText>
+      <w:instrText xml:space="preserve"> PAGE </w:instrText>
       <w:fldChar w:fldCharType="separate"/>
       <w:fldChar w:fldCharType="end"/>
     </w:r>
@@ -4265,7 +5779,6 @@
 <w:ftr xmlns:m="http://schemas.openxmlformats.org/officeDocument/2006/math" xmlns:mc="http://schemas.openxmlformats.org/markup-compatibility/2006" xmlns:mo="http://schemas.microsoft.com/office/mac/office/2008/main" xmlns:mv="urn:schemas-microsoft-com:mac:vml" xmlns:o="urn:schemas-microsoft-com:office:office" xmlns:r="http://schemas.openxmlformats.org/officeDocument/2006/relationships" xmlns:v="urn:schemas-microsoft-com:vml" xmlns:w10="urn:schemas-microsoft-com:office:word" xmlns:w14="http://schemas.microsoft.com/office/word/2010/wordml" xmlns:w="http://schemas.openxmlformats.org/wordprocessingml/2006/main" xmlns:wne="http://schemas.microsoft.com/office/word/2006/wordml" xmlns:wp14="http://schemas.microsoft.com/office/word/2010/wordprocessingDrawing" xmlns:wp="http://schemas.openxmlformats.org/drawingml/2006/wordprocessingDrawing" xmlns:wpc="http://schemas.microsoft.com/office/word/2010/wordprocessingCanvas" xmlns:wpg="http://schemas.microsoft.com/office/word/2010/wordprocessingGroup" xmlns:wpi="http://schemas.microsoft.com/office/word/2010/wordprocessingInk" xmlns:wps="http://schemas.microsoft.com/office/word/2010/wordprocessingShape" mc:Ignorable="w14 wp14">
   <w:p>
     <w:pPr>
-      <w:pStyle w:val="Footer"/>
       <w:jc w:val="center"/>
     </w:pPr>
     <w:r>
@@ -4274,7 +5787,7 @@
         <w:sz w:val="24"/>
       </w:rPr>
       <w:fldChar w:fldCharType="begin"/>
-      <w:instrText xml:space="preserve"> PAGE \* roman </w:instrText>
+      <w:instrText xml:space="preserve"> PAGE </w:instrText>
       <w:fldChar w:fldCharType="separate"/>
       <w:fldChar w:fldCharType="end"/>
     </w:r>
@@ -4286,7 +5799,6 @@
 <w:ftr xmlns:m="http://schemas.openxmlformats.org/officeDocument/2006/math" xmlns:mc="http://schemas.openxmlformats.org/markup-compatibility/2006" xmlns:mo="http://schemas.microsoft.com/office/mac/office/2008/main" xmlns:mv="urn:schemas-microsoft-com:mac:vml" xmlns:o="urn:schemas-microsoft-com:office:office" xmlns:r="http://schemas.openxmlformats.org/officeDocument/2006/relationships" xmlns:v="urn:schemas-microsoft-com:vml" xmlns:w10="urn:schemas-microsoft-com:office:word" xmlns:w14="http://schemas.microsoft.com/office/word/2010/wordml" xmlns:w="http://schemas.openxmlformats.org/wordprocessingml/2006/main" xmlns:wne="http://schemas.microsoft.com/office/word/2006/wordml" xmlns:wp14="http://schemas.microsoft.com/office/word/2010/wordprocessingDrawing" xmlns:wp="http://schemas.openxmlformats.org/drawingml/2006/wordprocessingDrawing" xmlns:wpc="http://schemas.microsoft.com/office/word/2010/wordprocessingCanvas" xmlns:wpg="http://schemas.microsoft.com/office/word/2010/wordprocessingGroup" xmlns:wpi="http://schemas.microsoft.com/office/word/2010/wordprocessingInk" xmlns:wps="http://schemas.microsoft.com/office/word/2010/wordprocessingShape" mc:Ignorable="w14 wp14">
   <w:p>
     <w:pPr>
-      <w:pStyle w:val="Footer"/>
       <w:jc w:val="center"/>
     </w:pPr>
     <w:r>
@@ -4295,7 +5807,7 @@
         <w:sz w:val="24"/>
       </w:rPr>
       <w:fldChar w:fldCharType="begin"/>
-      <w:instrText xml:space="preserve"> PAGE \* roman </w:instrText>
+      <w:instrText xml:space="preserve"> PAGE </w:instrText>
       <w:fldChar w:fldCharType="separate"/>
       <w:fldChar w:fldCharType="end"/>
     </w:r>
@@ -4307,7 +5819,6 @@
 <w:ftr xmlns:m="http://schemas.openxmlformats.org/officeDocument/2006/math" xmlns:mc="http://schemas.openxmlformats.org/markup-compatibility/2006" xmlns:mo="http://schemas.microsoft.com/office/mac/office/2008/main" xmlns:mv="urn:schemas-microsoft-com:mac:vml" xmlns:o="urn:schemas-microsoft-com:office:office" xmlns:r="http://schemas.openxmlformats.org/officeDocument/2006/relationships" xmlns:v="urn:schemas-microsoft-com:vml" xmlns:w10="urn:schemas-microsoft-com:office:word" xmlns:w14="http://schemas.microsoft.com/office/word/2010/wordml" xmlns:w="http://schemas.openxmlformats.org/wordprocessingml/2006/main" xmlns:wne="http://schemas.microsoft.com/office/word/2006/wordml" xmlns:wp14="http://schemas.microsoft.com/office/word/2010/wordprocessingDrawing" xmlns:wp="http://schemas.openxmlformats.org/drawingml/2006/wordprocessingDrawing" xmlns:wpc="http://schemas.microsoft.com/office/word/2010/wordprocessingCanvas" xmlns:wpg="http://schemas.microsoft.com/office/word/2010/wordprocessingGroup" xmlns:wpi="http://schemas.microsoft.com/office/word/2010/wordprocessingInk" xmlns:wps="http://schemas.microsoft.com/office/word/2010/wordprocessingShape" mc:Ignorable="w14 wp14">
   <w:p>
     <w:pPr>
-      <w:pStyle w:val="Footer"/>
       <w:jc w:val="center"/>
     </w:pPr>
     <w:r>
@@ -4316,7 +5827,7 @@
         <w:sz w:val="24"/>
       </w:rPr>
       <w:fldChar w:fldCharType="begin"/>
-      <w:instrText xml:space="preserve"> PAGE \* roman </w:instrText>
+      <w:instrText xml:space="preserve"> PAGE </w:instrText>
       <w:fldChar w:fldCharType="separate"/>
       <w:fldChar w:fldCharType="end"/>
     </w:r>
@@ -4328,7 +5839,6 @@
 <w:ftr xmlns:m="http://schemas.openxmlformats.org/officeDocument/2006/math" xmlns:mc="http://schemas.openxmlformats.org/markup-compatibility/2006" xmlns:mo="http://schemas.microsoft.com/office/mac/office/2008/main" xmlns:mv="urn:schemas-microsoft-com:mac:vml" xmlns:o="urn:schemas-microsoft-com:office:office" xmlns:r="http://schemas.openxmlformats.org/officeDocument/2006/relationships" xmlns:v="urn:schemas-microsoft-com:vml" xmlns:w10="urn:schemas-microsoft-com:office:word" xmlns:w14="http://schemas.microsoft.com/office/word/2010/wordml" xmlns:w="http://schemas.openxmlformats.org/wordprocessingml/2006/main" xmlns:wne="http://schemas.microsoft.com/office/word/2006/wordml" xmlns:wp14="http://schemas.microsoft.com/office/word/2010/wordprocessingDrawing" xmlns:wp="http://schemas.openxmlformats.org/drawingml/2006/wordprocessingDrawing" xmlns:wpc="http://schemas.microsoft.com/office/word/2010/wordprocessingCanvas" xmlns:wpg="http://schemas.microsoft.com/office/word/2010/wordprocessingGroup" xmlns:wpi="http://schemas.microsoft.com/office/word/2010/wordprocessingInk" xmlns:wps="http://schemas.microsoft.com/office/word/2010/wordprocessingShape" mc:Ignorable="w14 wp14">
   <w:p>
     <w:pPr>
-      <w:pStyle w:val="Footer"/>
       <w:jc w:val="center"/>
     </w:pPr>
     <w:r>
@@ -4337,7 +5847,7 @@
         <w:sz w:val="24"/>
       </w:rPr>
       <w:fldChar w:fldCharType="begin"/>
-      <w:instrText xml:space="preserve"> PAGE \* roman </w:instrText>
+      <w:instrText xml:space="preserve"> PAGE </w:instrText>
       <w:fldChar w:fldCharType="separate"/>
       <w:fldChar w:fldCharType="end"/>
     </w:r>
@@ -4349,7 +5859,6 @@
 <w:ftr xmlns:m="http://schemas.openxmlformats.org/officeDocument/2006/math" xmlns:mc="http://schemas.openxmlformats.org/markup-compatibility/2006" xmlns:mo="http://schemas.microsoft.com/office/mac/office/2008/main" xmlns:mv="urn:schemas-microsoft-com:mac:vml" xmlns:o="urn:schemas-microsoft-com:office:office" xmlns:r="http://schemas.openxmlformats.org/officeDocument/2006/relationships" xmlns:v="urn:schemas-microsoft-com:vml" xmlns:w10="urn:schemas-microsoft-com:office:word" xmlns:w14="http://schemas.microsoft.com/office/word/2010/wordml" xmlns:w="http://schemas.openxmlformats.org/wordprocessingml/2006/main" xmlns:wne="http://schemas.microsoft.com/office/word/2006/wordml" xmlns:wp14="http://schemas.microsoft.com/office/word/2010/wordprocessingDrawing" xmlns:wp="http://schemas.openxmlformats.org/drawingml/2006/wordprocessingDrawing" xmlns:wpc="http://schemas.microsoft.com/office/word/2010/wordprocessingCanvas" xmlns:wpg="http://schemas.microsoft.com/office/word/2010/wordprocessingGroup" xmlns:wpi="http://schemas.microsoft.com/office/word/2010/wordprocessingInk" xmlns:wps="http://schemas.microsoft.com/office/word/2010/wordprocessingShape" mc:Ignorable="w14 wp14">
   <w:p>
     <w:pPr>
-      <w:pStyle w:val="Footer"/>
       <w:jc w:val="center"/>
     </w:pPr>
     <w:r>
@@ -4358,7 +5867,7 @@
         <w:sz w:val="24"/>
       </w:rPr>
       <w:fldChar w:fldCharType="begin"/>
-      <w:instrText xml:space="preserve"> PAGE \* roman </w:instrText>
+      <w:instrText xml:space="preserve"> PAGE </w:instrText>
       <w:fldChar w:fldCharType="separate"/>
       <w:fldChar w:fldCharType="end"/>
     </w:r>
@@ -4370,8 +5879,18 @@
 <w:ftr xmlns:m="http://schemas.openxmlformats.org/officeDocument/2006/math" xmlns:mc="http://schemas.openxmlformats.org/markup-compatibility/2006" xmlns:mo="http://schemas.microsoft.com/office/mac/office/2008/main" xmlns:mv="urn:schemas-microsoft-com:mac:vml" xmlns:o="urn:schemas-microsoft-com:office:office" xmlns:r="http://schemas.openxmlformats.org/officeDocument/2006/relationships" xmlns:v="urn:schemas-microsoft-com:vml" xmlns:w10="urn:schemas-microsoft-com:office:word" xmlns:w14="http://schemas.microsoft.com/office/word/2010/wordml" xmlns:w="http://schemas.openxmlformats.org/wordprocessingml/2006/main" xmlns:wne="http://schemas.microsoft.com/office/word/2006/wordml" xmlns:wp14="http://schemas.microsoft.com/office/word/2010/wordprocessingDrawing" xmlns:wp="http://schemas.openxmlformats.org/drawingml/2006/wordprocessingDrawing" xmlns:wpc="http://schemas.microsoft.com/office/word/2010/wordprocessingCanvas" xmlns:wpg="http://schemas.microsoft.com/office/word/2010/wordprocessingGroup" xmlns:wpi="http://schemas.microsoft.com/office/word/2010/wordprocessingInk" xmlns:wps="http://schemas.microsoft.com/office/word/2010/wordprocessingShape" mc:Ignorable="w14 wp14">
   <w:p>
     <w:pPr>
-      <w:pStyle w:val="Footer"/>
+      <w:jc w:val="center"/>
     </w:pPr>
+    <w:r>
+      <w:rPr>
+        <w:rFonts w:ascii="Times New Roman" w:hAnsi="Times New Roman"/>
+        <w:sz w:val="24"/>
+      </w:rPr>
+      <w:fldChar w:fldCharType="begin"/>
+      <w:instrText xml:space="preserve"> PAGE </w:instrText>
+      <w:fldChar w:fldCharType="separate"/>
+      <w:fldChar w:fldCharType="end"/>
+    </w:r>
   </w:p>
 </w:ftr>
 </file>
@@ -16428,6 +17947,81 @@
         <w:shd w:val="clear" w:color="auto" w:fill="FBCAA2" w:themeFill="accent6" w:themeFillTint="7F"/>
       </w:tcPr>
     </w:tblStylePr>
+  </w:style>
+  <w:style w:type="paragraph" w:customStyle="1" w:styleId="IUTECPCapítulo">
+    <w:name w:val="IUTECP Capítulo"/>
+    <w:basedOn w:val="Normal"/>
+    <w:pPr>
+      <w:keepNext/>
+      <w:keepLines/>
+      <w:jc w:val="center"/>
+      <w:outlineLvl w:val="0"/>
+    </w:pPr>
+    <w:rPr>
+      <w:rFonts w:ascii="Times New Roman" w:hAnsi="Times New Roman"/>
+      <w:b/>
+      <w:sz w:val="24"/>
+    </w:rPr>
+  </w:style>
+  <w:style w:type="paragraph" w:customStyle="1" w:styleId="IUTECPPreliminar">
+    <w:name w:val="IUTECP Preliminar"/>
+    <w:basedOn w:val="Normal"/>
+    <w:pPr>
+      <w:keepNext/>
+      <w:keepLines/>
+      <w:jc w:val="center"/>
+      <w:outlineLvl w:val="0"/>
+    </w:pPr>
+    <w:rPr>
+      <w:rFonts w:ascii="Times New Roman" w:hAnsi="Times New Roman"/>
+      <w:b/>
+      <w:sz w:val="24"/>
+    </w:rPr>
+  </w:style>
+  <w:style w:type="paragraph" w:customStyle="1" w:styleId="IUTECPTítulo2">
+    <w:name w:val="IUTECP Título 2"/>
+    <w:basedOn w:val="Normal"/>
+    <w:pPr>
+      <w:keepNext/>
+      <w:keepLines/>
+      <w:jc w:val="left"/>
+      <w:outlineLvl w:val="1"/>
+    </w:pPr>
+    <w:rPr>
+      <w:rFonts w:ascii="Times New Roman" w:hAnsi="Times New Roman"/>
+      <w:b/>
+      <w:sz w:val="24"/>
+    </w:rPr>
+  </w:style>
+  <w:style w:type="paragraph" w:customStyle="1" w:styleId="IUTECPTítulo3">
+    <w:name w:val="IUTECP Título 3"/>
+    <w:basedOn w:val="Normal"/>
+    <w:pPr>
+      <w:keepNext/>
+      <w:keepLines/>
+      <w:jc w:val="left"/>
+      <w:outlineLvl w:val="2"/>
+    </w:pPr>
+    <w:rPr>
+      <w:rFonts w:ascii="Times New Roman" w:hAnsi="Times New Roman"/>
+      <w:b/>
+      <w:sz w:val="24"/>
+    </w:rPr>
+  </w:style>
+  <w:style w:type="paragraph" w:customStyle="1" w:styleId="IUTECPSubtítulocentrado">
+    <w:name w:val="IUTECP Subtítulo centrado"/>
+    <w:basedOn w:val="Normal"/>
+    <w:pPr>
+      <w:keepNext/>
+      <w:keepLines/>
+      <w:jc w:val="center"/>
+      <w:outlineLvl w:val="1"/>
+    </w:pPr>
+    <w:rPr>
+      <w:rFonts w:ascii="Times New Roman" w:hAnsi="Times New Roman"/>
+      <w:b/>
+      <w:sz w:val="24"/>
+    </w:rPr>
   </w:style>
 </w:styles>
 </file>

</xml_diff>